<commit_message>
vault backup: 2026-10-27 22:01:26
</commit_message>
<xml_diff>
--- a/02_Areas/工作经历/鑫犇电子有限公司/06_公司公共/会议与记录/会议记录_新厂搬迁安全会议部署落实工作_2026-10-26.docx
+++ b/02_Areas/工作经历/鑫犇电子有限公司/06_公司公共/会议与记录/会议记录_新厂搬迁安全会议部署落实工作_2026-10-26.docx
@@ -561,7 +561,10 @@
         <w:pStyle w:val="ListBullet"/>
       </w:pPr>
       <w:r>
-        <w:t>会议记录需要由相关主管签名确认。原摘要提到的“王明涵、新龙、付占雄”等姓名，目前未能在受控人员资料中核实，暂不替换为正式责任人。</w:t>
+        <w:rPr>
+          <w:rFonts w:ascii="微软雅黑" w:hAnsi="微软雅黑"/>
+        </w:rPr>
+        <w:t>会议记录需要由相关主管签名确认。原摘要提到王名涵，已在职工名单中核实；其他签名人员仍需按会议实际出席情况确认。</w:t>
       </w:r>
     </w:p>
     <w:p>
@@ -1169,7 +1172,11 @@
             <w:vAlign w:val="center"/>
           </w:tcPr>
           <w:p>
-            <w:r/>
+            <w:r>
+              <w:rPr>
+                <w:rFonts w:ascii="微软雅黑" w:hAnsi="微软雅黑"/>
+              </w:rPr>
+            </w:r>
             <w:r>
               <w:rPr>
                 <w:rFonts w:ascii="微软雅黑" w:hAnsi="微软雅黑"/>
@@ -1186,7 +1193,11 @@
             <w:vAlign w:val="center"/>
           </w:tcPr>
           <w:p>
-            <w:r/>
+            <w:r>
+              <w:rPr>
+                <w:rFonts w:ascii="微软雅黑" w:hAnsi="微软雅黑"/>
+              </w:rPr>
+            </w:r>
             <w:r>
               <w:rPr>
                 <w:rFonts w:ascii="微软雅黑" w:hAnsi="微软雅黑"/>
@@ -1203,14 +1214,11 @@
             <w:vAlign w:val="center"/>
           </w:tcPr>
           <w:p>
-            <w:r/>
             <w:r>
               <w:rPr>
                 <w:rFonts w:ascii="微软雅黑" w:hAnsi="微软雅黑"/>
-                <w:b w:val="0"/>
-                <w:sz w:val="17"/>
               </w:rPr>
-              <w:t>经办人待确认；原摘要列“王秀红（新奔）/魏国（新农）”</w:t>
+              <w:t>经办人待确认；原摘要中的“王秀红”暂校为王秋红，另列魏国待核实</w:t>
             </w:r>
           </w:p>
         </w:tc>
@@ -1220,14 +1228,11 @@
             <w:vAlign w:val="center"/>
           </w:tcPr>
           <w:p>
-            <w:r/>
             <w:r>
               <w:rPr>
                 <w:rFonts w:ascii="微软雅黑" w:hAnsi="微软雅黑"/>
-                <w:b w:val="0"/>
-                <w:sz w:val="17"/>
               </w:rPr>
-              <w:t>行政部/人事；受控资料对应人员待确认</w:t>
+              <w:t>行政部/人事；具体经办人及鑫隆两家公司间的分工待确认</w:t>
             </w:r>
           </w:p>
         </w:tc>
@@ -1237,7 +1242,11 @@
             <w:vAlign w:val="center"/>
           </w:tcPr>
           <w:p>
-            <w:r/>
+            <w:r>
+              <w:rPr>
+                <w:rFonts w:ascii="微软雅黑" w:hAnsi="微软雅黑"/>
+              </w:rPr>
+            </w:r>
             <w:r>
               <w:rPr>
                 <w:rFonts w:ascii="微软雅黑" w:hAnsi="微软雅黑"/>
@@ -1254,7 +1263,11 @@
             <w:vAlign w:val="center"/>
           </w:tcPr>
           <w:p>
-            <w:r/>
+            <w:r>
+              <w:rPr>
+                <w:rFonts w:ascii="微软雅黑" w:hAnsi="微软雅黑"/>
+              </w:rPr>
+            </w:r>
             <w:r>
               <w:rPr>
                 <w:rFonts w:ascii="微软雅黑" w:hAnsi="微软雅黑"/>
@@ -1271,7 +1284,11 @@
             <w:vAlign w:val="center"/>
           </w:tcPr>
           <w:p>
-            <w:r/>
+            <w:r>
+              <w:rPr>
+                <w:rFonts w:ascii="微软雅黑" w:hAnsi="微软雅黑"/>
+              </w:rPr>
+            </w:r>
             <w:r>
               <w:rPr>
                 <w:rFonts w:ascii="微软雅黑" w:hAnsi="微软雅黑"/>
@@ -1445,14 +1462,11 @@
             <w:vAlign w:val="center"/>
           </w:tcPr>
           <w:p>
-            <w:r/>
             <w:r>
               <w:rPr>
                 <w:rFonts w:ascii="微软雅黑" w:hAnsi="微软雅黑"/>
-                <w:b w:val="0"/>
-                <w:sz w:val="17"/>
               </w:rPr>
-              <w:t>会议记录人待确认；原摘要提到王明涵，未核实</w:t>
+              <w:t>会议记录人待确认；原摘要提到王名涵（职工名单：模具学徒），是否由其承担会议记录需确认</w:t>
             </w:r>
           </w:p>
         </w:tc>
@@ -1687,14 +1701,11 @@
             <w:vAlign w:val="center"/>
           </w:tcPr>
           <w:p>
-            <w:r/>
             <w:r>
               <w:rPr>
                 <w:rFonts w:ascii="微软雅黑" w:hAnsi="微软雅黑"/>
-                <w:b w:val="0"/>
-                <w:sz w:val="17"/>
               </w:rPr>
-              <w:t>后勤组；原摘要提到“小勇”，身份待确认</w:t>
+              <w:t>后勤组；原摘要提到“小勇”，按用户确认更正为王勇</w:t>
             </w:r>
           </w:p>
         </w:tc>
@@ -1902,7 +1913,10 @@
         <w:pStyle w:val="ListBullet"/>
       </w:pPr>
       <w:r>
-        <w:t>受控组织架构资料中已核实的相关人员包括：王晓华（总经理/兼行政部、营运部负责人）、王勇（董事长/兼财务及后勤相关职责，具体授权需确认）、李天友（品质部负责人/生产部负责人）、王珊兰（仓储组负责人）、马金军（清洗车间负责人）、尹杰（人事/采购相关岗位）、刘东（工程技术负责人）。</w:t>
+        <w:rPr>
+          <w:rFonts w:ascii="微软雅黑" w:hAnsi="微软雅黑"/>
+        </w:rPr>
+        <w:t>受控组织架构及职工名单中可核实的相关人员包括：王晓华（总经理，兼行政部、营运部负责人）、王勇（董事长，兼财务相关岗位；用户确认原称“小勇”指王勇）、李天友（品质部负责人，兼生产部负责人）、王珊兰（质检员，兼仓储组长及成品出货检验组长）、马金军（清洗车间负责人）、尹杰（生产计划员，兼采购员、人事员）、刘东（模具技术负责人）、王名涵（职工名单登记为模具学徒）、王秋红（职工名单登记为办公文员）。</w:t>
       </w:r>
     </w:p>
     <w:p>
@@ -1910,7 +1924,10 @@
         <w:pStyle w:val="ListBullet"/>
       </w:pPr>
       <w:r>
-        <w:t>原摘要中出现的“讲话人1—3、王明涵、新龙、付占雄、王秀红、魏国、陈继善、小勇、陈经理、富山雄、王华、王立泽”等姓名或称呼，当前未能与受控人员主数据稳定对应，已在本记录中保留为“待确认”，不得直接作为正式责任人或签名人。</w:t>
+        <w:rPr>
+          <w:rFonts w:ascii="微软雅黑" w:hAnsi="微软雅黑"/>
+        </w:rPr>
+        <w:t>原摘要中的姓名按职工名单和用户补充进行校正：王名涵为名单中的在职员工；“王秀红”按近似识别暂校为王秋红（办公文员），请结合原始录音/参会情况最终确认；“小勇”按用户确认指王勇。“王华”可能是王晓华的简称/识别误差，仍待确认。付善雄、魏国、陈继善、陈经理、富山雄、王立泽及“讲话人1—3”等，暂未能与现有受控名单可靠对应，保留待核实。</w:t>
       </w:r>
     </w:p>
     <w:p>
@@ -1918,7 +1935,10 @@
         <w:pStyle w:val="ListBullet"/>
       </w:pPr>
       <w:r>
-        <w:t>“新奔、新农、兴隆、青龙、新龙”等公司/现场称呼的正式法人主体、组织边界和对应部门也应在后续会议中统一。</w:t>
+        <w:rPr>
+          <w:rFonts w:ascii="微软雅黑" w:hAnsi="微软雅黑"/>
+        </w:rPr>
+        <w:t>“鑫隆”在本次语境中指两家公司，目前正在统一管理；“新奔、新农、青龙”等现场/组织称呼及其与两家公司的对应关系，仍需结合公司实际组织口径统一记录。</w:t>
       </w:r>
     </w:p>
     <w:p>

</xml_diff>

<commit_message>
vault backup: 2026-10-28 09:26:38
</commit_message>
<xml_diff>
--- a/02_Areas/工作经历/鑫犇电子有限公司/06_公司公共/会议与记录/会议记录_新厂搬迁安全会议部署落实工作_2026-10-26.docx
+++ b/02_Areas/工作经历/鑫犇电子有限公司/06_公司公共/会议与记录/会议记录_新厂搬迁安全会议部署落实工作_2026-10-26.docx
@@ -562,19 +562,25 @@
             <w:r>
               <w:rPr>
                 <w:rFonts w:ascii="微软雅黑" w:hAnsi="微软雅黑" w:eastAsia="微软雅黑"/>
+                <w:b w:val="0"/>
+                <w:i w:val="0"/>
                 <w:color w:val="000000"/>
-                <w:sz w:val="19"/>
+                <w:sz w:val="17"/>
+                <w:u w:val="none"/>
               </w:rPr>
+              <w:t>整理稿；具体参会人</w:t>
             </w:r>
             <w:r>
               <w:rPr>
                 <w:rFonts w:ascii="微软雅黑" w:hAnsi="微软雅黑" w:eastAsia="微软雅黑"/>
                 <w:b/>
-                <w:color w:val="C00000"/>
-                <w:sz w:val="19"/>
+                <w:i w:val="0"/>
+                <w:color w:val="000000"/>
+                <w:sz w:val="17"/>
                 <w:u w:val="single"/>
+                <w:shd w:fill="FFF2CC"/>
               </w:rPr>
-              <w:t>整理稿；具体参会人待核实</w:t>
+              <w:t>待核实</w:t>
             </w:r>
           </w:p>
         </w:tc>
@@ -770,24 +776,35 @@
         <w:rPr>
           <w:rFonts w:ascii="微软雅黑" w:hAnsi="微软雅黑" w:eastAsia="微软雅黑"/>
           <w:b w:val="0"/>
-          <w:i/>
-          <w:color w:val="2F75B5"/>
+          <w:i w:val="0"/>
+          <w:color w:val="000000"/>
           <w:sz w:val="19"/>
-          <w:shd w:fill="EAF3F8"/>
+          <w:u w:val="none"/>
         </w:rPr>
-        <w:t>说明：</w:t>
+        <w:t>说明：本记录根据用户提供的会议摘要整理。人员姓名、部门归属和责任人优先参照公司受控组织架构资料；原摘要中无法与受控资料对应的姓名，统一标注为“</w:t>
       </w:r>
       <w:r>
         <w:rPr>
           <w:rFonts w:ascii="微软雅黑" w:hAnsi="微软雅黑" w:eastAsia="微软雅黑"/>
           <w:b/>
-          <w:i/>
-          <w:color w:val="C00000"/>
-          <w:sz w:val="21"/>
+          <w:i w:val="0"/>
+          <w:color w:val="000000"/>
+          <w:sz w:val="19"/>
           <w:u w:val="single"/>
-          <w:shd w:fill="EAF3F8"/>
+          <w:shd w:fill="FFF2CC"/>
         </w:rPr>
-        <w:t>本记录根据用户提供的会议摘要整理。人员姓名、部门归属和责任人优先参照公司受控组织架构资料；原摘要中无法与受控资料对应的姓名，统一标注为“待确认”，不擅自替换。</w:t>
+        <w:t>待确认</w:t>
+      </w:r>
+      <w:r>
+        <w:rPr>
+          <w:rFonts w:ascii="微软雅黑" w:hAnsi="微软雅黑" w:eastAsia="微软雅黑"/>
+          <w:b w:val="0"/>
+          <w:i w:val="0"/>
+          <w:color w:val="000000"/>
+          <w:sz w:val="19"/>
+          <w:u w:val="none"/>
+        </w:rPr>
+        <w:t>”，不擅自替换。</w:t>
       </w:r>
     </w:p>
     <w:p>
@@ -799,39 +816,22 @@
         <w:rPr>
           <w:rFonts w:ascii="微软雅黑" w:hAnsi="微软雅黑" w:eastAsia="微软雅黑"/>
           <w:b/>
-          <w:color w:val="17365D"/>
+          <w:color w:val="000000"/>
           <w:sz w:val="19"/>
+          <w:shd w:fill="FFF2CC"/>
         </w:rPr>
         <w:t>阅读提示：</w:t>
       </w:r>
       <w:r>
         <w:rPr>
           <w:rFonts w:ascii="微软雅黑" w:hAnsi="微软雅黑" w:eastAsia="微软雅黑"/>
-          <w:i/>
-          <w:color w:val="2F75B5"/>
-          <w:sz w:val="19"/>
-        </w:rPr>
-        <w:t>蓝色/斜体＝整理说明；</w:t>
-      </w:r>
-      <w:r>
-        <w:rPr>
-          <w:rFonts w:ascii="微软雅黑" w:hAnsi="微软雅黑" w:eastAsia="微软雅黑"/>
           <w:b/>
-          <w:color w:val="C00000"/>
-          <w:sz w:val="19"/>
+          <w:color w:val="000000"/>
+          <w:sz w:val="21"/>
           <w:u w:val="single"/>
-        </w:rPr>
-        <w:t>红色加粗下划线＝待确认；</w:t>
-      </w:r>
-      <w:r>
-        <w:rPr>
-          <w:rFonts w:ascii="微软雅黑" w:hAnsi="微软雅黑" w:eastAsia="微软雅黑"/>
-          <w:b/>
-          <w:color w:val="7F6000"/>
-          <w:sz w:val="19"/>
           <w:shd w:fill="FFF2CC"/>
         </w:rPr>
-        <w:t>浅黄色底＝打印时的重点提示。</w:t>
+        <w:t>黄色底纹＋下划线＝待确认、待核实或需复核内容。</w:t>
       </w:r>
     </w:p>
     <w:p>
@@ -1960,19 +1960,25 @@
             <w:r>
               <w:rPr>
                 <w:rFonts w:ascii="微软雅黑" w:hAnsi="微软雅黑" w:eastAsia="微软雅黑"/>
+                <w:b w:val="0"/>
+                <w:i w:val="0"/>
                 <w:color w:val="000000"/>
                 <w:sz w:val="17"/>
+                <w:u w:val="none"/>
               </w:rPr>
+              <w:t>生产部负责人：李天友；具体主管</w:t>
             </w:r>
             <w:r>
               <w:rPr>
                 <w:rFonts w:ascii="微软雅黑" w:hAnsi="微软雅黑" w:eastAsia="微软雅黑"/>
                 <w:b/>
-                <w:color w:val="C00000"/>
+                <w:i w:val="0"/>
+                <w:color w:val="000000"/>
                 <w:sz w:val="17"/>
                 <w:u w:val="single"/>
+                <w:shd w:fill="FFF2CC"/>
               </w:rPr>
-              <w:t>生产部负责人：李天友；具体主管待确认</w:t>
+              <w:t>待确认</w:t>
             </w:r>
           </w:p>
         </w:tc>
@@ -2261,19 +2267,25 @@
             <w:r>
               <w:rPr>
                 <w:rFonts w:ascii="微软雅黑" w:hAnsi="微软雅黑" w:eastAsia="微软雅黑"/>
+                <w:b w:val="0"/>
+                <w:i w:val="0"/>
                 <w:color w:val="000000"/>
                 <w:sz w:val="17"/>
+                <w:u w:val="none"/>
               </w:rPr>
+              <w:t>行政部负责人/总经理：王晓华；权限边界</w:t>
             </w:r>
             <w:r>
               <w:rPr>
                 <w:rFonts w:ascii="微软雅黑" w:hAnsi="微软雅黑" w:eastAsia="微软雅黑"/>
                 <w:b/>
-                <w:color w:val="C00000"/>
+                <w:i w:val="0"/>
+                <w:color w:val="000000"/>
                 <w:sz w:val="17"/>
                 <w:u w:val="single"/>
+                <w:shd w:fill="FFF2CC"/>
               </w:rPr>
-              <w:t>行政部负责人/总经理：王晓华；权限边界待确认</w:t>
+              <w:t>待确认</w:t>
             </w:r>
           </w:p>
         </w:tc>
@@ -2391,17 +2403,12 @@
             <w:r>
               <w:rPr>
                 <w:rFonts w:ascii="微软雅黑" w:hAnsi="微软雅黑" w:eastAsia="微软雅黑"/>
+                <w:b/>
+                <w:i w:val="0"/>
                 <w:color w:val="000000"/>
                 <w:sz w:val="17"/>
-              </w:rPr>
-            </w:r>
-            <w:r>
-              <w:rPr>
-                <w:rFonts w:ascii="微软雅黑" w:hAnsi="微软雅黑" w:eastAsia="微软雅黑"/>
-                <w:b/>
-                <w:color w:val="C00000"/>
-                <w:sz w:val="17"/>
                 <w:u w:val="single"/>
+                <w:shd w:fill="FFF2CC"/>
               </w:rPr>
               <w:t>待确认</w:t>
             </w:r>
@@ -2563,19 +2570,25 @@
             <w:r>
               <w:rPr>
                 <w:rFonts w:ascii="微软雅黑" w:hAnsi="微软雅黑" w:eastAsia="微软雅黑"/>
+                <w:b w:val="0"/>
+                <w:i w:val="0"/>
                 <w:color w:val="000000"/>
                 <w:sz w:val="17"/>
+                <w:u w:val="none"/>
               </w:rPr>
+              <w:t>行政部/人事与用人部门负责人；具体人员</w:t>
             </w:r>
             <w:r>
               <w:rPr>
                 <w:rFonts w:ascii="微软雅黑" w:hAnsi="微软雅黑" w:eastAsia="微软雅黑"/>
                 <w:b/>
-                <w:color w:val="C00000"/>
+                <w:i w:val="0"/>
+                <w:color w:val="000000"/>
                 <w:sz w:val="17"/>
                 <w:u w:val="single"/>
+                <w:shd w:fill="FFF2CC"/>
               </w:rPr>
-              <w:t>行政部/人事与用人部门负责人；具体人员待确认</w:t>
+              <w:t>待确认</w:t>
             </w:r>
           </w:p>
         </w:tc>
@@ -2821,12 +2834,48 @@
             <w:r>
               <w:rPr>
                 <w:rFonts w:ascii="微软雅黑" w:hAnsi="微软雅黑" w:eastAsia="微软雅黑"/>
+                <w:b w:val="0"/>
+                <w:i w:val="0"/>
+                <w:color w:val="000000"/>
+                <w:sz w:val="17"/>
+                <w:u w:val="none"/>
+              </w:rPr>
+              <w:t>经办人</w:t>
+            </w:r>
+            <w:r>
+              <w:rPr>
+                <w:rFonts w:ascii="微软雅黑" w:hAnsi="微软雅黑" w:eastAsia="微软雅黑"/>
                 <w:b/>
-                <w:color w:val="C00000"/>
+                <w:i w:val="0"/>
+                <w:color w:val="000000"/>
                 <w:sz w:val="17"/>
                 <w:u w:val="single"/>
+                <w:shd w:fill="FFF2CC"/>
               </w:rPr>
-              <w:t>经办人待确认；原摘要中的“王秀红”暂校为王秋红，另列魏国待核实</w:t>
+              <w:t>待确认</w:t>
+            </w:r>
+            <w:r>
+              <w:rPr>
+                <w:rFonts w:ascii="微软雅黑" w:hAnsi="微软雅黑" w:eastAsia="微软雅黑"/>
+                <w:b w:val="0"/>
+                <w:i w:val="0"/>
+                <w:color w:val="000000"/>
+                <w:sz w:val="17"/>
+                <w:u w:val="none"/>
+              </w:rPr>
+              <w:t>；原摘要中的“王秀红”暂校为王秋红，另列魏国</w:t>
+            </w:r>
+            <w:r>
+              <w:rPr>
+                <w:rFonts w:ascii="微软雅黑" w:hAnsi="微软雅黑" w:eastAsia="微软雅黑"/>
+                <w:b/>
+                <w:i w:val="0"/>
+                <w:color w:val="000000"/>
+                <w:sz w:val="17"/>
+                <w:u w:val="single"/>
+                <w:shd w:fill="FFF2CC"/>
+              </w:rPr>
+              <w:t>待核实</w:t>
             </w:r>
           </w:p>
         </w:tc>
@@ -2858,12 +2907,25 @@
             <w:r>
               <w:rPr>
                 <w:rFonts w:ascii="微软雅黑" w:hAnsi="微软雅黑" w:eastAsia="微软雅黑"/>
+                <w:b w:val="0"/>
+                <w:i w:val="0"/>
+                <w:color w:val="000000"/>
+                <w:sz w:val="17"/>
+                <w:u w:val="none"/>
+              </w:rPr>
+              <w:t>行政部/人事；具体经办人及鑫隆两家公司间的分工</w:t>
+            </w:r>
+            <w:r>
+              <w:rPr>
+                <w:rFonts w:ascii="微软雅黑" w:hAnsi="微软雅黑" w:eastAsia="微软雅黑"/>
                 <w:b/>
-                <w:color w:val="C00000"/>
+                <w:i w:val="0"/>
+                <w:color w:val="000000"/>
                 <w:sz w:val="17"/>
                 <w:u w:val="single"/>
+                <w:shd w:fill="FFF2CC"/>
               </w:rPr>
-              <w:t>行政部/人事；具体经办人及鑫隆两家公司间的分工待确认</w:t>
+              <w:t>待确认</w:t>
             </w:r>
           </w:p>
         </w:tc>
@@ -2981,17 +3043,12 @@
             <w:r>
               <w:rPr>
                 <w:rFonts w:ascii="微软雅黑" w:hAnsi="微软雅黑" w:eastAsia="微软雅黑"/>
+                <w:b/>
+                <w:i w:val="0"/>
                 <w:color w:val="000000"/>
                 <w:sz w:val="17"/>
-              </w:rPr>
-            </w:r>
-            <w:r>
-              <w:rPr>
-                <w:rFonts w:ascii="微软雅黑" w:hAnsi="微软雅黑" w:eastAsia="微软雅黑"/>
-                <w:b/>
-                <w:color w:val="C00000"/>
-                <w:sz w:val="17"/>
                 <w:u w:val="single"/>
+                <w:shd w:fill="FFF2CC"/>
               </w:rPr>
               <w:t>待确认</w:t>
             </w:r>
@@ -3111,19 +3168,25 @@
             <w:r>
               <w:rPr>
                 <w:rFonts w:ascii="微软雅黑" w:hAnsi="微软雅黑" w:eastAsia="微软雅黑"/>
+                <w:b w:val="0"/>
+                <w:i w:val="0"/>
                 <w:color w:val="000000"/>
                 <w:sz w:val="17"/>
+                <w:u w:val="none"/>
               </w:rPr>
+              <w:t>仓储组：王珊兰；具体执行人员</w:t>
             </w:r>
             <w:r>
               <w:rPr>
                 <w:rFonts w:ascii="微软雅黑" w:hAnsi="微软雅黑" w:eastAsia="微软雅黑"/>
                 <w:b/>
-                <w:color w:val="C00000"/>
+                <w:i w:val="0"/>
+                <w:color w:val="000000"/>
                 <w:sz w:val="17"/>
                 <w:u w:val="single"/>
+                <w:shd w:fill="FFF2CC"/>
               </w:rPr>
-              <w:t>仓储组：王珊兰；具体执行人员待确认</w:t>
+              <w:t>待确认</w:t>
             </w:r>
           </w:p>
         </w:tc>
@@ -3197,17 +3260,12 @@
             <w:r>
               <w:rPr>
                 <w:rFonts w:ascii="微软雅黑" w:hAnsi="微软雅黑" w:eastAsia="微软雅黑"/>
+                <w:b/>
+                <w:i w:val="0"/>
                 <w:color w:val="000000"/>
                 <w:sz w:val="17"/>
-              </w:rPr>
-            </w:r>
-            <w:r>
-              <w:rPr>
-                <w:rFonts w:ascii="微软雅黑" w:hAnsi="微软雅黑" w:eastAsia="微软雅黑"/>
-                <w:b/>
-                <w:color w:val="C00000"/>
-                <w:sz w:val="17"/>
                 <w:u w:val="single"/>
+                <w:shd w:fill="FFF2CC"/>
               </w:rPr>
               <w:t>待确认</w:t>
             </w:r>
@@ -3413,12 +3471,36 @@
             <w:r>
               <w:rPr>
                 <w:rFonts w:ascii="微软雅黑" w:hAnsi="微软雅黑" w:eastAsia="微软雅黑"/>
+                <w:b w:val="0"/>
+                <w:i w:val="0"/>
+                <w:color w:val="000000"/>
+                <w:sz w:val="17"/>
+                <w:u w:val="none"/>
+              </w:rPr>
+              <w:t>会议记录人</w:t>
+            </w:r>
+            <w:r>
+              <w:rPr>
+                <w:rFonts w:ascii="微软雅黑" w:hAnsi="微软雅黑" w:eastAsia="微软雅黑"/>
                 <w:b/>
-                <w:color w:val="C00000"/>
+                <w:i w:val="0"/>
+                <w:color w:val="000000"/>
                 <w:sz w:val="17"/>
                 <w:u w:val="single"/>
+                <w:shd w:fill="FFF2CC"/>
               </w:rPr>
-              <w:t>会议记录人待确认；原摘要提到王名涵（职工名单：模具学徒），是否由其承担会议记录需确认</w:t>
+              <w:t>待确认</w:t>
+            </w:r>
+            <w:r>
+              <w:rPr>
+                <w:rFonts w:ascii="微软雅黑" w:hAnsi="微软雅黑" w:eastAsia="微软雅黑"/>
+                <w:b w:val="0"/>
+                <w:i w:val="0"/>
+                <w:color w:val="000000"/>
+                <w:sz w:val="17"/>
+                <w:u w:val="none"/>
+              </w:rPr>
+              <w:t>；原摘要提到王名涵（职工名单：模具学徒），是否由其承担会议记录需确认</w:t>
             </w:r>
           </w:p>
         </w:tc>
@@ -3579,17 +3661,12 @@
             <w:r>
               <w:rPr>
                 <w:rFonts w:ascii="微软雅黑" w:hAnsi="微软雅黑" w:eastAsia="微软雅黑"/>
+                <w:b/>
+                <w:i w:val="0"/>
                 <w:color w:val="000000"/>
                 <w:sz w:val="17"/>
-              </w:rPr>
-            </w:r>
-            <w:r>
-              <w:rPr>
-                <w:rFonts w:ascii="微软雅黑" w:hAnsi="微软雅黑" w:eastAsia="微软雅黑"/>
-                <w:b/>
-                <w:color w:val="C00000"/>
-                <w:sz w:val="17"/>
                 <w:u w:val="single"/>
+                <w:shd w:fill="FFF2CC"/>
               </w:rPr>
               <w:t>待确认</w:t>
             </w:r>
@@ -3709,19 +3786,36 @@
             <w:r>
               <w:rPr>
                 <w:rFonts w:ascii="微软雅黑" w:hAnsi="微软雅黑" w:eastAsia="微软雅黑"/>
+                <w:b w:val="0"/>
+                <w:i w:val="0"/>
                 <w:color w:val="000000"/>
                 <w:sz w:val="17"/>
+                <w:u w:val="none"/>
               </w:rPr>
+              <w:t>采购协同人</w:t>
             </w:r>
             <w:r>
               <w:rPr>
                 <w:rFonts w:ascii="微软雅黑" w:hAnsi="微软雅黑" w:eastAsia="微软雅黑"/>
                 <w:b/>
-                <w:color w:val="C00000"/>
+                <w:i w:val="0"/>
+                <w:color w:val="000000"/>
                 <w:sz w:val="17"/>
                 <w:u w:val="single"/>
+                <w:shd w:fill="FFF2CC"/>
               </w:rPr>
-              <w:t>采购协同人待确认；原摘要相关姓名均未核实</w:t>
+              <w:t>待确认</w:t>
+            </w:r>
+            <w:r>
+              <w:rPr>
+                <w:rFonts w:ascii="微软雅黑" w:hAnsi="微软雅黑" w:eastAsia="微软雅黑"/>
+                <w:b w:val="0"/>
+                <w:i w:val="0"/>
+                <w:color w:val="000000"/>
+                <w:sz w:val="17"/>
+                <w:u w:val="none"/>
+              </w:rPr>
+              <w:t>；原摘要相关姓名均未核实</w:t>
             </w:r>
           </w:p>
         </w:tc>
@@ -3753,19 +3847,36 @@
             <w:r>
               <w:rPr>
                 <w:rFonts w:ascii="微软雅黑" w:hAnsi="微软雅黑" w:eastAsia="微软雅黑"/>
+                <w:b w:val="0"/>
+                <w:i w:val="0"/>
                 <w:color w:val="000000"/>
                 <w:sz w:val="17"/>
+                <w:u w:val="none"/>
               </w:rPr>
+              <w:t>总经理/财务审批关系</w:t>
             </w:r>
             <w:r>
               <w:rPr>
                 <w:rFonts w:ascii="微软雅黑" w:hAnsi="微软雅黑" w:eastAsia="微软雅黑"/>
                 <w:b/>
-                <w:color w:val="C00000"/>
+                <w:i w:val="0"/>
+                <w:color w:val="000000"/>
                 <w:sz w:val="17"/>
                 <w:u w:val="single"/>
+                <w:shd w:fill="FFF2CC"/>
               </w:rPr>
-              <w:t>总经理/财务审批关系待确认；董事长王勇涉及财务权限</w:t>
+              <w:t>待确认</w:t>
+            </w:r>
+            <w:r>
+              <w:rPr>
+                <w:rFonts w:ascii="微软雅黑" w:hAnsi="微软雅黑" w:eastAsia="微软雅黑"/>
+                <w:b w:val="0"/>
+                <w:i w:val="0"/>
+                <w:color w:val="000000"/>
+                <w:sz w:val="17"/>
+                <w:u w:val="none"/>
+              </w:rPr>
+              <w:t>；董事长王勇涉及财务权限</w:t>
             </w:r>
           </w:p>
         </w:tc>
@@ -3797,17 +3908,12 @@
             <w:r>
               <w:rPr>
                 <w:rFonts w:ascii="微软雅黑" w:hAnsi="微软雅黑" w:eastAsia="微软雅黑"/>
+                <w:b/>
+                <w:i w:val="0"/>
                 <w:color w:val="000000"/>
                 <w:sz w:val="17"/>
-              </w:rPr>
-            </w:r>
-            <w:r>
-              <w:rPr>
-                <w:rFonts w:ascii="微软雅黑" w:hAnsi="微软雅黑" w:eastAsia="微软雅黑"/>
-                <w:b/>
-                <w:color w:val="C00000"/>
-                <w:sz w:val="17"/>
                 <w:u w:val="single"/>
+                <w:shd w:fill="FFF2CC"/>
               </w:rPr>
               <w:t>待确认</w:t>
             </w:r>
@@ -3883,17 +3989,12 @@
             <w:r>
               <w:rPr>
                 <w:rFonts w:ascii="微软雅黑" w:hAnsi="微软雅黑" w:eastAsia="微软雅黑"/>
+                <w:b/>
+                <w:i w:val="0"/>
                 <w:color w:val="000000"/>
                 <w:sz w:val="17"/>
-              </w:rPr>
-            </w:r>
-            <w:r>
-              <w:rPr>
-                <w:rFonts w:ascii="微软雅黑" w:hAnsi="微软雅黑" w:eastAsia="微软雅黑"/>
-                <w:b/>
-                <w:color w:val="C00000"/>
-                <w:sz w:val="17"/>
                 <w:u w:val="single"/>
+                <w:shd w:fill="FFF2CC"/>
               </w:rPr>
               <w:t>待确认</w:t>
             </w:r>
@@ -4050,19 +4151,25 @@
             <w:r>
               <w:rPr>
                 <w:rFonts w:ascii="微软雅黑" w:hAnsi="微软雅黑" w:eastAsia="微软雅黑"/>
+                <w:b w:val="0"/>
+                <w:i w:val="0"/>
                 <w:color w:val="000000"/>
                 <w:sz w:val="17"/>
+                <w:u w:val="none"/>
               </w:rPr>
+              <w:t>行政部/后勤负责人；授权关系</w:t>
             </w:r>
             <w:r>
               <w:rPr>
                 <w:rFonts w:ascii="微软雅黑" w:hAnsi="微软雅黑" w:eastAsia="微软雅黑"/>
                 <w:b/>
-                <w:color w:val="C00000"/>
+                <w:i w:val="0"/>
+                <w:color w:val="000000"/>
                 <w:sz w:val="17"/>
                 <w:u w:val="single"/>
+                <w:shd w:fill="FFF2CC"/>
               </w:rPr>
-              <w:t>行政部/后勤负责人；授权关系待确认</w:t>
+              <w:t>待确认</w:t>
             </w:r>
           </w:p>
         </w:tc>
@@ -4094,17 +4201,12 @@
             <w:r>
               <w:rPr>
                 <w:rFonts w:ascii="微软雅黑" w:hAnsi="微软雅黑" w:eastAsia="微软雅黑"/>
+                <w:b/>
+                <w:i w:val="0"/>
                 <w:color w:val="000000"/>
                 <w:sz w:val="17"/>
-              </w:rPr>
-            </w:r>
-            <w:r>
-              <w:rPr>
-                <w:rFonts w:ascii="微软雅黑" w:hAnsi="微软雅黑" w:eastAsia="微软雅黑"/>
-                <w:b/>
-                <w:color w:val="C00000"/>
-                <w:sz w:val="17"/>
                 <w:u w:val="single"/>
+                <w:shd w:fill="FFF2CC"/>
               </w:rPr>
               <w:t>待确认</w:t>
             </w:r>
@@ -4181,17 +4283,12 @@
             <w:r>
               <w:rPr>
                 <w:rFonts w:ascii="微软雅黑" w:hAnsi="微软雅黑" w:eastAsia="微软雅黑"/>
+                <w:b/>
+                <w:i w:val="0"/>
                 <w:color w:val="000000"/>
                 <w:sz w:val="17"/>
-              </w:rPr>
-            </w:r>
-            <w:r>
-              <w:rPr>
-                <w:rFonts w:ascii="微软雅黑" w:hAnsi="微软雅黑" w:eastAsia="微软雅黑"/>
-                <w:b/>
-                <w:color w:val="C00000"/>
-                <w:sz w:val="17"/>
                 <w:u w:val="single"/>
+                <w:shd w:fill="FFF2CC"/>
               </w:rPr>
               <w:t>待确认</w:t>
             </w:r>
@@ -4311,19 +4408,25 @@
             <w:r>
               <w:rPr>
                 <w:rFonts w:ascii="微软雅黑" w:hAnsi="微软雅黑" w:eastAsia="微软雅黑"/>
+                <w:b w:val="0"/>
+                <w:i w:val="0"/>
                 <w:color w:val="000000"/>
                 <w:sz w:val="17"/>
+                <w:u w:val="none"/>
               </w:rPr>
+              <w:t>活动组织人</w:t>
             </w:r>
             <w:r>
               <w:rPr>
                 <w:rFonts w:ascii="微软雅黑" w:hAnsi="微软雅黑" w:eastAsia="微软雅黑"/>
                 <w:b/>
-                <w:color w:val="C00000"/>
+                <w:i w:val="0"/>
+                <w:color w:val="000000"/>
                 <w:sz w:val="17"/>
                 <w:u w:val="single"/>
+                <w:shd w:fill="FFF2CC"/>
               </w:rPr>
-              <w:t>活动组织人待确认</w:t>
+              <w:t>待确认</w:t>
             </w:r>
           </w:p>
         </w:tc>
@@ -4355,19 +4458,25 @@
             <w:r>
               <w:rPr>
                 <w:rFonts w:ascii="微软雅黑" w:hAnsi="微软雅黑" w:eastAsia="微软雅黑"/>
+                <w:b w:val="0"/>
+                <w:i w:val="0"/>
                 <w:color w:val="000000"/>
                 <w:sz w:val="17"/>
+                <w:u w:val="none"/>
               </w:rPr>
+              <w:t>总经理：王晓华；费用审批关系</w:t>
             </w:r>
             <w:r>
               <w:rPr>
                 <w:rFonts w:ascii="微软雅黑" w:hAnsi="微软雅黑" w:eastAsia="微软雅黑"/>
                 <w:b/>
-                <w:color w:val="C00000"/>
+                <w:i w:val="0"/>
+                <w:color w:val="000000"/>
                 <w:sz w:val="17"/>
                 <w:u w:val="single"/>
+                <w:shd w:fill="FFF2CC"/>
               </w:rPr>
-              <w:t>总经理：王晓华；费用审批关系待确认</w:t>
+              <w:t>待确认</w:t>
             </w:r>
           </w:p>
         </w:tc>
@@ -4399,19 +4508,25 @@
             <w:r>
               <w:rPr>
                 <w:rFonts w:ascii="微软雅黑" w:hAnsi="微软雅黑" w:eastAsia="微软雅黑"/>
+                <w:b w:val="0"/>
+                <w:i w:val="0"/>
                 <w:color w:val="000000"/>
                 <w:sz w:val="17"/>
+                <w:u w:val="none"/>
               </w:rPr>
+              <w:t>原摘要称11月4日，</w:t>
             </w:r>
             <w:r>
               <w:rPr>
                 <w:rFonts w:ascii="微软雅黑" w:hAnsi="微软雅黑" w:eastAsia="微软雅黑"/>
                 <w:b/>
-                <w:color w:val="C00000"/>
+                <w:i w:val="0"/>
+                <w:color w:val="000000"/>
                 <w:sz w:val="17"/>
                 <w:u w:val="single"/>
+                <w:shd w:fill="FFF2CC"/>
               </w:rPr>
-              <w:t>原摘要称11月4日，需复核</w:t>
+              <w:t>需复核</w:t>
             </w:r>
           </w:p>
         </w:tc>
@@ -4485,17 +4600,12 @@
             <w:r>
               <w:rPr>
                 <w:rFonts w:ascii="微软雅黑" w:hAnsi="微软雅黑" w:eastAsia="微软雅黑"/>
+                <w:b/>
+                <w:i w:val="0"/>
                 <w:color w:val="000000"/>
                 <w:sz w:val="17"/>
-              </w:rPr>
-            </w:r>
-            <w:r>
-              <w:rPr>
-                <w:rFonts w:ascii="微软雅黑" w:hAnsi="微软雅黑" w:eastAsia="微软雅黑"/>
-                <w:b/>
-                <w:color w:val="C00000"/>
-                <w:sz w:val="17"/>
                 <w:u w:val="single"/>
+                <w:shd w:fill="FFF2CC"/>
               </w:rPr>
               <w:t>待确认</w:t>
             </w:r>
@@ -4545,13 +4655,59 @@
       <w:r>
         <w:rPr>
           <w:rFonts w:ascii="微软雅黑" w:hAnsi="微软雅黑" w:eastAsia="微软雅黑"/>
+          <w:b w:val="0"/>
+          <w:i w:val="0"/>
+          <w:color w:val="000000"/>
+          <w:sz w:val="21"/>
+          <w:u w:val="none"/>
+        </w:rPr>
+        <w:t>原摘要中的姓名按职工名单和用户补充进行校正：王名涵为名单中的在职员工；“王秀红”按近似识别暂校为王秋红（办公文员），请结合原始录音/参会情况最终确认；“小勇”按用户确认指王勇。“王华”可能是王晓华的简称/识别误差，仍</w:t>
+      </w:r>
+      <w:r>
+        <w:rPr>
+          <w:rFonts w:ascii="微软雅黑" w:hAnsi="微软雅黑" w:eastAsia="微软雅黑"/>
           <w:b/>
           <w:i w:val="0"/>
-          <w:color w:val="C00000"/>
+          <w:color w:val="000000"/>
           <w:sz w:val="21"/>
           <w:u w:val="single"/>
+          <w:shd w:fill="FFF2CC"/>
         </w:rPr>
-        <w:t>原摘要中的姓名按职工名单和用户补充进行校正：王名涵为名单中的在职员工；“王秀红”按近似识别暂校为王秋红（办公文员），请结合原始录音/参会情况最终确认；“小勇”按用户确认指王勇。“王华”可能是王晓华的简称/识别误差，仍待确认。付善雄、魏国、陈继善、陈经理、富山雄、王立泽及“讲话人1—3”等，暂未能与现有受控名单可靠对应，保留待核实。</w:t>
+        <w:t>待确认</w:t>
+      </w:r>
+      <w:r>
+        <w:rPr>
+          <w:rFonts w:ascii="微软雅黑" w:hAnsi="微软雅黑" w:eastAsia="微软雅黑"/>
+          <w:b w:val="0"/>
+          <w:i w:val="0"/>
+          <w:color w:val="000000"/>
+          <w:sz w:val="21"/>
+          <w:u w:val="none"/>
+        </w:rPr>
+        <w:t>。付善雄、魏国、陈继善、陈经理、富山雄、王立泽及“讲话人1—3”等，暂未能与现有受控名单可靠对应，保留</w:t>
+      </w:r>
+      <w:r>
+        <w:rPr>
+          <w:rFonts w:ascii="微软雅黑" w:hAnsi="微软雅黑" w:eastAsia="微软雅黑"/>
+          <w:b/>
+          <w:i w:val="0"/>
+          <w:color w:val="000000"/>
+          <w:sz w:val="21"/>
+          <w:u w:val="single"/>
+          <w:shd w:fill="FFF2CC"/>
+        </w:rPr>
+        <w:t>待核实</w:t>
+      </w:r>
+      <w:r>
+        <w:rPr>
+          <w:rFonts w:ascii="微软雅黑" w:hAnsi="微软雅黑" w:eastAsia="微软雅黑"/>
+          <w:b w:val="0"/>
+          <w:i w:val="0"/>
+          <w:color w:val="000000"/>
+          <w:sz w:val="21"/>
+          <w:u w:val="none"/>
+        </w:rPr>
+        <w:t>。</w:t>
       </w:r>
     </w:p>
     <w:p>
@@ -4581,10 +4737,10 @@
           <w:rFonts w:ascii="微软雅黑" w:hAnsi="微软雅黑" w:eastAsia="微软雅黑"/>
           <w:b/>
           <w:i w:val="0"/>
-          <w:color w:val="C00000"/>
+          <w:color w:val="000000"/>
           <w:sz w:val="21"/>
           <w:u w:val="single"/>
-          <w:shd w:fill="D9EAF7"/>
+          <w:shd w:fill="FFF2CC"/>
         </w:rPr>
         <w:t>六、待确认事项</w:t>
       </w:r>

</xml_diff>

<commit_message>
vault backup: 2026-10-28 09:37:03
</commit_message>
<xml_diff>
--- a/02_Areas/工作经历/鑫犇电子有限公司/06_公司公共/会议与记录/会议记录_新厂搬迁安全会议部署落实工作_2026-10-26.docx
+++ b/02_Areas/工作经历/鑫犇电子有限公司/06_公司公共/会议与记录/会议记录_新厂搬迁安全会议部署落实工作_2026-10-26.docx
@@ -60,7 +60,6 @@
           <w:tcPr>
             <w:tcW w:type="dxa" w:w="1474"/>
             <w:vAlign w:val="center"/>
-            <w:shd w:fill="EAF3F8"/>
             <w:tcMar>
               <w:top w:w="90" w:type="dxa"/>
               <w:start w:w="110" w:type="dxa"/>
@@ -85,16 +84,10 @@
               <w:rPr>
                 <w:rFonts w:ascii="微软雅黑" w:hAnsi="微软雅黑" w:eastAsia="微软雅黑"/>
                 <w:b/>
+                <w:i w:val="0"/>
                 <w:color w:val="17365D"/>
                 <w:sz w:val="19"/>
-              </w:rPr>
-            </w:r>
-            <w:r>
-              <w:rPr>
-                <w:rFonts w:ascii="微软雅黑" w:hAnsi="微软雅黑" w:eastAsia="微软雅黑"/>
-                <w:b/>
-                <w:color w:val="17365D"/>
-                <w:sz w:val="19"/>
+                <w:u w:val="none"/>
               </w:rPr>
               <w:t>会议日期</w:t>
             </w:r>
@@ -127,16 +120,11 @@
             <w:r>
               <w:rPr>
                 <w:rFonts w:ascii="微软雅黑" w:hAnsi="微软雅黑" w:eastAsia="微软雅黑"/>
+                <w:b/>
+                <w:i w:val="0"/>
                 <w:color w:val="000000"/>
                 <w:sz w:val="19"/>
-              </w:rPr>
-            </w:r>
-            <w:r>
-              <w:rPr>
-                <w:rFonts w:ascii="微软雅黑" w:hAnsi="微软雅黑" w:eastAsia="微软雅黑"/>
-                <w:b w:val="0"/>
-                <w:color w:val="000000"/>
-                <w:sz w:val="19"/>
+                <w:u w:val="none"/>
               </w:rPr>
               <w:t>2026年10月26日</w:t>
             </w:r>
@@ -146,7 +134,6 @@
           <w:tcPr>
             <w:tcW w:type="dxa" w:w="1474"/>
             <w:vAlign w:val="center"/>
-            <w:shd w:fill="EAF3F8"/>
             <w:tcMar>
               <w:top w:w="90" w:type="dxa"/>
               <w:start w:w="110" w:type="dxa"/>
@@ -171,16 +158,10 @@
               <w:rPr>
                 <w:rFonts w:ascii="微软雅黑" w:hAnsi="微软雅黑" w:eastAsia="微软雅黑"/>
                 <w:b/>
+                <w:i w:val="0"/>
                 <w:color w:val="17365D"/>
                 <w:sz w:val="19"/>
-              </w:rPr>
-            </w:r>
-            <w:r>
-              <w:rPr>
-                <w:rFonts w:ascii="微软雅黑" w:hAnsi="微软雅黑" w:eastAsia="微软雅黑"/>
-                <w:b/>
-                <w:color w:val="17365D"/>
-                <w:sz w:val="19"/>
+                <w:u w:val="none"/>
               </w:rPr>
               <w:t>会议时间</w:t>
             </w:r>
@@ -213,16 +194,11 @@
             <w:r>
               <w:rPr>
                 <w:rFonts w:ascii="微软雅黑" w:hAnsi="微软雅黑" w:eastAsia="微软雅黑"/>
+                <w:b/>
+                <w:i w:val="0"/>
                 <w:color w:val="000000"/>
                 <w:sz w:val="19"/>
-              </w:rPr>
-            </w:r>
-            <w:r>
-              <w:rPr>
-                <w:rFonts w:ascii="微软雅黑" w:hAnsi="微软雅黑" w:eastAsia="微软雅黑"/>
-                <w:b w:val="0"/>
-                <w:color w:val="000000"/>
-                <w:sz w:val="19"/>
+                <w:u w:val="none"/>
               </w:rPr>
               <w:t>18:28—19:42</w:t>
             </w:r>
@@ -234,7 +210,6 @@
           <w:tcPr>
             <w:tcW w:type="dxa" w:w="1474"/>
             <w:vAlign w:val="center"/>
-            <w:shd w:fill="EAF3F8"/>
             <w:tcMar>
               <w:top w:w="90" w:type="dxa"/>
               <w:start w:w="110" w:type="dxa"/>
@@ -259,16 +234,10 @@
               <w:rPr>
                 <w:rFonts w:ascii="微软雅黑" w:hAnsi="微软雅黑" w:eastAsia="微软雅黑"/>
                 <w:b/>
+                <w:i w:val="0"/>
                 <w:color w:val="17365D"/>
                 <w:sz w:val="19"/>
-              </w:rPr>
-            </w:r>
-            <w:r>
-              <w:rPr>
-                <w:rFonts w:ascii="微软雅黑" w:hAnsi="微软雅黑" w:eastAsia="微软雅黑"/>
-                <w:b/>
-                <w:color w:val="17365D"/>
-                <w:sz w:val="19"/>
+                <w:u w:val="none"/>
               </w:rPr>
               <w:t>会议主题</w:t>
             </w:r>
@@ -301,16 +270,11 @@
             <w:r>
               <w:rPr>
                 <w:rFonts w:ascii="微软雅黑" w:hAnsi="微软雅黑" w:eastAsia="微软雅黑"/>
+                <w:b w:val="0"/>
+                <w:i w:val="0"/>
                 <w:color w:val="000000"/>
                 <w:sz w:val="19"/>
-              </w:rPr>
-            </w:r>
-            <w:r>
-              <w:rPr>
-                <w:rFonts w:ascii="微软雅黑" w:hAnsi="微软雅黑" w:eastAsia="微软雅黑"/>
-                <w:b w:val="0"/>
-                <w:color w:val="000000"/>
-                <w:sz w:val="19"/>
+                <w:u w:val="none"/>
               </w:rPr>
               <w:t>新厂搬迁、安全生产及管理落实</w:t>
             </w:r>
@@ -320,7 +284,6 @@
           <w:tcPr>
             <w:tcW w:type="dxa" w:w="1474"/>
             <w:vAlign w:val="center"/>
-            <w:shd w:fill="EAF3F8"/>
             <w:tcMar>
               <w:top w:w="90" w:type="dxa"/>
               <w:start w:w="110" w:type="dxa"/>
@@ -345,16 +308,10 @@
               <w:rPr>
                 <w:rFonts w:ascii="微软雅黑" w:hAnsi="微软雅黑" w:eastAsia="微软雅黑"/>
                 <w:b/>
+                <w:i w:val="0"/>
                 <w:color w:val="17365D"/>
                 <w:sz w:val="19"/>
-              </w:rPr>
-            </w:r>
-            <w:r>
-              <w:rPr>
-                <w:rFonts w:ascii="微软雅黑" w:hAnsi="微软雅黑" w:eastAsia="微软雅黑"/>
-                <w:b/>
-                <w:color w:val="17365D"/>
-                <w:sz w:val="19"/>
+                <w:u w:val="none"/>
               </w:rPr>
               <w:t>记录来源</w:t>
             </w:r>
@@ -387,16 +344,11 @@
             <w:r>
               <w:rPr>
                 <w:rFonts w:ascii="微软雅黑" w:hAnsi="微软雅黑" w:eastAsia="微软雅黑"/>
+                <w:b w:val="0"/>
+                <w:i w:val="0"/>
                 <w:color w:val="000000"/>
                 <w:sz w:val="19"/>
-              </w:rPr>
-            </w:r>
-            <w:r>
-              <w:rPr>
-                <w:rFonts w:ascii="微软雅黑" w:hAnsi="微软雅黑" w:eastAsia="微软雅黑"/>
-                <w:b w:val="0"/>
-                <w:color w:val="000000"/>
-                <w:sz w:val="19"/>
+                <w:u w:val="none"/>
               </w:rPr>
               <w:t>AI摘要初稿（原始Word文档）</w:t>
             </w:r>
@@ -408,7 +360,6 @@
           <w:tcPr>
             <w:tcW w:type="dxa" w:w="1474"/>
             <w:vAlign w:val="center"/>
-            <w:shd w:fill="EAF3F8"/>
             <w:tcMar>
               <w:top w:w="90" w:type="dxa"/>
               <w:start w:w="110" w:type="dxa"/>
@@ -433,16 +384,10 @@
               <w:rPr>
                 <w:rFonts w:ascii="微软雅黑" w:hAnsi="微软雅黑" w:eastAsia="微软雅黑"/>
                 <w:b/>
+                <w:i w:val="0"/>
                 <w:color w:val="17365D"/>
                 <w:sz w:val="19"/>
-              </w:rPr>
-            </w:r>
-            <w:r>
-              <w:rPr>
-                <w:rFonts w:ascii="微软雅黑" w:hAnsi="微软雅黑" w:eastAsia="微软雅黑"/>
-                <w:b/>
-                <w:color w:val="17365D"/>
-                <w:sz w:val="19"/>
+                <w:u w:val="none"/>
               </w:rPr>
               <w:t>参会人员</w:t>
             </w:r>
@@ -475,16 +420,11 @@
             <w:r>
               <w:rPr>
                 <w:rFonts w:ascii="微软雅黑" w:hAnsi="微软雅黑" w:eastAsia="微软雅黑"/>
+                <w:b w:val="0"/>
+                <w:i w:val="0"/>
                 <w:color w:val="000000"/>
                 <w:sz w:val="19"/>
-              </w:rPr>
-            </w:r>
-            <w:r>
-              <w:rPr>
-                <w:rFonts w:ascii="微软雅黑" w:hAnsi="微软雅黑" w:eastAsia="微软雅黑"/>
-                <w:b w:val="0"/>
-                <w:color w:val="000000"/>
-                <w:sz w:val="19"/>
+                <w:u w:val="none"/>
               </w:rPr>
               <w:t>原始记录仅标注“讲话人1、讲话人2、讲话人3”</w:t>
             </w:r>
@@ -494,7 +434,6 @@
           <w:tcPr>
             <w:tcW w:type="dxa" w:w="1474"/>
             <w:vAlign w:val="center"/>
-            <w:shd w:fill="EAF3F8"/>
             <w:tcMar>
               <w:top w:w="90" w:type="dxa"/>
               <w:start w:w="110" w:type="dxa"/>
@@ -519,16 +458,10 @@
               <w:rPr>
                 <w:rFonts w:ascii="微软雅黑" w:hAnsi="微软雅黑" w:eastAsia="微软雅黑"/>
                 <w:b/>
+                <w:i w:val="0"/>
                 <w:color w:val="17365D"/>
                 <w:sz w:val="19"/>
-              </w:rPr>
-            </w:r>
-            <w:r>
-              <w:rPr>
-                <w:rFonts w:ascii="微软雅黑" w:hAnsi="微软雅黑" w:eastAsia="微软雅黑"/>
-                <w:b/>
-                <w:color w:val="17365D"/>
-                <w:sz w:val="19"/>
+                <w:u w:val="none"/>
               </w:rPr>
               <w:t>记录状态</w:t>
             </w:r>
@@ -552,7 +485,6 @@
               <w:insideH w:val="single" w:sz="6" w:color="B7C9D6"/>
               <w:insideV w:val="single" w:sz="6" w:color="B7C9D6"/>
             </w:tcBorders>
-            <w:shd w:fill="FFF2CC"/>
           </w:tcPr>
           <w:p>
             <w:pPr>
@@ -565,7 +497,7 @@
                 <w:b w:val="0"/>
                 <w:i w:val="0"/>
                 <w:color w:val="000000"/>
-                <w:sz w:val="17"/>
+                <w:sz w:val="19"/>
                 <w:u w:val="none"/>
               </w:rPr>
               <w:t>整理稿；具体参会人</w:t>
@@ -575,10 +507,9 @@
                 <w:rFonts w:ascii="微软雅黑" w:hAnsi="微软雅黑" w:eastAsia="微软雅黑"/>
                 <w:b/>
                 <w:i w:val="0"/>
-                <w:color w:val="000000"/>
-                <w:sz w:val="17"/>
+                <w:color w:val="C00000"/>
+                <w:sz w:val="19"/>
                 <w:u w:val="single"/>
-                <w:shd w:fill="FFF2CC"/>
               </w:rPr>
               <w:t>待核实</w:t>
             </w:r>
@@ -590,7 +521,6 @@
           <w:tcPr>
             <w:tcW w:type="dxa" w:w="1474"/>
             <w:vAlign w:val="center"/>
-            <w:shd w:fill="EAF3F8"/>
             <w:tcMar>
               <w:top w:w="90" w:type="dxa"/>
               <w:start w:w="110" w:type="dxa"/>
@@ -615,16 +545,10 @@
               <w:rPr>
                 <w:rFonts w:ascii="微软雅黑" w:hAnsi="微软雅黑" w:eastAsia="微软雅黑"/>
                 <w:b/>
+                <w:i w:val="0"/>
                 <w:color w:val="17365D"/>
                 <w:sz w:val="19"/>
-              </w:rPr>
-            </w:r>
-            <w:r>
-              <w:rPr>
-                <w:rFonts w:ascii="微软雅黑" w:hAnsi="微软雅黑" w:eastAsia="微软雅黑"/>
-                <w:b/>
-                <w:color w:val="17365D"/>
-                <w:sz w:val="19"/>
+                <w:u w:val="none"/>
               </w:rPr>
               <w:t>文件来源</w:t>
             </w:r>
@@ -657,16 +581,11 @@
             <w:r>
               <w:rPr>
                 <w:rFonts w:ascii="微软雅黑" w:hAnsi="微软雅黑" w:eastAsia="微软雅黑"/>
+                <w:b w:val="0"/>
+                <w:i w:val="0"/>
                 <w:color w:val="000000"/>
                 <w:sz w:val="19"/>
-              </w:rPr>
-            </w:r>
-            <w:r>
-              <w:rPr>
-                <w:rFonts w:ascii="微软雅黑" w:hAnsi="微软雅黑" w:eastAsia="微软雅黑"/>
-                <w:b w:val="0"/>
-                <w:color w:val="000000"/>
-                <w:sz w:val="19"/>
+                <w:u w:val="none"/>
               </w:rPr>
               <w:t>新厂搬迁安全会议部署落实工作_AI 摘要.doc</w:t>
             </w:r>
@@ -676,7 +595,6 @@
           <w:tcPr>
             <w:tcW w:type="dxa" w:w="1474"/>
             <w:vAlign w:val="center"/>
-            <w:shd w:fill="EAF3F8"/>
             <w:tcMar>
               <w:top w:w="90" w:type="dxa"/>
               <w:start w:w="110" w:type="dxa"/>
@@ -701,16 +619,10 @@
               <w:rPr>
                 <w:rFonts w:ascii="微软雅黑" w:hAnsi="微软雅黑" w:eastAsia="微软雅黑"/>
                 <w:b/>
+                <w:i w:val="0"/>
                 <w:color w:val="17365D"/>
                 <w:sz w:val="19"/>
-              </w:rPr>
-            </w:r>
-            <w:r>
-              <w:rPr>
-                <w:rFonts w:ascii="微软雅黑" w:hAnsi="微软雅黑" w:eastAsia="微软雅黑"/>
-                <w:b/>
-                <w:color w:val="17365D"/>
-                <w:sz w:val="19"/>
+                <w:u w:val="none"/>
               </w:rPr>
               <w:t>整理原则</w:t>
             </w:r>
@@ -743,16 +655,11 @@
             <w:r>
               <w:rPr>
                 <w:rFonts w:ascii="微软雅黑" w:hAnsi="微软雅黑" w:eastAsia="微软雅黑"/>
+                <w:b w:val="0"/>
+                <w:i w:val="0"/>
                 <w:color w:val="000000"/>
                 <w:sz w:val="19"/>
-              </w:rPr>
-            </w:r>
-            <w:r>
-              <w:rPr>
-                <w:rFonts w:ascii="微软雅黑" w:hAnsi="微软雅黑" w:eastAsia="微软雅黑"/>
-                <w:b w:val="0"/>
-                <w:color w:val="000000"/>
-                <w:sz w:val="19"/>
+                <w:u w:val="none"/>
               </w:rPr>
               <w:t>未核实姓名或口头建议不直接固化为正式责任</w:t>
             </w:r>
@@ -776,35 +683,12 @@
         <w:rPr>
           <w:rFonts w:ascii="微软雅黑" w:hAnsi="微软雅黑" w:eastAsia="微软雅黑"/>
           <w:b w:val="0"/>
-          <w:i w:val="0"/>
-          <w:color w:val="000000"/>
+          <w:i/>
+          <w:color w:val="2F75B5"/>
           <w:sz w:val="19"/>
           <w:u w:val="none"/>
         </w:rPr>
-        <w:t>说明：本记录根据用户提供的会议摘要整理。人员姓名、部门归属和责任人优先参照公司受控组织架构资料；原摘要中无法与受控资料对应的姓名，统一标注为“</w:t>
-      </w:r>
-      <w:r>
-        <w:rPr>
-          <w:rFonts w:ascii="微软雅黑" w:hAnsi="微软雅黑" w:eastAsia="微软雅黑"/>
-          <w:b/>
-          <w:i w:val="0"/>
-          <w:color w:val="000000"/>
-          <w:sz w:val="19"/>
-          <w:u w:val="single"/>
-          <w:shd w:fill="FFF2CC"/>
-        </w:rPr>
-        <w:t>待确认</w:t>
-      </w:r>
-      <w:r>
-        <w:rPr>
-          <w:rFonts w:ascii="微软雅黑" w:hAnsi="微软雅黑" w:eastAsia="微软雅黑"/>
-          <w:b w:val="0"/>
-          <w:i w:val="0"/>
-          <w:color w:val="000000"/>
-          <w:sz w:val="19"/>
-          <w:u w:val="none"/>
-        </w:rPr>
-        <w:t>”，不擅自替换。</w:t>
+        <w:t>说明：本记录根据用户提供的会议摘要整理。人员姓名、部门归属和责任人优先参照公司受控组织架构资料；原摘要中无法与受控资料对应的姓名，统一标注为“待确认”，不擅自替换。</w:t>
       </w:r>
     </w:p>
     <w:p>
@@ -815,23 +699,13 @@
       <w:r>
         <w:rPr>
           <w:rFonts w:ascii="微软雅黑" w:hAnsi="微软雅黑" w:eastAsia="微软雅黑"/>
-          <w:b/>
-          <w:color w:val="000000"/>
+          <w:b w:val="0"/>
+          <w:i/>
+          <w:color w:val="2F75B5"/>
           <w:sz w:val="19"/>
-          <w:shd w:fill="FFF2CC"/>
+          <w:u w:val="none"/>
         </w:rPr>
-        <w:t>阅读提示：</w:t>
-      </w:r>
-      <w:r>
-        <w:rPr>
-          <w:rFonts w:ascii="微软雅黑" w:hAnsi="微软雅黑" w:eastAsia="微软雅黑"/>
-          <w:b/>
-          <w:color w:val="000000"/>
-          <w:sz w:val="21"/>
-          <w:u w:val="single"/>
-          <w:shd w:fill="FFF2CC"/>
-        </w:rPr>
-        <w:t>黄色底纹＋下划线＝待确认、待核实或需复核内容。</w:t>
+        <w:t>阅读提示：蓝色斜体＝整理说明；红色加粗下划线＝待确认/待核实；黄色加粗＝重点强调。</w:t>
       </w:r>
     </w:p>
     <w:p>
@@ -847,7 +721,6 @@
           <w:i w:val="0"/>
           <w:color w:val="17365D"/>
           <w:sz w:val="28"/>
-          <w:shd w:fill="D9EAF7"/>
         </w:rPr>
         <w:t>一、会议背景与总体要求</w:t>
       </w:r>
@@ -882,8 +755,75 @@
           <w:i w:val="0"/>
           <w:color w:val="000000"/>
           <w:sz w:val="21"/>
+          <w:u w:val="none"/>
         </w:rPr>
-        <w:t>会议强调安全优先，管理人员必须做到“先布置、再检查、再闭环”，不能只完成口头传达而不跟踪落实。</w:t>
+        <w:t>会议强调</w:t>
+      </w:r>
+      <w:r>
+        <w:rPr>
+          <w:rFonts w:ascii="微软雅黑" w:hAnsi="微软雅黑" w:eastAsia="微软雅黑"/>
+          <w:b/>
+          <w:i w:val="0"/>
+          <w:color w:val="BF9000"/>
+          <w:sz w:val="21"/>
+          <w:u w:val="none"/>
+        </w:rPr>
+        <w:t>安全优先</w:t>
+      </w:r>
+      <w:r>
+        <w:rPr>
+          <w:rFonts w:ascii="微软雅黑" w:hAnsi="微软雅黑" w:eastAsia="微软雅黑"/>
+          <w:b w:val="0"/>
+          <w:i w:val="0"/>
+          <w:color w:val="000000"/>
+          <w:sz w:val="21"/>
+          <w:u w:val="none"/>
+        </w:rPr>
+        <w:t>，管理人员</w:t>
+      </w:r>
+      <w:r>
+        <w:rPr>
+          <w:rFonts w:ascii="微软雅黑" w:hAnsi="微软雅黑" w:eastAsia="微软雅黑"/>
+          <w:b/>
+          <w:i w:val="0"/>
+          <w:color w:val="BF9000"/>
+          <w:sz w:val="21"/>
+          <w:u w:val="none"/>
+        </w:rPr>
+        <w:t>必须</w:t>
+      </w:r>
+      <w:r>
+        <w:rPr>
+          <w:rFonts w:ascii="微软雅黑" w:hAnsi="微软雅黑" w:eastAsia="微软雅黑"/>
+          <w:b w:val="0"/>
+          <w:i w:val="0"/>
+          <w:color w:val="000000"/>
+          <w:sz w:val="21"/>
+          <w:u w:val="none"/>
+        </w:rPr>
+        <w:t>做到“</w:t>
+      </w:r>
+      <w:r>
+        <w:rPr>
+          <w:rFonts w:ascii="微软雅黑" w:hAnsi="微软雅黑" w:eastAsia="微软雅黑"/>
+          <w:b/>
+          <w:i w:val="0"/>
+          <w:color w:val="BF9000"/>
+          <w:sz w:val="21"/>
+          <w:u w:val="none"/>
+        </w:rPr>
+        <w:t>先布置、再检查、再闭环</w:t>
+      </w:r>
+      <w:r>
+        <w:rPr>
+          <w:rFonts w:ascii="微软雅黑" w:hAnsi="微软雅黑" w:eastAsia="微软雅黑"/>
+          <w:b w:val="0"/>
+          <w:i w:val="0"/>
+          <w:color w:val="000000"/>
+          <w:sz w:val="21"/>
+          <w:u w:val="none"/>
+        </w:rPr>
+        <w:t>”，不能只完成口头传达而不跟踪落实。</w:t>
       </w:r>
     </w:p>
     <w:p>
@@ -898,6 +838,7 @@
           <w:i w:val="0"/>
           <w:color w:val="000000"/>
           <w:sz w:val="21"/>
+          <w:u w:val="none"/>
         </w:rPr>
         <w:t>新厂环境和两个公司合并后的工作方式需要磨合，要求员工加强团队意识、主人翁意识和全局意识；具体问题应通过合理渠道反馈，并优先提出解决方案。</w:t>
       </w:r>
@@ -915,7 +856,6 @@
           <w:i w:val="0"/>
           <w:color w:val="17365D"/>
           <w:sz w:val="28"/>
-          <w:shd w:fill="D9EAF7"/>
         </w:rPr>
         <w:t>二、主要讨论内容</w:t>
       </w:r>
@@ -949,6 +889,7 @@
           <w:i w:val="0"/>
           <w:color w:val="000000"/>
           <w:sz w:val="21"/>
+          <w:u w:val="none"/>
         </w:rPr>
         <w:t>搬迁后已出现夹伤、剪刀跌落等安全事件，要求各级管理人员追查原因并落实防范措施。</w:t>
       </w:r>
@@ -965,8 +906,31 @@
           <w:i w:val="0"/>
           <w:color w:val="000000"/>
           <w:sz w:val="21"/>
+          <w:u w:val="none"/>
         </w:rPr>
-        <w:t>模具、冲床、磨床、钻床、叉车、升降车、拖车及重物吊运均需重点检查；严禁人员停留在叉车臂及重物可能坠落、倾倒区域。</w:t>
+        <w:t>模具、冲床、磨床、钻床、叉车、升降车、拖车及重物吊运均需</w:t>
+      </w:r>
+      <w:r>
+        <w:rPr>
+          <w:rFonts w:ascii="微软雅黑" w:hAnsi="微软雅黑" w:eastAsia="微软雅黑"/>
+          <w:b/>
+          <w:i w:val="0"/>
+          <w:color w:val="BF9000"/>
+          <w:sz w:val="21"/>
+          <w:u w:val="none"/>
+        </w:rPr>
+        <w:t>重点</w:t>
+      </w:r>
+      <w:r>
+        <w:rPr>
+          <w:rFonts w:ascii="微软雅黑" w:hAnsi="微软雅黑" w:eastAsia="微软雅黑"/>
+          <w:b w:val="0"/>
+          <w:i w:val="0"/>
+          <w:color w:val="000000"/>
+          <w:sz w:val="21"/>
+          <w:u w:val="none"/>
+        </w:rPr>
+        <w:t>检查；严禁人员停留在叉车臂及重物可能坠落、倾倒区域。</w:t>
       </w:r>
     </w:p>
     <w:p>
@@ -981,6 +945,7 @@
           <w:i w:val="0"/>
           <w:color w:val="000000"/>
           <w:sz w:val="21"/>
+          <w:u w:val="none"/>
         </w:rPr>
         <w:t>电源、照明、排风扇及设备接线需要排查，线缆应固定、不得落地，避免被叉车或升降车压破造成短路。</w:t>
       </w:r>
@@ -997,6 +962,7 @@
           <w:i w:val="0"/>
           <w:color w:val="000000"/>
           <w:sz w:val="21"/>
+          <w:u w:val="none"/>
         </w:rPr>
         <w:t>各车间每周六组织安全会并形成记录；各车间主管负责隐患排查、上报和整改跟踪。</w:t>
       </w:r>
@@ -1030,8 +996,31 @@
           <w:i w:val="0"/>
           <w:color w:val="000000"/>
           <w:sz w:val="21"/>
+          <w:u w:val="none"/>
         </w:rPr>
-        <w:t>新员工入职前三天由指定带教人负责，必须先进行安全培训并持续观察，不得未经培训直接上岗。</w:t>
+        <w:t>新员工入职前三天由指定带教人负责，</w:t>
+      </w:r>
+      <w:r>
+        <w:rPr>
+          <w:rFonts w:ascii="微软雅黑" w:hAnsi="微软雅黑" w:eastAsia="微软雅黑"/>
+          <w:b/>
+          <w:i w:val="0"/>
+          <w:color w:val="BF9000"/>
+          <w:sz w:val="21"/>
+          <w:u w:val="none"/>
+        </w:rPr>
+        <w:t>必须</w:t>
+      </w:r>
+      <w:r>
+        <w:rPr>
+          <w:rFonts w:ascii="微软雅黑" w:hAnsi="微软雅黑" w:eastAsia="微软雅黑"/>
+          <w:b w:val="0"/>
+          <w:i w:val="0"/>
+          <w:color w:val="000000"/>
+          <w:sz w:val="21"/>
+          <w:u w:val="none"/>
+        </w:rPr>
+        <w:t>先进行安全培训并持续观察，不得未经培训直接上岗。</w:t>
       </w:r>
     </w:p>
     <w:p>
@@ -1046,6 +1035,7 @@
           <w:i w:val="0"/>
           <w:color w:val="000000"/>
           <w:sz w:val="21"/>
+          <w:u w:val="none"/>
         </w:rPr>
         <w:t>培训要结合现场操作反复讲解，覆盖设备、水、电、气、冲床、模具及其他危险源；培训效果需要通过实际操作确认。</w:t>
       </w:r>
@@ -1062,6 +1052,7 @@
           <w:i w:val="0"/>
           <w:color w:val="000000"/>
           <w:sz w:val="21"/>
+          <w:u w:val="none"/>
         </w:rPr>
         <w:t>新员工入职三天后应办理团体意外险，具体经办人员以公司最终确认结果为准。</w:t>
       </w:r>
@@ -1078,6 +1069,7 @@
           <w:i w:val="0"/>
           <w:color w:val="000000"/>
           <w:sz w:val="21"/>
+          <w:u w:val="none"/>
         </w:rPr>
         <w:t>带教奖励的金额和统一标准需要进一步确认，不能仅以“已安排带教”作为完成依据。</w:t>
       </w:r>
@@ -1111,6 +1103,7 @@
           <w:i w:val="0"/>
           <w:color w:val="000000"/>
           <w:sz w:val="21"/>
+          <w:u w:val="none"/>
         </w:rPr>
         <w:t>自2026年10月27日起检查工作着装，禁止穿拖鞋、凉鞋、短裤等易造成皮肤外露、打滑或碰伤的服装。</w:t>
       </w:r>
@@ -1127,6 +1120,7 @@
           <w:i w:val="0"/>
           <w:color w:val="000000"/>
           <w:sz w:val="21"/>
+          <w:u w:val="none"/>
         </w:rPr>
         <w:t>会议摘要提出员工违规一次罚款20元、管理人员宣传不到位一次罚款10元。该处罚安排涉及制度和薪资扣款，正式执行前应由管理层、人事及财务确认合法合规性和适用范围。</w:t>
       </w:r>
@@ -1143,6 +1137,7 @@
           <w:i w:val="0"/>
           <w:color w:val="000000"/>
           <w:sz w:val="21"/>
+          <w:u w:val="none"/>
         </w:rPr>
         <w:t>垃圾实行分类、定点收集和及时转运；烟头须熄灭后投入指定容器。杂物间按使用频率和美观要求分区整理，落实5S/7S中的整理要求。</w:t>
       </w:r>
@@ -1159,6 +1154,7 @@
           <w:i w:val="0"/>
           <w:color w:val="000000"/>
           <w:sz w:val="21"/>
+          <w:u w:val="none"/>
         </w:rPr>
         <w:t>食堂、厕所、宿舍、车辆停放和楼梯间卫生需要明确规则并安排责任或轮值。</w:t>
       </w:r>
@@ -1192,6 +1188,7 @@
           <w:i w:val="0"/>
           <w:color w:val="000000"/>
           <w:sz w:val="21"/>
+          <w:u w:val="none"/>
         </w:rPr>
         <w:t>排查新农仓库账物不符问题，推动仓储实物、台账和库位一致；模具配件按区域管理并纳入台账。</w:t>
       </w:r>
@@ -1208,6 +1205,7 @@
           <w:i w:val="0"/>
           <w:color w:val="000000"/>
           <w:sz w:val="21"/>
+          <w:u w:val="none"/>
         </w:rPr>
         <w:t>领料、废料入库及以旧换新等环节需要进一步明确申请、签字和记录要求，减少浪费和资产失控。</w:t>
       </w:r>
@@ -1224,6 +1222,7 @@
           <w:i w:val="0"/>
           <w:color w:val="000000"/>
           <w:sz w:val="21"/>
+          <w:u w:val="none"/>
         </w:rPr>
         <w:t>针对电镀、除油粉、抛光液、废料等成本项目，要结合客户要求区分质量标准，查找可行的工艺和成本改善方案。</w:t>
       </w:r>
@@ -1240,6 +1239,7 @@
           <w:i w:val="0"/>
           <w:color w:val="000000"/>
           <w:sz w:val="21"/>
+          <w:u w:val="none"/>
         </w:rPr>
         <w:t>改善事项不能停留在提出问题，应明确验证、责任和结果，避免因敷衍造成重复维修和成本上升。</w:t>
       </w:r>
@@ -1273,6 +1273,7 @@
           <w:i w:val="0"/>
           <w:color w:val="000000"/>
           <w:sz w:val="21"/>
+          <w:u w:val="none"/>
         </w:rPr>
         <w:t>建立会议记录制度，记录会议提纲、决定和行动事项；下次会议检查上次事项完成情况。</w:t>
       </w:r>
@@ -1289,6 +1290,7 @@
           <w:i w:val="0"/>
           <w:color w:val="000000"/>
           <w:sz w:val="21"/>
+          <w:u w:val="none"/>
         </w:rPr>
         <w:t>会议记录需要由相关主管签名确认。原摘要提到王名涵，已在职工名单中核实；其他签名人员仍需按会议实际出席情况确认。</w:t>
       </w:r>
@@ -1305,6 +1307,7 @@
           <w:i w:val="0"/>
           <w:color w:val="000000"/>
           <w:sz w:val="21"/>
+          <w:u w:val="none"/>
         </w:rPr>
         <w:t>会议室拟采购高清电视屏和数据线，用于连接办公电脑、改善会议和办公形象；采购、报销和费用分摊关系需确认。</w:t>
       </w:r>
@@ -1338,6 +1341,7 @@
           <w:i w:val="0"/>
           <w:color w:val="000000"/>
           <w:sz w:val="21"/>
+          <w:u w:val="none"/>
         </w:rPr>
         <w:t>会议摘要提到11月4日举行“进财神”相关仪式，初步安排每人发放50元红包，要求员工尽量参加；具体日期、参加范围、金额和经办人应再次确认。</w:t>
       </w:r>
@@ -1355,7 +1359,6 @@
           <w:i w:val="0"/>
           <w:color w:val="17365D"/>
           <w:sz w:val="28"/>
-          <w:shd w:fill="D9EAF7"/>
         </w:rPr>
         <w:t>三、已形成的要求与决定</w:t>
       </w:r>
@@ -1372,6 +1375,7 @@
           <w:i w:val="0"/>
           <w:color w:val="000000"/>
           <w:sz w:val="21"/>
+          <w:u w:val="none"/>
         </w:rPr>
         <w:t>从2026年10月27日起检查着装规范；处罚安排须完成制度、合规及财务确认后执行。</w:t>
       </w:r>
@@ -1388,6 +1392,7 @@
           <w:i w:val="0"/>
           <w:color w:val="000000"/>
           <w:sz w:val="21"/>
+          <w:u w:val="none"/>
         </w:rPr>
         <w:t>新员工前三天由指定人员负责带教和安全培训，三天后办理团体意外险；未完成安全培训不得上岗。</w:t>
       </w:r>
@@ -1404,6 +1409,7 @@
           <w:i w:val="0"/>
           <w:color w:val="000000"/>
           <w:sz w:val="21"/>
+          <w:u w:val="none"/>
         </w:rPr>
         <w:t>每周六组织安全会议，各车间做好记录；管理人员负责隐患排查、整改和闭环。</w:t>
       </w:r>
@@ -1420,6 +1426,7 @@
           <w:i w:val="0"/>
           <w:color w:val="000000"/>
           <w:sz w:val="21"/>
+          <w:u w:val="none"/>
         </w:rPr>
         <w:t>推行会议记录和下次会议复查机制，会议记录应由相关主管签名。</w:t>
       </w:r>
@@ -1436,6 +1443,7 @@
           <w:i w:val="0"/>
           <w:color w:val="000000"/>
           <w:sz w:val="21"/>
+          <w:u w:val="none"/>
         </w:rPr>
         <w:t>会议室采购电视屏和数据线的事项原则上同意推进，但采购负责人、预算、报销及费用分摊需确认。</w:t>
       </w:r>
@@ -1452,6 +1460,7 @@
           <w:i w:val="0"/>
           <w:color w:val="000000"/>
           <w:sz w:val="21"/>
+          <w:u w:val="none"/>
         </w:rPr>
         <w:t>团建/进财神活动原则上安排员工参加，红包金额和日期以最终通知为准。</w:t>
       </w:r>
@@ -1469,7 +1478,6 @@
           <w:i w:val="0"/>
           <w:color w:val="17365D"/>
           <w:sz w:val="28"/>
-          <w:shd w:fill="D9EAF7"/>
         </w:rPr>
         <w:t>四、行动事项</w:t>
       </w:r>
@@ -1500,7 +1508,6 @@
           <w:tcPr>
             <w:tcW w:type="dxa" w:w="680"/>
             <w:vAlign w:val="center"/>
-            <w:shd w:fill="17365D"/>
             <w:tcMar>
               <w:top w:w="90" w:type="dxa"/>
               <w:start w:w="110" w:type="dxa"/>
@@ -1525,16 +1532,10 @@
               <w:rPr>
                 <w:rFonts w:ascii="微软雅黑" w:hAnsi="微软雅黑" w:eastAsia="微软雅黑"/>
                 <w:b/>
+                <w:i w:val="0"/>
                 <w:color w:val="FFFFFF"/>
                 <w:sz w:val="17"/>
-              </w:rPr>
-            </w:r>
-            <w:r>
-              <w:rPr>
-                <w:rFonts w:ascii="微软雅黑" w:hAnsi="微软雅黑" w:eastAsia="微软雅黑"/>
-                <w:b/>
-                <w:color w:val="FFFFFF"/>
-                <w:sz w:val="17"/>
+                <w:u w:val="none"/>
               </w:rPr>
               <w:t>编号</w:t>
             </w:r>
@@ -1544,7 +1545,6 @@
           <w:tcPr>
             <w:tcW w:type="dxa" w:w="2721"/>
             <w:vAlign w:val="center"/>
-            <w:shd w:fill="17365D"/>
             <w:tcMar>
               <w:top w:w="90" w:type="dxa"/>
               <w:start w:w="110" w:type="dxa"/>
@@ -1569,16 +1569,10 @@
               <w:rPr>
                 <w:rFonts w:ascii="微软雅黑" w:hAnsi="微软雅黑" w:eastAsia="微软雅黑"/>
                 <w:b/>
+                <w:i w:val="0"/>
                 <w:color w:val="FFFFFF"/>
                 <w:sz w:val="17"/>
-              </w:rPr>
-            </w:r>
-            <w:r>
-              <w:rPr>
-                <w:rFonts w:ascii="微软雅黑" w:hAnsi="微软雅黑" w:eastAsia="微软雅黑"/>
-                <w:b/>
-                <w:color w:val="FFFFFF"/>
-                <w:sz w:val="17"/>
+                <w:u w:val="none"/>
               </w:rPr>
               <w:t>行动事项</w:t>
             </w:r>
@@ -1588,7 +1582,6 @@
           <w:tcPr>
             <w:tcW w:type="dxa" w:w="1701"/>
             <w:vAlign w:val="center"/>
-            <w:shd w:fill="17365D"/>
             <w:tcMar>
               <w:top w:w="90" w:type="dxa"/>
               <w:start w:w="110" w:type="dxa"/>
@@ -1613,16 +1606,10 @@
               <w:rPr>
                 <w:rFonts w:ascii="微软雅黑" w:hAnsi="微软雅黑" w:eastAsia="微软雅黑"/>
                 <w:b/>
+                <w:i w:val="0"/>
                 <w:color w:val="FFFFFF"/>
                 <w:sz w:val="17"/>
-              </w:rPr>
-            </w:r>
-            <w:r>
-              <w:rPr>
-                <w:rFonts w:ascii="微软雅黑" w:hAnsi="微软雅黑" w:eastAsia="微软雅黑"/>
-                <w:b/>
-                <w:color w:val="FFFFFF"/>
-                <w:sz w:val="17"/>
+                <w:u w:val="none"/>
               </w:rPr>
               <w:t>执行责任</w:t>
             </w:r>
@@ -1632,7 +1619,6 @@
           <w:tcPr>
             <w:tcW w:type="dxa" w:w="1928"/>
             <w:vAlign w:val="center"/>
-            <w:shd w:fill="17365D"/>
             <w:tcMar>
               <w:top w:w="90" w:type="dxa"/>
               <w:start w:w="110" w:type="dxa"/>
@@ -1657,16 +1643,10 @@
               <w:rPr>
                 <w:rFonts w:ascii="微软雅黑" w:hAnsi="微软雅黑" w:eastAsia="微软雅黑"/>
                 <w:b/>
+                <w:i w:val="0"/>
                 <w:color w:val="FFFFFF"/>
                 <w:sz w:val="17"/>
-              </w:rPr>
-            </w:r>
-            <w:r>
-              <w:rPr>
-                <w:rFonts w:ascii="微软雅黑" w:hAnsi="微软雅黑" w:eastAsia="微软雅黑"/>
-                <w:b/>
-                <w:color w:val="FFFFFF"/>
-                <w:sz w:val="17"/>
+                <w:u w:val="none"/>
               </w:rPr>
               <w:t>结果责任/确认人</w:t>
             </w:r>
@@ -1676,7 +1656,6 @@
           <w:tcPr>
             <w:tcW w:type="dxa" w:w="1304"/>
             <w:vAlign w:val="center"/>
-            <w:shd w:fill="17365D"/>
             <w:tcMar>
               <w:top w:w="90" w:type="dxa"/>
               <w:start w:w="110" w:type="dxa"/>
@@ -1701,16 +1680,10 @@
               <w:rPr>
                 <w:rFonts w:ascii="微软雅黑" w:hAnsi="微软雅黑" w:eastAsia="微软雅黑"/>
                 <w:b/>
+                <w:i w:val="0"/>
                 <w:color w:val="FFFFFF"/>
                 <w:sz w:val="17"/>
-              </w:rPr>
-            </w:r>
-            <w:r>
-              <w:rPr>
-                <w:rFonts w:ascii="微软雅黑" w:hAnsi="微软雅黑" w:eastAsia="微软雅黑"/>
-                <w:b/>
-                <w:color w:val="FFFFFF"/>
-                <w:sz w:val="17"/>
+                <w:u w:val="none"/>
               </w:rPr>
               <w:t>期限</w:t>
             </w:r>
@@ -1720,7 +1693,6 @@
           <w:tcPr>
             <w:tcW w:type="dxa" w:w="2154"/>
             <w:vAlign w:val="center"/>
-            <w:shd w:fill="17365D"/>
             <w:tcMar>
               <w:top w:w="90" w:type="dxa"/>
               <w:start w:w="110" w:type="dxa"/>
@@ -1745,16 +1717,10 @@
               <w:rPr>
                 <w:rFonts w:ascii="微软雅黑" w:hAnsi="微软雅黑" w:eastAsia="微软雅黑"/>
                 <w:b/>
+                <w:i w:val="0"/>
                 <w:color w:val="FFFFFF"/>
                 <w:sz w:val="17"/>
-              </w:rPr>
-            </w:r>
-            <w:r>
-              <w:rPr>
-                <w:rFonts w:ascii="微软雅黑" w:hAnsi="微软雅黑" w:eastAsia="微软雅黑"/>
-                <w:b/>
-                <w:color w:val="FFFFFF"/>
-                <w:sz w:val="17"/>
+                <w:u w:val="none"/>
               </w:rPr>
               <w:t>完成证据</w:t>
             </w:r>
@@ -1764,7 +1730,6 @@
           <w:tcPr>
             <w:tcW w:type="dxa" w:w="964"/>
             <w:vAlign w:val="center"/>
-            <w:shd w:fill="17365D"/>
             <w:tcMar>
               <w:top w:w="90" w:type="dxa"/>
               <w:start w:w="110" w:type="dxa"/>
@@ -1789,16 +1754,10 @@
               <w:rPr>
                 <w:rFonts w:ascii="微软雅黑" w:hAnsi="微软雅黑" w:eastAsia="微软雅黑"/>
                 <w:b/>
+                <w:i w:val="0"/>
                 <w:color w:val="FFFFFF"/>
                 <w:sz w:val="17"/>
-              </w:rPr>
-            </w:r>
-            <w:r>
-              <w:rPr>
-                <w:rFonts w:ascii="微软雅黑" w:hAnsi="微软雅黑" w:eastAsia="微软雅黑"/>
-                <w:b/>
-                <w:color w:val="FFFFFF"/>
-                <w:sz w:val="17"/>
+                <w:u w:val="none"/>
               </w:rPr>
               <w:t>状态</w:t>
             </w:r>
@@ -1833,16 +1792,11 @@
             <w:r>
               <w:rPr>
                 <w:rFonts w:ascii="微软雅黑" w:hAnsi="微软雅黑" w:eastAsia="微软雅黑"/>
+                <w:b w:val="0"/>
+                <w:i w:val="0"/>
                 <w:color w:val="000000"/>
                 <w:sz w:val="17"/>
-              </w:rPr>
-            </w:r>
-            <w:r>
-              <w:rPr>
-                <w:rFonts w:ascii="微软雅黑" w:hAnsi="微软雅黑" w:eastAsia="微软雅黑"/>
-                <w:b w:val="0"/>
-                <w:color w:val="000000"/>
-                <w:sz w:val="17"/>
+                <w:u w:val="none"/>
               </w:rPr>
               <w:t>A-01</w:t>
             </w:r>
@@ -1875,16 +1829,11 @@
             <w:r>
               <w:rPr>
                 <w:rFonts w:ascii="微软雅黑" w:hAnsi="微软雅黑" w:eastAsia="微软雅黑"/>
+                <w:b w:val="0"/>
+                <w:i w:val="0"/>
                 <w:color w:val="000000"/>
                 <w:sz w:val="17"/>
-              </w:rPr>
-            </w:r>
-            <w:r>
-              <w:rPr>
-                <w:rFonts w:ascii="微软雅黑" w:hAnsi="微软雅黑" w:eastAsia="微软雅黑"/>
-                <w:b w:val="0"/>
-                <w:color w:val="000000"/>
-                <w:sz w:val="17"/>
+                <w:u w:val="none"/>
               </w:rPr>
               <w:t>各车间组织安全隐患排查，重点检查重物吊运、叉车/升降车、模具装配、设备接线和现场通道。</w:t>
             </w:r>
@@ -1917,16 +1866,11 @@
             <w:r>
               <w:rPr>
                 <w:rFonts w:ascii="微软雅黑" w:hAnsi="微软雅黑" w:eastAsia="微软雅黑"/>
+                <w:b w:val="0"/>
+                <w:i w:val="0"/>
                 <w:color w:val="000000"/>
                 <w:sz w:val="17"/>
-              </w:rPr>
-            </w:r>
-            <w:r>
-              <w:rPr>
-                <w:rFonts w:ascii="微软雅黑" w:hAnsi="微软雅黑" w:eastAsia="微软雅黑"/>
-                <w:b w:val="0"/>
-                <w:color w:val="000000"/>
-                <w:sz w:val="17"/>
+                <w:u w:val="none"/>
               </w:rPr>
               <w:t>各车间主管</w:t>
             </w:r>
@@ -1950,7 +1894,6 @@
               <w:insideH w:val="single" w:sz="6" w:color="B7C9D6"/>
               <w:insideV w:val="single" w:sz="6" w:color="B7C9D6"/>
             </w:tcBorders>
-            <w:shd w:fill="FFF2CC"/>
           </w:tcPr>
           <w:p>
             <w:pPr>
@@ -1973,10 +1916,9 @@
                 <w:rFonts w:ascii="微软雅黑" w:hAnsi="微软雅黑" w:eastAsia="微软雅黑"/>
                 <w:b/>
                 <w:i w:val="0"/>
-                <w:color w:val="000000"/>
+                <w:color w:val="C00000"/>
                 <w:sz w:val="17"/>
                 <w:u w:val="single"/>
-                <w:shd w:fill="FFF2CC"/>
               </w:rPr>
               <w:t>待确认</w:t>
             </w:r>
@@ -2009,16 +1951,11 @@
             <w:r>
               <w:rPr>
                 <w:rFonts w:ascii="微软雅黑" w:hAnsi="微软雅黑" w:eastAsia="微软雅黑"/>
+                <w:b w:val="0"/>
+                <w:i w:val="0"/>
                 <w:color w:val="000000"/>
                 <w:sz w:val="17"/>
-              </w:rPr>
-            </w:r>
-            <w:r>
-              <w:rPr>
-                <w:rFonts w:ascii="微软雅黑" w:hAnsi="微软雅黑" w:eastAsia="微软雅黑"/>
-                <w:b w:val="0"/>
-                <w:color w:val="000000"/>
-                <w:sz w:val="17"/>
+                <w:u w:val="none"/>
               </w:rPr>
               <w:t>每周六并持续闭环</w:t>
             </w:r>
@@ -2051,16 +1988,11 @@
             <w:r>
               <w:rPr>
                 <w:rFonts w:ascii="微软雅黑" w:hAnsi="微软雅黑" w:eastAsia="微软雅黑"/>
+                <w:b w:val="0"/>
+                <w:i w:val="0"/>
                 <w:color w:val="000000"/>
                 <w:sz w:val="17"/>
-              </w:rPr>
-            </w:r>
-            <w:r>
-              <w:rPr>
-                <w:rFonts w:ascii="微软雅黑" w:hAnsi="微软雅黑" w:eastAsia="微软雅黑"/>
-                <w:b w:val="0"/>
-                <w:color w:val="000000"/>
-                <w:sz w:val="17"/>
+                <w:u w:val="none"/>
               </w:rPr>
               <w:t>安全会议记录、隐患清单、整改照片/复核记录</w:t>
             </w:r>
@@ -2093,16 +2025,11 @@
             <w:r>
               <w:rPr>
                 <w:rFonts w:ascii="微软雅黑" w:hAnsi="微软雅黑" w:eastAsia="微软雅黑"/>
+                <w:b w:val="0"/>
+                <w:i w:val="0"/>
                 <w:color w:val="000000"/>
                 <w:sz w:val="17"/>
-              </w:rPr>
-            </w:r>
-            <w:r>
-              <w:rPr>
-                <w:rFonts w:ascii="微软雅黑" w:hAnsi="微软雅黑" w:eastAsia="微软雅黑"/>
-                <w:b w:val="0"/>
-                <w:color w:val="000000"/>
-                <w:sz w:val="17"/>
+                <w:u w:val="none"/>
               </w:rPr>
               <w:t>待执行</w:t>
             </w:r>
@@ -2128,7 +2055,6 @@
               <w:insideH w:val="single" w:sz="6" w:color="B7C9D6"/>
               <w:insideV w:val="single" w:sz="6" w:color="B7C9D6"/>
             </w:tcBorders>
-            <w:shd w:fill="F7FAFC"/>
           </w:tcPr>
           <w:p>
             <w:pPr>
@@ -2138,16 +2064,11 @@
             <w:r>
               <w:rPr>
                 <w:rFonts w:ascii="微软雅黑" w:hAnsi="微软雅黑" w:eastAsia="微软雅黑"/>
+                <w:b w:val="0"/>
+                <w:i w:val="0"/>
                 <w:color w:val="000000"/>
                 <w:sz w:val="17"/>
-              </w:rPr>
-            </w:r>
-            <w:r>
-              <w:rPr>
-                <w:rFonts w:ascii="微软雅黑" w:hAnsi="微软雅黑" w:eastAsia="微软雅黑"/>
-                <w:b w:val="0"/>
-                <w:color w:val="000000"/>
-                <w:sz w:val="17"/>
+                <w:u w:val="none"/>
               </w:rPr>
               <w:t>A-02</w:t>
             </w:r>
@@ -2171,7 +2092,6 @@
               <w:insideH w:val="single" w:sz="6" w:color="B7C9D6"/>
               <w:insideV w:val="single" w:sz="6" w:color="B7C9D6"/>
             </w:tcBorders>
-            <w:shd w:fill="F7FAFC"/>
           </w:tcPr>
           <w:p>
             <w:pPr>
@@ -2181,16 +2101,11 @@
             <w:r>
               <w:rPr>
                 <w:rFonts w:ascii="微软雅黑" w:hAnsi="微软雅黑" w:eastAsia="微软雅黑"/>
+                <w:b w:val="0"/>
+                <w:i w:val="0"/>
                 <w:color w:val="000000"/>
                 <w:sz w:val="17"/>
-              </w:rPr>
-            </w:r>
-            <w:r>
-              <w:rPr>
-                <w:rFonts w:ascii="微软雅黑" w:hAnsi="微软雅黑" w:eastAsia="微软雅黑"/>
-                <w:b w:val="0"/>
-                <w:color w:val="000000"/>
-                <w:sz w:val="17"/>
+                <w:u w:val="none"/>
               </w:rPr>
               <w:t>宣传并检查工作着装规范。</w:t>
             </w:r>
@@ -2214,7 +2129,6 @@
               <w:insideH w:val="single" w:sz="6" w:color="B7C9D6"/>
               <w:insideV w:val="single" w:sz="6" w:color="B7C9D6"/>
             </w:tcBorders>
-            <w:shd w:fill="F7FAFC"/>
           </w:tcPr>
           <w:p>
             <w:pPr>
@@ -2224,16 +2138,11 @@
             <w:r>
               <w:rPr>
                 <w:rFonts w:ascii="微软雅黑" w:hAnsi="微软雅黑" w:eastAsia="微软雅黑"/>
+                <w:b w:val="0"/>
+                <w:i w:val="0"/>
                 <w:color w:val="000000"/>
                 <w:sz w:val="17"/>
-              </w:rPr>
-            </w:r>
-            <w:r>
-              <w:rPr>
-                <w:rFonts w:ascii="微软雅黑" w:hAnsi="微软雅黑" w:eastAsia="微软雅黑"/>
-                <w:b w:val="0"/>
-                <w:color w:val="000000"/>
-                <w:sz w:val="17"/>
+                <w:u w:val="none"/>
               </w:rPr>
               <w:t>各班组组长</w:t>
             </w:r>
@@ -2257,7 +2166,6 @@
               <w:insideH w:val="single" w:sz="6" w:color="B7C9D6"/>
               <w:insideV w:val="single" w:sz="6" w:color="B7C9D6"/>
             </w:tcBorders>
-            <w:shd w:fill="FFF2CC"/>
           </w:tcPr>
           <w:p>
             <w:pPr>
@@ -2280,10 +2188,9 @@
                 <w:rFonts w:ascii="微软雅黑" w:hAnsi="微软雅黑" w:eastAsia="微软雅黑"/>
                 <w:b/>
                 <w:i w:val="0"/>
-                <w:color w:val="000000"/>
+                <w:color w:val="C00000"/>
                 <w:sz w:val="17"/>
                 <w:u w:val="single"/>
-                <w:shd w:fill="FFF2CC"/>
               </w:rPr>
               <w:t>待确认</w:t>
             </w:r>
@@ -2307,7 +2214,6 @@
               <w:insideH w:val="single" w:sz="6" w:color="B7C9D6"/>
               <w:insideV w:val="single" w:sz="6" w:color="B7C9D6"/>
             </w:tcBorders>
-            <w:shd w:fill="F7FAFC"/>
           </w:tcPr>
           <w:p>
             <w:pPr>
@@ -2317,16 +2223,11 @@
             <w:r>
               <w:rPr>
                 <w:rFonts w:ascii="微软雅黑" w:hAnsi="微软雅黑" w:eastAsia="微软雅黑"/>
+                <w:b w:val="0"/>
+                <w:i w:val="0"/>
                 <w:color w:val="000000"/>
                 <w:sz w:val="17"/>
-              </w:rPr>
-            </w:r>
-            <w:r>
-              <w:rPr>
-                <w:rFonts w:ascii="微软雅黑" w:hAnsi="微软雅黑" w:eastAsia="微软雅黑"/>
-                <w:b w:val="0"/>
-                <w:color w:val="000000"/>
-                <w:sz w:val="17"/>
+                <w:u w:val="none"/>
               </w:rPr>
               <w:t>2026-10-27起</w:t>
             </w:r>
@@ -2350,7 +2251,6 @@
               <w:insideH w:val="single" w:sz="6" w:color="B7C9D6"/>
               <w:insideV w:val="single" w:sz="6" w:color="B7C9D6"/>
             </w:tcBorders>
-            <w:shd w:fill="F7FAFC"/>
           </w:tcPr>
           <w:p>
             <w:pPr>
@@ -2360,16 +2260,11 @@
             <w:r>
               <w:rPr>
                 <w:rFonts w:ascii="微软雅黑" w:hAnsi="微软雅黑" w:eastAsia="微软雅黑"/>
+                <w:b w:val="0"/>
+                <w:i w:val="0"/>
                 <w:color w:val="000000"/>
                 <w:sz w:val="17"/>
-              </w:rPr>
-            </w:r>
-            <w:r>
-              <w:rPr>
-                <w:rFonts w:ascii="微软雅黑" w:hAnsi="微软雅黑" w:eastAsia="微软雅黑"/>
-                <w:b w:val="0"/>
-                <w:color w:val="000000"/>
-                <w:sz w:val="17"/>
+                <w:u w:val="none"/>
               </w:rPr>
               <w:t>宣传记录、检查记录、违规处理确认</w:t>
             </w:r>
@@ -2393,7 +2288,6 @@
               <w:insideH w:val="single" w:sz="6" w:color="B7C9D6"/>
               <w:insideV w:val="single" w:sz="6" w:color="B7C9D6"/>
             </w:tcBorders>
-            <w:shd w:fill="FFF2CC"/>
           </w:tcPr>
           <w:p>
             <w:pPr>
@@ -2405,10 +2299,9 @@
                 <w:rFonts w:ascii="微软雅黑" w:hAnsi="微软雅黑" w:eastAsia="微软雅黑"/>
                 <w:b/>
                 <w:i w:val="0"/>
-                <w:color w:val="000000"/>
+                <w:color w:val="C00000"/>
                 <w:sz w:val="17"/>
                 <w:u w:val="single"/>
-                <w:shd w:fill="FFF2CC"/>
               </w:rPr>
               <w:t>待确认</w:t>
             </w:r>
@@ -2443,16 +2336,11 @@
             <w:r>
               <w:rPr>
                 <w:rFonts w:ascii="微软雅黑" w:hAnsi="微软雅黑" w:eastAsia="微软雅黑"/>
+                <w:b w:val="0"/>
+                <w:i w:val="0"/>
                 <w:color w:val="000000"/>
                 <w:sz w:val="17"/>
-              </w:rPr>
-            </w:r>
-            <w:r>
-              <w:rPr>
-                <w:rFonts w:ascii="微软雅黑" w:hAnsi="微软雅黑" w:eastAsia="微软雅黑"/>
-                <w:b w:val="0"/>
-                <w:color w:val="000000"/>
-                <w:sz w:val="17"/>
+                <w:u w:val="none"/>
               </w:rPr>
               <w:t>A-03</w:t>
             </w:r>
@@ -2485,16 +2373,11 @@
             <w:r>
               <w:rPr>
                 <w:rFonts w:ascii="微软雅黑" w:hAnsi="微软雅黑" w:eastAsia="微软雅黑"/>
+                <w:b w:val="0"/>
+                <w:i w:val="0"/>
                 <w:color w:val="000000"/>
                 <w:sz w:val="17"/>
-              </w:rPr>
-            </w:r>
-            <w:r>
-              <w:rPr>
-                <w:rFonts w:ascii="微软雅黑" w:hAnsi="微软雅黑" w:eastAsia="微软雅黑"/>
-                <w:b w:val="0"/>
-                <w:color w:val="000000"/>
-                <w:sz w:val="17"/>
+                <w:u w:val="none"/>
               </w:rPr>
               <w:t>新员工前三天指定带教并完成安全培训，培训后确认是否允许上岗。</w:t>
             </w:r>
@@ -2527,16 +2410,11 @@
             <w:r>
               <w:rPr>
                 <w:rFonts w:ascii="微软雅黑" w:hAnsi="微软雅黑" w:eastAsia="微软雅黑"/>
+                <w:b w:val="0"/>
+                <w:i w:val="0"/>
                 <w:color w:val="000000"/>
                 <w:sz w:val="17"/>
-              </w:rPr>
-            </w:r>
-            <w:r>
-              <w:rPr>
-                <w:rFonts w:ascii="微软雅黑" w:hAnsi="微软雅黑" w:eastAsia="微软雅黑"/>
-                <w:b w:val="0"/>
-                <w:color w:val="000000"/>
-                <w:sz w:val="17"/>
+                <w:u w:val="none"/>
               </w:rPr>
               <w:t>各部门指定带教人</w:t>
             </w:r>
@@ -2560,7 +2438,6 @@
               <w:insideH w:val="single" w:sz="6" w:color="B7C9D6"/>
               <w:insideV w:val="single" w:sz="6" w:color="B7C9D6"/>
             </w:tcBorders>
-            <w:shd w:fill="FFF2CC"/>
           </w:tcPr>
           <w:p>
             <w:pPr>
@@ -2583,10 +2460,9 @@
                 <w:rFonts w:ascii="微软雅黑" w:hAnsi="微软雅黑" w:eastAsia="微软雅黑"/>
                 <w:b/>
                 <w:i w:val="0"/>
-                <w:color w:val="000000"/>
+                <w:color w:val="C00000"/>
                 <w:sz w:val="17"/>
                 <w:u w:val="single"/>
-                <w:shd w:fill="FFF2CC"/>
               </w:rPr>
               <w:t>待确认</w:t>
             </w:r>
@@ -2619,16 +2495,11 @@
             <w:r>
               <w:rPr>
                 <w:rFonts w:ascii="微软雅黑" w:hAnsi="微软雅黑" w:eastAsia="微软雅黑"/>
+                <w:b w:val="0"/>
+                <w:i w:val="0"/>
                 <w:color w:val="000000"/>
                 <w:sz w:val="17"/>
-              </w:rPr>
-            </w:r>
-            <w:r>
-              <w:rPr>
-                <w:rFonts w:ascii="微软雅黑" w:hAnsi="微软雅黑" w:eastAsia="微软雅黑"/>
-                <w:b w:val="0"/>
-                <w:color w:val="000000"/>
-                <w:sz w:val="17"/>
+                <w:u w:val="none"/>
               </w:rPr>
               <w:t>新员工入职前三天</w:t>
             </w:r>
@@ -2661,16 +2532,11 @@
             <w:r>
               <w:rPr>
                 <w:rFonts w:ascii="微软雅黑" w:hAnsi="微软雅黑" w:eastAsia="微软雅黑"/>
+                <w:b w:val="0"/>
+                <w:i w:val="0"/>
                 <w:color w:val="000000"/>
                 <w:sz w:val="17"/>
-              </w:rPr>
-            </w:r>
-            <w:r>
-              <w:rPr>
-                <w:rFonts w:ascii="微软雅黑" w:hAnsi="微软雅黑" w:eastAsia="微软雅黑"/>
-                <w:b w:val="0"/>
-                <w:color w:val="000000"/>
-                <w:sz w:val="17"/>
+                <w:u w:val="none"/>
               </w:rPr>
               <w:t>培训记录、带教确认、上岗确认</w:t>
             </w:r>
@@ -2703,16 +2569,11 @@
             <w:r>
               <w:rPr>
                 <w:rFonts w:ascii="微软雅黑" w:hAnsi="微软雅黑" w:eastAsia="微软雅黑"/>
+                <w:b w:val="0"/>
+                <w:i w:val="0"/>
                 <w:color w:val="000000"/>
                 <w:sz w:val="17"/>
-              </w:rPr>
-            </w:r>
-            <w:r>
-              <w:rPr>
-                <w:rFonts w:ascii="微软雅黑" w:hAnsi="微软雅黑" w:eastAsia="微软雅黑"/>
-                <w:b w:val="0"/>
-                <w:color w:val="000000"/>
-                <w:sz w:val="17"/>
+                <w:u w:val="none"/>
               </w:rPr>
               <w:t>待执行</w:t>
             </w:r>
@@ -2738,7 +2599,6 @@
               <w:insideH w:val="single" w:sz="6" w:color="B7C9D6"/>
               <w:insideV w:val="single" w:sz="6" w:color="B7C9D6"/>
             </w:tcBorders>
-            <w:shd w:fill="F7FAFC"/>
           </w:tcPr>
           <w:p>
             <w:pPr>
@@ -2748,16 +2608,11 @@
             <w:r>
               <w:rPr>
                 <w:rFonts w:ascii="微软雅黑" w:hAnsi="微软雅黑" w:eastAsia="微软雅黑"/>
+                <w:b w:val="0"/>
+                <w:i w:val="0"/>
                 <w:color w:val="000000"/>
                 <w:sz w:val="17"/>
-              </w:rPr>
-            </w:r>
-            <w:r>
-              <w:rPr>
-                <w:rFonts w:ascii="微软雅黑" w:hAnsi="微软雅黑" w:eastAsia="微软雅黑"/>
-                <w:b w:val="0"/>
-                <w:color w:val="000000"/>
-                <w:sz w:val="17"/>
+                <w:u w:val="none"/>
               </w:rPr>
               <w:t>A-04</w:t>
             </w:r>
@@ -2781,7 +2636,6 @@
               <w:insideH w:val="single" w:sz="6" w:color="B7C9D6"/>
               <w:insideV w:val="single" w:sz="6" w:color="B7C9D6"/>
             </w:tcBorders>
-            <w:shd w:fill="F7FAFC"/>
           </w:tcPr>
           <w:p>
             <w:pPr>
@@ -2791,16 +2645,11 @@
             <w:r>
               <w:rPr>
                 <w:rFonts w:ascii="微软雅黑" w:hAnsi="微软雅黑" w:eastAsia="微软雅黑"/>
+                <w:b w:val="0"/>
+                <w:i w:val="0"/>
                 <w:color w:val="000000"/>
                 <w:sz w:val="17"/>
-              </w:rPr>
-            </w:r>
-            <w:r>
-              <w:rPr>
-                <w:rFonts w:ascii="微软雅黑" w:hAnsi="微软雅黑" w:eastAsia="微软雅黑"/>
-                <w:b w:val="0"/>
-                <w:color w:val="000000"/>
-                <w:sz w:val="17"/>
+                <w:u w:val="none"/>
               </w:rPr>
               <w:t>新员工入职三天后办理团体意外险。</w:t>
             </w:r>
@@ -2824,7 +2673,6 @@
               <w:insideH w:val="single" w:sz="6" w:color="B7C9D6"/>
               <w:insideV w:val="single" w:sz="6" w:color="B7C9D6"/>
             </w:tcBorders>
-            <w:shd w:fill="FFF2CC"/>
           </w:tcPr>
           <w:p>
             <w:pPr>
@@ -2847,10 +2695,9 @@
                 <w:rFonts w:ascii="微软雅黑" w:hAnsi="微软雅黑" w:eastAsia="微软雅黑"/>
                 <w:b/>
                 <w:i w:val="0"/>
-                <w:color w:val="000000"/>
+                <w:color w:val="C00000"/>
                 <w:sz w:val="17"/>
                 <w:u w:val="single"/>
-                <w:shd w:fill="FFF2CC"/>
               </w:rPr>
               <w:t>待确认</w:t>
             </w:r>
@@ -2870,10 +2717,9 @@
                 <w:rFonts w:ascii="微软雅黑" w:hAnsi="微软雅黑" w:eastAsia="微软雅黑"/>
                 <w:b/>
                 <w:i w:val="0"/>
-                <w:color w:val="000000"/>
+                <w:color w:val="C00000"/>
                 <w:sz w:val="17"/>
                 <w:u w:val="single"/>
-                <w:shd w:fill="FFF2CC"/>
               </w:rPr>
               <w:t>待核实</w:t>
             </w:r>
@@ -2897,7 +2743,6 @@
               <w:insideH w:val="single" w:sz="6" w:color="B7C9D6"/>
               <w:insideV w:val="single" w:sz="6" w:color="B7C9D6"/>
             </w:tcBorders>
-            <w:shd w:fill="FFF2CC"/>
           </w:tcPr>
           <w:p>
             <w:pPr>
@@ -2920,10 +2765,9 @@
                 <w:rFonts w:ascii="微软雅黑" w:hAnsi="微软雅黑" w:eastAsia="微软雅黑"/>
                 <w:b/>
                 <w:i w:val="0"/>
-                <w:color w:val="000000"/>
+                <w:color w:val="C00000"/>
                 <w:sz w:val="17"/>
                 <w:u w:val="single"/>
-                <w:shd w:fill="FFF2CC"/>
               </w:rPr>
               <w:t>待确认</w:t>
             </w:r>
@@ -2947,7 +2791,6 @@
               <w:insideH w:val="single" w:sz="6" w:color="B7C9D6"/>
               <w:insideV w:val="single" w:sz="6" w:color="B7C9D6"/>
             </w:tcBorders>
-            <w:shd w:fill="F7FAFC"/>
           </w:tcPr>
           <w:p>
             <w:pPr>
@@ -2957,16 +2800,11 @@
             <w:r>
               <w:rPr>
                 <w:rFonts w:ascii="微软雅黑" w:hAnsi="微软雅黑" w:eastAsia="微软雅黑"/>
+                <w:b w:val="0"/>
+                <w:i w:val="0"/>
                 <w:color w:val="000000"/>
                 <w:sz w:val="17"/>
-              </w:rPr>
-            </w:r>
-            <w:r>
-              <w:rPr>
-                <w:rFonts w:ascii="微软雅黑" w:hAnsi="微软雅黑" w:eastAsia="微软雅黑"/>
-                <w:b w:val="0"/>
-                <w:color w:val="000000"/>
-                <w:sz w:val="17"/>
+                <w:u w:val="none"/>
               </w:rPr>
               <w:t>入职第3天后</w:t>
             </w:r>
@@ -2990,7 +2828,6 @@
               <w:insideH w:val="single" w:sz="6" w:color="B7C9D6"/>
               <w:insideV w:val="single" w:sz="6" w:color="B7C9D6"/>
             </w:tcBorders>
-            <w:shd w:fill="F7FAFC"/>
           </w:tcPr>
           <w:p>
             <w:pPr>
@@ -3000,16 +2837,11 @@
             <w:r>
               <w:rPr>
                 <w:rFonts w:ascii="微软雅黑" w:hAnsi="微软雅黑" w:eastAsia="微软雅黑"/>
+                <w:b w:val="0"/>
+                <w:i w:val="0"/>
                 <w:color w:val="000000"/>
                 <w:sz w:val="17"/>
-              </w:rPr>
-            </w:r>
-            <w:r>
-              <w:rPr>
-                <w:rFonts w:ascii="微软雅黑" w:hAnsi="微软雅黑" w:eastAsia="微软雅黑"/>
-                <w:b w:val="0"/>
-                <w:color w:val="000000"/>
-                <w:sz w:val="17"/>
+                <w:u w:val="none"/>
               </w:rPr>
               <w:t>保险办理记录和人员清单</w:t>
             </w:r>
@@ -3033,7 +2865,6 @@
               <w:insideH w:val="single" w:sz="6" w:color="B7C9D6"/>
               <w:insideV w:val="single" w:sz="6" w:color="B7C9D6"/>
             </w:tcBorders>
-            <w:shd w:fill="FFF2CC"/>
           </w:tcPr>
           <w:p>
             <w:pPr>
@@ -3045,10 +2876,9 @@
                 <w:rFonts w:ascii="微软雅黑" w:hAnsi="微软雅黑" w:eastAsia="微软雅黑"/>
                 <w:b/>
                 <w:i w:val="0"/>
-                <w:color w:val="000000"/>
+                <w:color w:val="C00000"/>
                 <w:sz w:val="17"/>
                 <w:u w:val="single"/>
-                <w:shd w:fill="FFF2CC"/>
               </w:rPr>
               <w:t>待确认</w:t>
             </w:r>
@@ -3083,16 +2913,11 @@
             <w:r>
               <w:rPr>
                 <w:rFonts w:ascii="微软雅黑" w:hAnsi="微软雅黑" w:eastAsia="微软雅黑"/>
+                <w:b w:val="0"/>
+                <w:i w:val="0"/>
                 <w:color w:val="000000"/>
                 <w:sz w:val="17"/>
-              </w:rPr>
-            </w:r>
-            <w:r>
-              <w:rPr>
-                <w:rFonts w:ascii="微软雅黑" w:hAnsi="微软雅黑" w:eastAsia="微软雅黑"/>
-                <w:b w:val="0"/>
-                <w:color w:val="000000"/>
-                <w:sz w:val="17"/>
+                <w:u w:val="none"/>
               </w:rPr>
               <w:t>A-05</w:t>
             </w:r>
@@ -3125,16 +2950,11 @@
             <w:r>
               <w:rPr>
                 <w:rFonts w:ascii="微软雅黑" w:hAnsi="微软雅黑" w:eastAsia="微软雅黑"/>
+                <w:b w:val="0"/>
+                <w:i w:val="0"/>
                 <w:color w:val="000000"/>
                 <w:sz w:val="17"/>
-              </w:rPr>
-            </w:r>
-            <w:r>
-              <w:rPr>
-                <w:rFonts w:ascii="微软雅黑" w:hAnsi="微软雅黑" w:eastAsia="微软雅黑"/>
-                <w:b w:val="0"/>
-                <w:color w:val="000000"/>
-                <w:sz w:val="17"/>
+                <w:u w:val="none"/>
               </w:rPr>
               <w:t>排查仓库实物与台账一致性，完善模具配件分区和入账。</w:t>
             </w:r>
@@ -3158,7 +2978,6 @@
               <w:insideH w:val="single" w:sz="6" w:color="B7C9D6"/>
               <w:insideV w:val="single" w:sz="6" w:color="B7C9D6"/>
             </w:tcBorders>
-            <w:shd w:fill="FFF2CC"/>
           </w:tcPr>
           <w:p>
             <w:pPr>
@@ -3181,10 +3000,9 @@
                 <w:rFonts w:ascii="微软雅黑" w:hAnsi="微软雅黑" w:eastAsia="微软雅黑"/>
                 <w:b/>
                 <w:i w:val="0"/>
-                <w:color w:val="000000"/>
+                <w:color w:val="C00000"/>
                 <w:sz w:val="17"/>
                 <w:u w:val="single"/>
-                <w:shd w:fill="FFF2CC"/>
               </w:rPr>
               <w:t>待确认</w:t>
             </w:r>
@@ -3217,16 +3035,11 @@
             <w:r>
               <w:rPr>
                 <w:rFonts w:ascii="微软雅黑" w:hAnsi="微软雅黑" w:eastAsia="微软雅黑"/>
+                <w:b w:val="0"/>
+                <w:i w:val="0"/>
                 <w:color w:val="000000"/>
                 <w:sz w:val="17"/>
-              </w:rPr>
-            </w:r>
-            <w:r>
-              <w:rPr>
-                <w:rFonts w:ascii="微软雅黑" w:hAnsi="微软雅黑" w:eastAsia="微软雅黑"/>
-                <w:b w:val="0"/>
-                <w:color w:val="000000"/>
-                <w:sz w:val="17"/>
+                <w:u w:val="none"/>
               </w:rPr>
               <w:t>营运部负责人：王晓华</w:t>
             </w:r>
@@ -3250,7 +3063,6 @@
               <w:insideH w:val="single" w:sz="6" w:color="B7C9D6"/>
               <w:insideV w:val="single" w:sz="6" w:color="B7C9D6"/>
             </w:tcBorders>
-            <w:shd w:fill="FFF2CC"/>
           </w:tcPr>
           <w:p>
             <w:pPr>
@@ -3262,10 +3074,9 @@
                 <w:rFonts w:ascii="微软雅黑" w:hAnsi="微软雅黑" w:eastAsia="微软雅黑"/>
                 <w:b/>
                 <w:i w:val="0"/>
-                <w:color w:val="000000"/>
+                <w:color w:val="C00000"/>
                 <w:sz w:val="17"/>
                 <w:u w:val="single"/>
-                <w:shd w:fill="FFF2CC"/>
               </w:rPr>
               <w:t>待确认</w:t>
             </w:r>
@@ -3298,16 +3109,11 @@
             <w:r>
               <w:rPr>
                 <w:rFonts w:ascii="微软雅黑" w:hAnsi="微软雅黑" w:eastAsia="微软雅黑"/>
+                <w:b w:val="0"/>
+                <w:i w:val="0"/>
                 <w:color w:val="000000"/>
                 <w:sz w:val="17"/>
-              </w:rPr>
-            </w:r>
-            <w:r>
-              <w:rPr>
-                <w:rFonts w:ascii="微软雅黑" w:hAnsi="微软雅黑" w:eastAsia="微软雅黑"/>
-                <w:b w:val="0"/>
-                <w:color w:val="000000"/>
-                <w:sz w:val="17"/>
+                <w:u w:val="none"/>
               </w:rPr>
               <w:t>盘点表、账物差异清单、模具配件台账</w:t>
             </w:r>
@@ -3340,16 +3146,11 @@
             <w:r>
               <w:rPr>
                 <w:rFonts w:ascii="微软雅黑" w:hAnsi="微软雅黑" w:eastAsia="微软雅黑"/>
+                <w:b w:val="0"/>
+                <w:i w:val="0"/>
                 <w:color w:val="000000"/>
                 <w:sz w:val="17"/>
-              </w:rPr>
-            </w:r>
-            <w:r>
-              <w:rPr>
-                <w:rFonts w:ascii="微软雅黑" w:hAnsi="微软雅黑" w:eastAsia="微软雅黑"/>
-                <w:b w:val="0"/>
-                <w:color w:val="000000"/>
-                <w:sz w:val="17"/>
+                <w:u w:val="none"/>
               </w:rPr>
               <w:t>待执行</w:t>
             </w:r>
@@ -3375,7 +3176,6 @@
               <w:insideH w:val="single" w:sz="6" w:color="B7C9D6"/>
               <w:insideV w:val="single" w:sz="6" w:color="B7C9D6"/>
             </w:tcBorders>
-            <w:shd w:fill="F7FAFC"/>
           </w:tcPr>
           <w:p>
             <w:pPr>
@@ -3385,16 +3185,11 @@
             <w:r>
               <w:rPr>
                 <w:rFonts w:ascii="微软雅黑" w:hAnsi="微软雅黑" w:eastAsia="微软雅黑"/>
+                <w:b w:val="0"/>
+                <w:i w:val="0"/>
                 <w:color w:val="000000"/>
                 <w:sz w:val="17"/>
-              </w:rPr>
-            </w:r>
-            <w:r>
-              <w:rPr>
-                <w:rFonts w:ascii="微软雅黑" w:hAnsi="微软雅黑" w:eastAsia="微软雅黑"/>
-                <w:b w:val="0"/>
-                <w:color w:val="000000"/>
-                <w:sz w:val="17"/>
+                <w:u w:val="none"/>
               </w:rPr>
               <w:t>A-06</w:t>
             </w:r>
@@ -3418,7 +3213,6 @@
               <w:insideH w:val="single" w:sz="6" w:color="B7C9D6"/>
               <w:insideV w:val="single" w:sz="6" w:color="B7C9D6"/>
             </w:tcBorders>
-            <w:shd w:fill="F7FAFC"/>
           </w:tcPr>
           <w:p>
             <w:pPr>
@@ -3428,16 +3222,11 @@
             <w:r>
               <w:rPr>
                 <w:rFonts w:ascii="微软雅黑" w:hAnsi="微软雅黑" w:eastAsia="微软雅黑"/>
+                <w:b w:val="0"/>
+                <w:i w:val="0"/>
                 <w:color w:val="000000"/>
                 <w:sz w:val="17"/>
-              </w:rPr>
-            </w:r>
-            <w:r>
-              <w:rPr>
-                <w:rFonts w:ascii="微软雅黑" w:hAnsi="微软雅黑" w:eastAsia="微软雅黑"/>
-                <w:b w:val="0"/>
-                <w:color w:val="000000"/>
-                <w:sz w:val="17"/>
+                <w:u w:val="none"/>
               </w:rPr>
               <w:t>拟定并推行会议记录提纲，后续会议检查上次行动事项。</w:t>
             </w:r>
@@ -3461,7 +3250,6 @@
               <w:insideH w:val="single" w:sz="6" w:color="B7C9D6"/>
               <w:insideV w:val="single" w:sz="6" w:color="B7C9D6"/>
             </w:tcBorders>
-            <w:shd w:fill="FFF2CC"/>
           </w:tcPr>
           <w:p>
             <w:pPr>
@@ -3484,10 +3272,9 @@
                 <w:rFonts w:ascii="微软雅黑" w:hAnsi="微软雅黑" w:eastAsia="微软雅黑"/>
                 <w:b/>
                 <w:i w:val="0"/>
-                <w:color w:val="000000"/>
+                <w:color w:val="C00000"/>
                 <w:sz w:val="17"/>
                 <w:u w:val="single"/>
-                <w:shd w:fill="FFF2CC"/>
               </w:rPr>
               <w:t>待确认</w:t>
             </w:r>
@@ -3522,7 +3309,6 @@
               <w:insideH w:val="single" w:sz="6" w:color="B7C9D6"/>
               <w:insideV w:val="single" w:sz="6" w:color="B7C9D6"/>
             </w:tcBorders>
-            <w:shd w:fill="F7FAFC"/>
           </w:tcPr>
           <w:p>
             <w:pPr>
@@ -3532,16 +3318,11 @@
             <w:r>
               <w:rPr>
                 <w:rFonts w:ascii="微软雅黑" w:hAnsi="微软雅黑" w:eastAsia="微软雅黑"/>
+                <w:b w:val="0"/>
+                <w:i w:val="0"/>
                 <w:color w:val="000000"/>
                 <w:sz w:val="17"/>
-              </w:rPr>
-            </w:r>
-            <w:r>
-              <w:rPr>
-                <w:rFonts w:ascii="微软雅黑" w:hAnsi="微软雅黑" w:eastAsia="微软雅黑"/>
-                <w:b w:val="0"/>
-                <w:color w:val="000000"/>
-                <w:sz w:val="17"/>
+                <w:u w:val="none"/>
               </w:rPr>
               <w:t>总经理：王晓华</w:t>
             </w:r>
@@ -3565,7 +3346,6 @@
               <w:insideH w:val="single" w:sz="6" w:color="B7C9D6"/>
               <w:insideV w:val="single" w:sz="6" w:color="B7C9D6"/>
             </w:tcBorders>
-            <w:shd w:fill="F7FAFC"/>
           </w:tcPr>
           <w:p>
             <w:pPr>
@@ -3575,16 +3355,11 @@
             <w:r>
               <w:rPr>
                 <w:rFonts w:ascii="微软雅黑" w:hAnsi="微软雅黑" w:eastAsia="微软雅黑"/>
+                <w:b w:val="0"/>
+                <w:i w:val="0"/>
                 <w:color w:val="000000"/>
                 <w:sz w:val="17"/>
-              </w:rPr>
-            </w:r>
-            <w:r>
-              <w:rPr>
-                <w:rFonts w:ascii="微软雅黑" w:hAnsi="微软雅黑" w:eastAsia="微软雅黑"/>
-                <w:b w:val="0"/>
-                <w:color w:val="000000"/>
-                <w:sz w:val="17"/>
+                <w:u w:val="none"/>
               </w:rPr>
               <w:t>下次会议前</w:t>
             </w:r>
@@ -3608,7 +3383,6 @@
               <w:insideH w:val="single" w:sz="6" w:color="B7C9D6"/>
               <w:insideV w:val="single" w:sz="6" w:color="B7C9D6"/>
             </w:tcBorders>
-            <w:shd w:fill="F7FAFC"/>
           </w:tcPr>
           <w:p>
             <w:pPr>
@@ -3618,16 +3392,11 @@
             <w:r>
               <w:rPr>
                 <w:rFonts w:ascii="微软雅黑" w:hAnsi="微软雅黑" w:eastAsia="微软雅黑"/>
+                <w:b w:val="0"/>
+                <w:i w:val="0"/>
                 <w:color w:val="000000"/>
                 <w:sz w:val="17"/>
-              </w:rPr>
-            </w:r>
-            <w:r>
-              <w:rPr>
-                <w:rFonts w:ascii="微软雅黑" w:hAnsi="微软雅黑" w:eastAsia="微软雅黑"/>
-                <w:b w:val="0"/>
-                <w:color w:val="000000"/>
-                <w:sz w:val="17"/>
+                <w:u w:val="none"/>
               </w:rPr>
               <w:t>会议提纲、签名版会议记录、复查结果</w:t>
             </w:r>
@@ -3651,7 +3420,6 @@
               <w:insideH w:val="single" w:sz="6" w:color="B7C9D6"/>
               <w:insideV w:val="single" w:sz="6" w:color="B7C9D6"/>
             </w:tcBorders>
-            <w:shd w:fill="FFF2CC"/>
           </w:tcPr>
           <w:p>
             <w:pPr>
@@ -3663,10 +3431,9 @@
                 <w:rFonts w:ascii="微软雅黑" w:hAnsi="微软雅黑" w:eastAsia="微软雅黑"/>
                 <w:b/>
                 <w:i w:val="0"/>
-                <w:color w:val="000000"/>
+                <w:color w:val="C00000"/>
                 <w:sz w:val="17"/>
                 <w:u w:val="single"/>
-                <w:shd w:fill="FFF2CC"/>
               </w:rPr>
               <w:t>待确认</w:t>
             </w:r>
@@ -3701,16 +3468,11 @@
             <w:r>
               <w:rPr>
                 <w:rFonts w:ascii="微软雅黑" w:hAnsi="微软雅黑" w:eastAsia="微软雅黑"/>
+                <w:b w:val="0"/>
+                <w:i w:val="0"/>
                 <w:color w:val="000000"/>
                 <w:sz w:val="17"/>
-              </w:rPr>
-            </w:r>
-            <w:r>
-              <w:rPr>
-                <w:rFonts w:ascii="微软雅黑" w:hAnsi="微软雅黑" w:eastAsia="微软雅黑"/>
-                <w:b w:val="0"/>
-                <w:color w:val="000000"/>
-                <w:sz w:val="17"/>
+                <w:u w:val="none"/>
               </w:rPr>
               <w:t>A-07</w:t>
             </w:r>
@@ -3743,16 +3505,11 @@
             <w:r>
               <w:rPr>
                 <w:rFonts w:ascii="微软雅黑" w:hAnsi="微软雅黑" w:eastAsia="微软雅黑"/>
+                <w:b w:val="0"/>
+                <w:i w:val="0"/>
                 <w:color w:val="000000"/>
                 <w:sz w:val="17"/>
-              </w:rPr>
-            </w:r>
-            <w:r>
-              <w:rPr>
-                <w:rFonts w:ascii="微软雅黑" w:hAnsi="微软雅黑" w:eastAsia="微软雅黑"/>
-                <w:b w:val="0"/>
-                <w:color w:val="000000"/>
-                <w:sz w:val="17"/>
+                <w:u w:val="none"/>
               </w:rPr>
               <w:t>采购会议室电视屏和数据线，明确预算、报销和费用分摊。</w:t>
             </w:r>
@@ -3776,7 +3533,6 @@
               <w:insideH w:val="single" w:sz="6" w:color="B7C9D6"/>
               <w:insideV w:val="single" w:sz="6" w:color="B7C9D6"/>
             </w:tcBorders>
-            <w:shd w:fill="FFF2CC"/>
           </w:tcPr>
           <w:p>
             <w:pPr>
@@ -3799,10 +3555,9 @@
                 <w:rFonts w:ascii="微软雅黑" w:hAnsi="微软雅黑" w:eastAsia="微软雅黑"/>
                 <w:b/>
                 <w:i w:val="0"/>
-                <w:color w:val="000000"/>
+                <w:color w:val="C00000"/>
                 <w:sz w:val="17"/>
                 <w:u w:val="single"/>
-                <w:shd w:fill="FFF2CC"/>
               </w:rPr>
               <w:t>待确认</w:t>
             </w:r>
@@ -3837,7 +3592,6 @@
               <w:insideH w:val="single" w:sz="6" w:color="B7C9D6"/>
               <w:insideV w:val="single" w:sz="6" w:color="B7C9D6"/>
             </w:tcBorders>
-            <w:shd w:fill="FFF2CC"/>
           </w:tcPr>
           <w:p>
             <w:pPr>
@@ -3860,10 +3614,9 @@
                 <w:rFonts w:ascii="微软雅黑" w:hAnsi="微软雅黑" w:eastAsia="微软雅黑"/>
                 <w:b/>
                 <w:i w:val="0"/>
-                <w:color w:val="000000"/>
+                <w:color w:val="C00000"/>
                 <w:sz w:val="17"/>
                 <w:u w:val="single"/>
-                <w:shd w:fill="FFF2CC"/>
               </w:rPr>
               <w:t>待确认</w:t>
             </w:r>
@@ -3898,7 +3651,6 @@
               <w:insideH w:val="single" w:sz="6" w:color="B7C9D6"/>
               <w:insideV w:val="single" w:sz="6" w:color="B7C9D6"/>
             </w:tcBorders>
-            <w:shd w:fill="FFF2CC"/>
           </w:tcPr>
           <w:p>
             <w:pPr>
@@ -3910,10 +3662,9 @@
                 <w:rFonts w:ascii="微软雅黑" w:hAnsi="微软雅黑" w:eastAsia="微软雅黑"/>
                 <w:b/>
                 <w:i w:val="0"/>
-                <w:color w:val="000000"/>
+                <w:color w:val="C00000"/>
                 <w:sz w:val="17"/>
                 <w:u w:val="single"/>
-                <w:shd w:fill="FFF2CC"/>
               </w:rPr>
               <w:t>待确认</w:t>
             </w:r>
@@ -3946,16 +3697,11 @@
             <w:r>
               <w:rPr>
                 <w:rFonts w:ascii="微软雅黑" w:hAnsi="微软雅黑" w:eastAsia="微软雅黑"/>
+                <w:b w:val="0"/>
+                <w:i w:val="0"/>
                 <w:color w:val="000000"/>
                 <w:sz w:val="17"/>
-              </w:rPr>
-            </w:r>
-            <w:r>
-              <w:rPr>
-                <w:rFonts w:ascii="微软雅黑" w:hAnsi="微软雅黑" w:eastAsia="微软雅黑"/>
-                <w:b w:val="0"/>
-                <w:color w:val="000000"/>
-                <w:sz w:val="17"/>
+                <w:u w:val="none"/>
               </w:rPr>
               <w:t>采购订单、发票、报销单、安装验收记录</w:t>
             </w:r>
@@ -3979,7 +3725,6 @@
               <w:insideH w:val="single" w:sz="6" w:color="B7C9D6"/>
               <w:insideV w:val="single" w:sz="6" w:color="B7C9D6"/>
             </w:tcBorders>
-            <w:shd w:fill="FFF2CC"/>
           </w:tcPr>
           <w:p>
             <w:pPr>
@@ -3991,304 +3736,9 @@
                 <w:rFonts w:ascii="微软雅黑" w:hAnsi="微软雅黑" w:eastAsia="微软雅黑"/>
                 <w:b/>
                 <w:i w:val="0"/>
-                <w:color w:val="000000"/>
+                <w:color w:val="C00000"/>
                 <w:sz w:val="17"/>
                 <w:u w:val="single"/>
-                <w:shd w:fill="FFF2CC"/>
-              </w:rPr>
-              <w:t>待确认</w:t>
-            </w:r>
-          </w:p>
-        </w:tc>
-      </w:tr>
-      <w:tr>
-        <w:tc>
-          <w:tcPr>
-            <w:tcW w:type="dxa" w:w="680"/>
-            <w:vAlign w:val="center"/>
-            <w:tcMar>
-              <w:top w:w="90" w:type="dxa"/>
-              <w:start w:w="110" w:type="dxa"/>
-              <w:bottom w:w="90" w:type="dxa"/>
-              <w:end w:w="110" w:type="dxa"/>
-            </w:tcMar>
-            <w:tcBorders>
-              <w:top w:val="single" w:sz="6" w:color="B7C9D6"/>
-              <w:left w:val="single" w:sz="6" w:color="B7C9D6"/>
-              <w:bottom w:val="single" w:sz="6" w:color="B7C9D6"/>
-              <w:right w:val="single" w:sz="6" w:color="B7C9D6"/>
-              <w:insideH w:val="single" w:sz="6" w:color="B7C9D6"/>
-              <w:insideV w:val="single" w:sz="6" w:color="B7C9D6"/>
-            </w:tcBorders>
-            <w:shd w:fill="F7FAFC"/>
-          </w:tcPr>
-          <w:p>
-            <w:pPr>
-              <w:pStyle w:val="行动表格文字"/>
-              <w:spacing w:before="0" w:after="0" w:line="240" w:lineRule="auto"/>
-            </w:pPr>
-            <w:r>
-              <w:rPr>
-                <w:rFonts w:ascii="微软雅黑" w:hAnsi="微软雅黑" w:eastAsia="微软雅黑"/>
-                <w:color w:val="000000"/>
-                <w:sz w:val="17"/>
-              </w:rPr>
-            </w:r>
-            <w:r>
-              <w:rPr>
-                <w:rFonts w:ascii="微软雅黑" w:hAnsi="微软雅黑" w:eastAsia="微软雅黑"/>
-                <w:b w:val="0"/>
-                <w:color w:val="000000"/>
-                <w:sz w:val="17"/>
-              </w:rPr>
-              <w:t>A-08</w:t>
-            </w:r>
-          </w:p>
-        </w:tc>
-        <w:tc>
-          <w:tcPr>
-            <w:tcW w:type="dxa" w:w="2721"/>
-            <w:vAlign w:val="center"/>
-            <w:tcMar>
-              <w:top w:w="90" w:type="dxa"/>
-              <w:start w:w="110" w:type="dxa"/>
-              <w:bottom w:w="90" w:type="dxa"/>
-              <w:end w:w="110" w:type="dxa"/>
-            </w:tcMar>
-            <w:tcBorders>
-              <w:top w:val="single" w:sz="6" w:color="B7C9D6"/>
-              <w:left w:val="single" w:sz="6" w:color="B7C9D6"/>
-              <w:bottom w:val="single" w:sz="6" w:color="B7C9D6"/>
-              <w:right w:val="single" w:sz="6" w:color="B7C9D6"/>
-              <w:insideH w:val="single" w:sz="6" w:color="B7C9D6"/>
-              <w:insideV w:val="single" w:sz="6" w:color="B7C9D6"/>
-            </w:tcBorders>
-            <w:shd w:fill="F7FAFC"/>
-          </w:tcPr>
-          <w:p>
-            <w:pPr>
-              <w:pStyle w:val="行动表格文字"/>
-              <w:spacing w:before="0" w:after="0" w:line="240" w:lineRule="auto"/>
-            </w:pPr>
-            <w:r>
-              <w:rPr>
-                <w:rFonts w:ascii="微软雅黑" w:hAnsi="微软雅黑" w:eastAsia="微软雅黑"/>
-                <w:color w:val="000000"/>
-                <w:sz w:val="17"/>
-              </w:rPr>
-            </w:r>
-            <w:r>
-              <w:rPr>
-                <w:rFonts w:ascii="微软雅黑" w:hAnsi="微软雅黑" w:eastAsia="微软雅黑"/>
-                <w:b w:val="0"/>
-                <w:color w:val="000000"/>
-                <w:sz w:val="17"/>
-              </w:rPr>
-              <w:t>落实宿舍楼梯间、楼层卫生及公共区域清洁排班。</w:t>
-            </w:r>
-          </w:p>
-        </w:tc>
-        <w:tc>
-          <w:tcPr>
-            <w:tcW w:type="dxa" w:w="1701"/>
-            <w:vAlign w:val="center"/>
-            <w:tcMar>
-              <w:top w:w="90" w:type="dxa"/>
-              <w:start w:w="110" w:type="dxa"/>
-              <w:bottom w:w="90" w:type="dxa"/>
-              <w:end w:w="110" w:type="dxa"/>
-            </w:tcMar>
-            <w:tcBorders>
-              <w:top w:val="single" w:sz="6" w:color="B7C9D6"/>
-              <w:left w:val="single" w:sz="6" w:color="B7C9D6"/>
-              <w:bottom w:val="single" w:sz="6" w:color="B7C9D6"/>
-              <w:right w:val="single" w:sz="6" w:color="B7C9D6"/>
-              <w:insideH w:val="single" w:sz="6" w:color="B7C9D6"/>
-              <w:insideV w:val="single" w:sz="6" w:color="B7C9D6"/>
-            </w:tcBorders>
-            <w:shd w:fill="F7FAFC"/>
-          </w:tcPr>
-          <w:p>
-            <w:pPr>
-              <w:pStyle w:val="行动表格文字"/>
-              <w:spacing w:before="0" w:after="0" w:line="240" w:lineRule="auto"/>
-            </w:pPr>
-            <w:r>
-              <w:rPr>
-                <w:rFonts w:ascii="微软雅黑" w:hAnsi="微软雅黑" w:eastAsia="微软雅黑"/>
-                <w:color w:val="000000"/>
-                <w:sz w:val="17"/>
-              </w:rPr>
-              <w:t>后勤组；原摘要提到“小勇”，按用户确认更正为王勇</w:t>
-            </w:r>
-          </w:p>
-        </w:tc>
-        <w:tc>
-          <w:tcPr>
-            <w:tcW w:type="dxa" w:w="1928"/>
-            <w:vAlign w:val="center"/>
-            <w:tcMar>
-              <w:top w:w="90" w:type="dxa"/>
-              <w:start w:w="110" w:type="dxa"/>
-              <w:bottom w:w="90" w:type="dxa"/>
-              <w:end w:w="110" w:type="dxa"/>
-            </w:tcMar>
-            <w:tcBorders>
-              <w:top w:val="single" w:sz="6" w:color="B7C9D6"/>
-              <w:left w:val="single" w:sz="6" w:color="B7C9D6"/>
-              <w:bottom w:val="single" w:sz="6" w:color="B7C9D6"/>
-              <w:right w:val="single" w:sz="6" w:color="B7C9D6"/>
-              <w:insideH w:val="single" w:sz="6" w:color="B7C9D6"/>
-              <w:insideV w:val="single" w:sz="6" w:color="B7C9D6"/>
-            </w:tcBorders>
-            <w:shd w:fill="FFF2CC"/>
-          </w:tcPr>
-          <w:p>
-            <w:pPr>
-              <w:pStyle w:val="行动表格文字"/>
-              <w:spacing w:before="0" w:after="0" w:line="240" w:lineRule="auto"/>
-            </w:pPr>
-            <w:r>
-              <w:rPr>
-                <w:rFonts w:ascii="微软雅黑" w:hAnsi="微软雅黑" w:eastAsia="微软雅黑"/>
-                <w:b w:val="0"/>
-                <w:i w:val="0"/>
-                <w:color w:val="000000"/>
-                <w:sz w:val="17"/>
-                <w:u w:val="none"/>
-              </w:rPr>
-              <w:t>行政部/后勤负责人；授权关系</w:t>
-            </w:r>
-            <w:r>
-              <w:rPr>
-                <w:rFonts w:ascii="微软雅黑" w:hAnsi="微软雅黑" w:eastAsia="微软雅黑"/>
-                <w:b/>
-                <w:i w:val="0"/>
-                <w:color w:val="000000"/>
-                <w:sz w:val="17"/>
-                <w:u w:val="single"/>
-                <w:shd w:fill="FFF2CC"/>
-              </w:rPr>
-              <w:t>待确认</w:t>
-            </w:r>
-          </w:p>
-        </w:tc>
-        <w:tc>
-          <w:tcPr>
-            <w:tcW w:type="dxa" w:w="1304"/>
-            <w:vAlign w:val="center"/>
-            <w:tcMar>
-              <w:top w:w="90" w:type="dxa"/>
-              <w:start w:w="110" w:type="dxa"/>
-              <w:bottom w:w="90" w:type="dxa"/>
-              <w:end w:w="110" w:type="dxa"/>
-            </w:tcMar>
-            <w:tcBorders>
-              <w:top w:val="single" w:sz="6" w:color="B7C9D6"/>
-              <w:left w:val="single" w:sz="6" w:color="B7C9D6"/>
-              <w:bottom w:val="single" w:sz="6" w:color="B7C9D6"/>
-              <w:right w:val="single" w:sz="6" w:color="B7C9D6"/>
-              <w:insideH w:val="single" w:sz="6" w:color="B7C9D6"/>
-              <w:insideV w:val="single" w:sz="6" w:color="B7C9D6"/>
-            </w:tcBorders>
-            <w:shd w:fill="FFF2CC"/>
-          </w:tcPr>
-          <w:p>
-            <w:pPr>
-              <w:pStyle w:val="行动表格文字"/>
-              <w:spacing w:before="0" w:after="0" w:line="240" w:lineRule="auto"/>
-            </w:pPr>
-            <w:r>
-              <w:rPr>
-                <w:rFonts w:ascii="微软雅黑" w:hAnsi="微软雅黑" w:eastAsia="微软雅黑"/>
-                <w:b/>
-                <w:i w:val="0"/>
-                <w:color w:val="000000"/>
-                <w:sz w:val="17"/>
-                <w:u w:val="single"/>
-                <w:shd w:fill="FFF2CC"/>
-              </w:rPr>
-              <w:t>待确认</w:t>
-            </w:r>
-          </w:p>
-        </w:tc>
-        <w:tc>
-          <w:tcPr>
-            <w:tcW w:type="dxa" w:w="2154"/>
-            <w:vAlign w:val="center"/>
-            <w:tcMar>
-              <w:top w:w="90" w:type="dxa"/>
-              <w:start w:w="110" w:type="dxa"/>
-              <w:bottom w:w="90" w:type="dxa"/>
-              <w:end w:w="110" w:type="dxa"/>
-            </w:tcMar>
-            <w:tcBorders>
-              <w:top w:val="single" w:sz="6" w:color="B7C9D6"/>
-              <w:left w:val="single" w:sz="6" w:color="B7C9D6"/>
-              <w:bottom w:val="single" w:sz="6" w:color="B7C9D6"/>
-              <w:right w:val="single" w:sz="6" w:color="B7C9D6"/>
-              <w:insideH w:val="single" w:sz="6" w:color="B7C9D6"/>
-              <w:insideV w:val="single" w:sz="6" w:color="B7C9D6"/>
-            </w:tcBorders>
-            <w:shd w:fill="F7FAFC"/>
-          </w:tcPr>
-          <w:p>
-            <w:pPr>
-              <w:pStyle w:val="行动表格文字"/>
-              <w:spacing w:before="0" w:after="0" w:line="240" w:lineRule="auto"/>
-            </w:pPr>
-            <w:r>
-              <w:rPr>
-                <w:rFonts w:ascii="微软雅黑" w:hAnsi="微软雅黑" w:eastAsia="微软雅黑"/>
-                <w:color w:val="000000"/>
-                <w:sz w:val="17"/>
-              </w:rPr>
-            </w:r>
-            <w:r>
-              <w:rPr>
-                <w:rFonts w:ascii="微软雅黑" w:hAnsi="微软雅黑" w:eastAsia="微软雅黑"/>
-                <w:b w:val="0"/>
-                <w:color w:val="000000"/>
-                <w:sz w:val="17"/>
-              </w:rPr>
-              <w:t>排班表、检查记录</w:t>
-            </w:r>
-          </w:p>
-        </w:tc>
-        <w:tc>
-          <w:tcPr>
-            <w:tcW w:type="dxa" w:w="964"/>
-            <w:vAlign w:val="center"/>
-            <w:tcMar>
-              <w:top w:w="90" w:type="dxa"/>
-              <w:start w:w="110" w:type="dxa"/>
-              <w:bottom w:w="90" w:type="dxa"/>
-              <w:end w:w="110" w:type="dxa"/>
-            </w:tcMar>
-            <w:tcBorders>
-              <w:top w:val="single" w:sz="6" w:color="B7C9D6"/>
-              <w:left w:val="single" w:sz="6" w:color="B7C9D6"/>
-              <w:bottom w:val="single" w:sz="6" w:color="B7C9D6"/>
-              <w:right w:val="single" w:sz="6" w:color="B7C9D6"/>
-              <w:insideH w:val="single" w:sz="6" w:color="B7C9D6"/>
-              <w:insideV w:val="single" w:sz="6" w:color="B7C9D6"/>
-            </w:tcBorders>
-            <w:shd w:fill="FFF2CC"/>
-          </w:tcPr>
-          <w:p>
-            <w:pPr>
-              <w:pStyle w:val="行动表格文字"/>
-              <w:spacing w:before="0" w:after="0" w:line="240" w:lineRule="auto"/>
-            </w:pPr>
-            <w:r>
-              <w:rPr>
-                <w:rFonts w:ascii="微软雅黑" w:hAnsi="微软雅黑" w:eastAsia="微软雅黑"/>
-                <w:b/>
-                <w:i w:val="0"/>
-                <w:color w:val="000000"/>
-                <w:sz w:val="17"/>
-                <w:u w:val="single"/>
-                <w:shd w:fill="FFF2CC"/>
               </w:rPr>
               <w:t>待确认</w:t>
             </w:r>
@@ -4323,16 +3773,283 @@
             <w:r>
               <w:rPr>
                 <w:rFonts w:ascii="微软雅黑" w:hAnsi="微软雅黑" w:eastAsia="微软雅黑"/>
+                <w:b w:val="0"/>
+                <w:i w:val="0"/>
                 <w:color w:val="000000"/>
                 <w:sz w:val="17"/>
+                <w:u w:val="none"/>
               </w:rPr>
+              <w:t>A-08</w:t>
+            </w:r>
+          </w:p>
+        </w:tc>
+        <w:tc>
+          <w:tcPr>
+            <w:tcW w:type="dxa" w:w="2721"/>
+            <w:vAlign w:val="center"/>
+            <w:tcMar>
+              <w:top w:w="90" w:type="dxa"/>
+              <w:start w:w="110" w:type="dxa"/>
+              <w:bottom w:w="90" w:type="dxa"/>
+              <w:end w:w="110" w:type="dxa"/>
+            </w:tcMar>
+            <w:tcBorders>
+              <w:top w:val="single" w:sz="6" w:color="B7C9D6"/>
+              <w:left w:val="single" w:sz="6" w:color="B7C9D6"/>
+              <w:bottom w:val="single" w:sz="6" w:color="B7C9D6"/>
+              <w:right w:val="single" w:sz="6" w:color="B7C9D6"/>
+              <w:insideH w:val="single" w:sz="6" w:color="B7C9D6"/>
+              <w:insideV w:val="single" w:sz="6" w:color="B7C9D6"/>
+            </w:tcBorders>
+          </w:tcPr>
+          <w:p>
+            <w:pPr>
+              <w:pStyle w:val="行动表格文字"/>
+              <w:spacing w:before="0" w:after="0" w:line="240" w:lineRule="auto"/>
+            </w:pPr>
+            <w:r>
+              <w:rPr>
+                <w:rFonts w:ascii="微软雅黑" w:hAnsi="微软雅黑" w:eastAsia="微软雅黑"/>
+                <w:b w:val="0"/>
+                <w:i w:val="0"/>
+                <w:color w:val="000000"/>
+                <w:sz w:val="17"/>
+                <w:u w:val="none"/>
+              </w:rPr>
+              <w:t>落实宿舍楼梯间、楼层卫生及公共区域清洁排班。</w:t>
+            </w:r>
+          </w:p>
+        </w:tc>
+        <w:tc>
+          <w:tcPr>
+            <w:tcW w:type="dxa" w:w="1701"/>
+            <w:vAlign w:val="center"/>
+            <w:tcMar>
+              <w:top w:w="90" w:type="dxa"/>
+              <w:start w:w="110" w:type="dxa"/>
+              <w:bottom w:w="90" w:type="dxa"/>
+              <w:end w:w="110" w:type="dxa"/>
+            </w:tcMar>
+            <w:tcBorders>
+              <w:top w:val="single" w:sz="6" w:color="B7C9D6"/>
+              <w:left w:val="single" w:sz="6" w:color="B7C9D6"/>
+              <w:bottom w:val="single" w:sz="6" w:color="B7C9D6"/>
+              <w:right w:val="single" w:sz="6" w:color="B7C9D6"/>
+              <w:insideH w:val="single" w:sz="6" w:color="B7C9D6"/>
+              <w:insideV w:val="single" w:sz="6" w:color="B7C9D6"/>
+            </w:tcBorders>
+          </w:tcPr>
+          <w:p>
+            <w:pPr>
+              <w:pStyle w:val="行动表格文字"/>
+              <w:spacing w:before="0" w:after="0" w:line="240" w:lineRule="auto"/>
+            </w:pPr>
+            <w:r>
+              <w:rPr>
+                <w:rFonts w:ascii="微软雅黑" w:hAnsi="微软雅黑" w:eastAsia="微软雅黑"/>
+                <w:b w:val="0"/>
+                <w:i w:val="0"/>
+                <w:color w:val="000000"/>
+                <w:sz w:val="17"/>
+                <w:u w:val="none"/>
+              </w:rPr>
+              <w:t>后勤组；原摘要提到“小勇”，按用户确认更正为王勇</w:t>
+            </w:r>
+          </w:p>
+        </w:tc>
+        <w:tc>
+          <w:tcPr>
+            <w:tcW w:type="dxa" w:w="1928"/>
+            <w:vAlign w:val="center"/>
+            <w:tcMar>
+              <w:top w:w="90" w:type="dxa"/>
+              <w:start w:w="110" w:type="dxa"/>
+              <w:bottom w:w="90" w:type="dxa"/>
+              <w:end w:w="110" w:type="dxa"/>
+            </w:tcMar>
+            <w:tcBorders>
+              <w:top w:val="single" w:sz="6" w:color="B7C9D6"/>
+              <w:left w:val="single" w:sz="6" w:color="B7C9D6"/>
+              <w:bottom w:val="single" w:sz="6" w:color="B7C9D6"/>
+              <w:right w:val="single" w:sz="6" w:color="B7C9D6"/>
+              <w:insideH w:val="single" w:sz="6" w:color="B7C9D6"/>
+              <w:insideV w:val="single" w:sz="6" w:color="B7C9D6"/>
+            </w:tcBorders>
+          </w:tcPr>
+          <w:p>
+            <w:pPr>
+              <w:pStyle w:val="行动表格文字"/>
+              <w:spacing w:before="0" w:after="0" w:line="240" w:lineRule="auto"/>
+            </w:pPr>
+            <w:r>
+              <w:rPr>
+                <w:rFonts w:ascii="微软雅黑" w:hAnsi="微软雅黑" w:eastAsia="微软雅黑"/>
+                <w:b w:val="0"/>
+                <w:i w:val="0"/>
+                <w:color w:val="000000"/>
+                <w:sz w:val="17"/>
+                <w:u w:val="none"/>
+              </w:rPr>
+              <w:t>行政部/后勤负责人；授权关系</w:t>
             </w:r>
             <w:r>
               <w:rPr>
                 <w:rFonts w:ascii="微软雅黑" w:hAnsi="微软雅黑" w:eastAsia="微软雅黑"/>
+                <w:b/>
+                <w:i w:val="0"/>
+                <w:color w:val="C00000"/>
+                <w:sz w:val="17"/>
+                <w:u w:val="single"/>
+              </w:rPr>
+              <w:t>待确认</w:t>
+            </w:r>
+          </w:p>
+        </w:tc>
+        <w:tc>
+          <w:tcPr>
+            <w:tcW w:type="dxa" w:w="1304"/>
+            <w:vAlign w:val="center"/>
+            <w:tcMar>
+              <w:top w:w="90" w:type="dxa"/>
+              <w:start w:w="110" w:type="dxa"/>
+              <w:bottom w:w="90" w:type="dxa"/>
+              <w:end w:w="110" w:type="dxa"/>
+            </w:tcMar>
+            <w:tcBorders>
+              <w:top w:val="single" w:sz="6" w:color="B7C9D6"/>
+              <w:left w:val="single" w:sz="6" w:color="B7C9D6"/>
+              <w:bottom w:val="single" w:sz="6" w:color="B7C9D6"/>
+              <w:right w:val="single" w:sz="6" w:color="B7C9D6"/>
+              <w:insideH w:val="single" w:sz="6" w:color="B7C9D6"/>
+              <w:insideV w:val="single" w:sz="6" w:color="B7C9D6"/>
+            </w:tcBorders>
+          </w:tcPr>
+          <w:p>
+            <w:pPr>
+              <w:pStyle w:val="行动表格文字"/>
+              <w:spacing w:before="0" w:after="0" w:line="240" w:lineRule="auto"/>
+            </w:pPr>
+            <w:r>
+              <w:rPr>
+                <w:rFonts w:ascii="微软雅黑" w:hAnsi="微软雅黑" w:eastAsia="微软雅黑"/>
+                <w:b/>
+                <w:i w:val="0"/>
+                <w:color w:val="C00000"/>
+                <w:sz w:val="17"/>
+                <w:u w:val="single"/>
+              </w:rPr>
+              <w:t>待确认</w:t>
+            </w:r>
+          </w:p>
+        </w:tc>
+        <w:tc>
+          <w:tcPr>
+            <w:tcW w:type="dxa" w:w="2154"/>
+            <w:vAlign w:val="center"/>
+            <w:tcMar>
+              <w:top w:w="90" w:type="dxa"/>
+              <w:start w:w="110" w:type="dxa"/>
+              <w:bottom w:w="90" w:type="dxa"/>
+              <w:end w:w="110" w:type="dxa"/>
+            </w:tcMar>
+            <w:tcBorders>
+              <w:top w:val="single" w:sz="6" w:color="B7C9D6"/>
+              <w:left w:val="single" w:sz="6" w:color="B7C9D6"/>
+              <w:bottom w:val="single" w:sz="6" w:color="B7C9D6"/>
+              <w:right w:val="single" w:sz="6" w:color="B7C9D6"/>
+              <w:insideH w:val="single" w:sz="6" w:color="B7C9D6"/>
+              <w:insideV w:val="single" w:sz="6" w:color="B7C9D6"/>
+            </w:tcBorders>
+          </w:tcPr>
+          <w:p>
+            <w:pPr>
+              <w:pStyle w:val="行动表格文字"/>
+              <w:spacing w:before="0" w:after="0" w:line="240" w:lineRule="auto"/>
+            </w:pPr>
+            <w:r>
+              <w:rPr>
+                <w:rFonts w:ascii="微软雅黑" w:hAnsi="微软雅黑" w:eastAsia="微软雅黑"/>
                 <w:b w:val="0"/>
+                <w:i w:val="0"/>
                 <w:color w:val="000000"/>
                 <w:sz w:val="17"/>
+                <w:u w:val="none"/>
+              </w:rPr>
+              <w:t>排班表、检查记录</w:t>
+            </w:r>
+          </w:p>
+        </w:tc>
+        <w:tc>
+          <w:tcPr>
+            <w:tcW w:type="dxa" w:w="964"/>
+            <w:vAlign w:val="center"/>
+            <w:tcMar>
+              <w:top w:w="90" w:type="dxa"/>
+              <w:start w:w="110" w:type="dxa"/>
+              <w:bottom w:w="90" w:type="dxa"/>
+              <w:end w:w="110" w:type="dxa"/>
+            </w:tcMar>
+            <w:tcBorders>
+              <w:top w:val="single" w:sz="6" w:color="B7C9D6"/>
+              <w:left w:val="single" w:sz="6" w:color="B7C9D6"/>
+              <w:bottom w:val="single" w:sz="6" w:color="B7C9D6"/>
+              <w:right w:val="single" w:sz="6" w:color="B7C9D6"/>
+              <w:insideH w:val="single" w:sz="6" w:color="B7C9D6"/>
+              <w:insideV w:val="single" w:sz="6" w:color="B7C9D6"/>
+            </w:tcBorders>
+          </w:tcPr>
+          <w:p>
+            <w:pPr>
+              <w:pStyle w:val="行动表格文字"/>
+              <w:spacing w:before="0" w:after="0" w:line="240" w:lineRule="auto"/>
+            </w:pPr>
+            <w:r>
+              <w:rPr>
+                <w:rFonts w:ascii="微软雅黑" w:hAnsi="微软雅黑" w:eastAsia="微软雅黑"/>
+                <w:b/>
+                <w:i w:val="0"/>
+                <w:color w:val="C00000"/>
+                <w:sz w:val="17"/>
+                <w:u w:val="single"/>
+              </w:rPr>
+              <w:t>待确认</w:t>
+            </w:r>
+          </w:p>
+        </w:tc>
+      </w:tr>
+      <w:tr>
+        <w:tc>
+          <w:tcPr>
+            <w:tcW w:type="dxa" w:w="680"/>
+            <w:vAlign w:val="center"/>
+            <w:tcMar>
+              <w:top w:w="90" w:type="dxa"/>
+              <w:start w:w="110" w:type="dxa"/>
+              <w:bottom w:w="90" w:type="dxa"/>
+              <w:end w:w="110" w:type="dxa"/>
+            </w:tcMar>
+            <w:tcBorders>
+              <w:top w:val="single" w:sz="6" w:color="B7C9D6"/>
+              <w:left w:val="single" w:sz="6" w:color="B7C9D6"/>
+              <w:bottom w:val="single" w:sz="6" w:color="B7C9D6"/>
+              <w:right w:val="single" w:sz="6" w:color="B7C9D6"/>
+              <w:insideH w:val="single" w:sz="6" w:color="B7C9D6"/>
+              <w:insideV w:val="single" w:sz="6" w:color="B7C9D6"/>
+            </w:tcBorders>
+          </w:tcPr>
+          <w:p>
+            <w:pPr>
+              <w:pStyle w:val="行动表格文字"/>
+              <w:spacing w:before="0" w:after="0" w:line="240" w:lineRule="auto"/>
+            </w:pPr>
+            <w:r>
+              <w:rPr>
+                <w:rFonts w:ascii="微软雅黑" w:hAnsi="微软雅黑" w:eastAsia="微软雅黑"/>
+                <w:b w:val="0"/>
+                <w:i w:val="0"/>
+                <w:color w:val="000000"/>
+                <w:sz w:val="17"/>
+                <w:u w:val="none"/>
               </w:rPr>
               <w:t>A-09</w:t>
             </w:r>
@@ -4365,16 +4082,11 @@
             <w:r>
               <w:rPr>
                 <w:rFonts w:ascii="微软雅黑" w:hAnsi="微软雅黑" w:eastAsia="微软雅黑"/>
+                <w:b w:val="0"/>
+                <w:i w:val="0"/>
                 <w:color w:val="000000"/>
                 <w:sz w:val="17"/>
-              </w:rPr>
-            </w:r>
-            <w:r>
-              <w:rPr>
-                <w:rFonts w:ascii="微软雅黑" w:hAnsi="微软雅黑" w:eastAsia="微软雅黑"/>
-                <w:b w:val="0"/>
-                <w:color w:val="000000"/>
-                <w:sz w:val="17"/>
+                <w:u w:val="none"/>
               </w:rPr>
               <w:t>确认团建/进财神活动日期、参加范围、红包金额及发放人员。</w:t>
             </w:r>
@@ -4398,7 +4110,6 @@
               <w:insideH w:val="single" w:sz="6" w:color="B7C9D6"/>
               <w:insideV w:val="single" w:sz="6" w:color="B7C9D6"/>
             </w:tcBorders>
-            <w:shd w:fill="FFF2CC"/>
           </w:tcPr>
           <w:p>
             <w:pPr>
@@ -4421,10 +4132,9 @@
                 <w:rFonts w:ascii="微软雅黑" w:hAnsi="微软雅黑" w:eastAsia="微软雅黑"/>
                 <w:b/>
                 <w:i w:val="0"/>
-                <w:color w:val="000000"/>
+                <w:color w:val="C00000"/>
                 <w:sz w:val="17"/>
                 <w:u w:val="single"/>
-                <w:shd w:fill="FFF2CC"/>
               </w:rPr>
               <w:t>待确认</w:t>
             </w:r>
@@ -4448,7 +4158,6 @@
               <w:insideH w:val="single" w:sz="6" w:color="B7C9D6"/>
               <w:insideV w:val="single" w:sz="6" w:color="B7C9D6"/>
             </w:tcBorders>
-            <w:shd w:fill="FFF2CC"/>
           </w:tcPr>
           <w:p>
             <w:pPr>
@@ -4471,10 +4180,9 @@
                 <w:rFonts w:ascii="微软雅黑" w:hAnsi="微软雅黑" w:eastAsia="微软雅黑"/>
                 <w:b/>
                 <w:i w:val="0"/>
-                <w:color w:val="000000"/>
+                <w:color w:val="C00000"/>
                 <w:sz w:val="17"/>
                 <w:u w:val="single"/>
-                <w:shd w:fill="FFF2CC"/>
               </w:rPr>
               <w:t>待确认</w:t>
             </w:r>
@@ -4498,7 +4206,6 @@
               <w:insideH w:val="single" w:sz="6" w:color="B7C9D6"/>
               <w:insideV w:val="single" w:sz="6" w:color="B7C9D6"/>
             </w:tcBorders>
-            <w:shd w:fill="FFF2CC"/>
           </w:tcPr>
           <w:p>
             <w:pPr>
@@ -4521,10 +4228,9 @@
                 <w:rFonts w:ascii="微软雅黑" w:hAnsi="微软雅黑" w:eastAsia="微软雅黑"/>
                 <w:b/>
                 <w:i w:val="0"/>
-                <w:color w:val="000000"/>
+                <w:color w:val="C00000"/>
                 <w:sz w:val="17"/>
                 <w:u w:val="single"/>
-                <w:shd w:fill="FFF2CC"/>
               </w:rPr>
               <w:t>需复核</w:t>
             </w:r>
@@ -4557,16 +4263,11 @@
             <w:r>
               <w:rPr>
                 <w:rFonts w:ascii="微软雅黑" w:hAnsi="微软雅黑" w:eastAsia="微软雅黑"/>
+                <w:b w:val="0"/>
+                <w:i w:val="0"/>
                 <w:color w:val="000000"/>
                 <w:sz w:val="17"/>
-              </w:rPr>
-            </w:r>
-            <w:r>
-              <w:rPr>
-                <w:rFonts w:ascii="微软雅黑" w:hAnsi="微软雅黑" w:eastAsia="微软雅黑"/>
-                <w:b w:val="0"/>
-                <w:color w:val="000000"/>
-                <w:sz w:val="17"/>
+                <w:u w:val="none"/>
               </w:rPr>
               <w:t>活动通知、签到表、发放记录</w:t>
             </w:r>
@@ -4590,7 +4291,6 @@
               <w:insideH w:val="single" w:sz="6" w:color="B7C9D6"/>
               <w:insideV w:val="single" w:sz="6" w:color="B7C9D6"/>
             </w:tcBorders>
-            <w:shd w:fill="FFF2CC"/>
           </w:tcPr>
           <w:p>
             <w:pPr>
@@ -4602,10 +4302,9 @@
                 <w:rFonts w:ascii="微软雅黑" w:hAnsi="微软雅黑" w:eastAsia="微软雅黑"/>
                 <w:b/>
                 <w:i w:val="0"/>
-                <w:color w:val="000000"/>
+                <w:color w:val="C00000"/>
                 <w:sz w:val="17"/>
                 <w:u w:val="single"/>
-                <w:shd w:fill="FFF2CC"/>
               </w:rPr>
               <w:t>待确认</w:t>
             </w:r>
@@ -4626,7 +4325,6 @@
           <w:i w:val="0"/>
           <w:color w:val="17365D"/>
           <w:sz w:val="28"/>
-          <w:shd w:fill="D9EAF7"/>
         </w:rPr>
         <w:t>五、人员与组织名称核对说明</w:t>
       </w:r>
@@ -4643,6 +4341,7 @@
           <w:i w:val="0"/>
           <w:color w:val="000000"/>
           <w:sz w:val="21"/>
+          <w:u w:val="none"/>
         </w:rPr>
         <w:t>受控组织架构及职工名单中可核实的相关人员包括：王晓华（总经理，兼行政部、营运部负责人）、王勇（董事长，兼财务相关岗位；用户确认原称“小勇”指王勇）、李天友（品质部负责人，兼生产部负责人）、王珊兰（质检员，兼仓储组长及成品出货检验组长）、马金军（清洗车间负责人）、尹杰（生产计划员，兼采购员、人事员）、刘东（模具技术负责人）、王名涵（职工名单登记为模具学徒）、王秋红（职工名单登记为办公文员）。</w:t>
       </w:r>
@@ -4668,10 +4367,9 @@
           <w:rFonts w:ascii="微软雅黑" w:hAnsi="微软雅黑" w:eastAsia="微软雅黑"/>
           <w:b/>
           <w:i w:val="0"/>
-          <w:color w:val="000000"/>
+          <w:color w:val="C00000"/>
           <w:sz w:val="21"/>
           <w:u w:val="single"/>
-          <w:shd w:fill="FFF2CC"/>
         </w:rPr>
         <w:t>待确认</w:t>
       </w:r>
@@ -4691,10 +4389,9 @@
           <w:rFonts w:ascii="微软雅黑" w:hAnsi="微软雅黑" w:eastAsia="微软雅黑"/>
           <w:b/>
           <w:i w:val="0"/>
-          <w:color w:val="000000"/>
+          <w:color w:val="C00000"/>
           <w:sz w:val="21"/>
           <w:u w:val="single"/>
-          <w:shd w:fill="FFF2CC"/>
         </w:rPr>
         <w:t>待核实</w:t>
       </w:r>
@@ -4722,6 +4419,7 @@
           <w:i w:val="0"/>
           <w:color w:val="000000"/>
           <w:sz w:val="21"/>
+          <w:u w:val="none"/>
         </w:rPr>
         <w:t>“鑫隆”在本次语境中指两家公司，目前正在统一管理；“新奔、新农、青龙”等现场/组织称呼及其与两家公司的对应关系，仍需结合公司实际组织口径统一记录。</w:t>
       </w:r>
@@ -4740,7 +4438,6 @@
           <w:color w:val="000000"/>
           <w:sz w:val="21"/>
           <w:u w:val="single"/>
-          <w:shd w:fill="FFF2CC"/>
         </w:rPr>
         <w:t>六、待确认事项</w:t>
       </w:r>
@@ -4757,6 +4454,7 @@
           <w:i w:val="0"/>
           <w:color w:val="000000"/>
           <w:sz w:val="21"/>
+          <w:u w:val="none"/>
         </w:rPr>
         <w:t>着装处罚涉及的制度依据、审批权限、财务扣款流程和员工告知方式。</w:t>
       </w:r>
@@ -4773,6 +4471,7 @@
           <w:i w:val="0"/>
           <w:color w:val="000000"/>
           <w:sz w:val="21"/>
+          <w:u w:val="none"/>
         </w:rPr>
         <w:t>团体意外险的正式经办人、适用人员范围、办理节点和费用承担。</w:t>
       </w:r>
@@ -4789,6 +4488,7 @@
           <w:i w:val="0"/>
           <w:color w:val="000000"/>
           <w:sz w:val="21"/>
+          <w:u w:val="none"/>
         </w:rPr>
         <w:t>会议记录签名人员与会议记录归档位置。</w:t>
       </w:r>
@@ -4805,6 +4505,7 @@
           <w:i w:val="0"/>
           <w:color w:val="000000"/>
           <w:sz w:val="21"/>
+          <w:u w:val="none"/>
         </w:rPr>
         <w:t>电视屏采购负责人、预算、报销主体、两家公司费用分摊方式。</w:t>
       </w:r>
@@ -4821,6 +4522,7 @@
           <w:i w:val="0"/>
           <w:color w:val="000000"/>
           <w:sz w:val="21"/>
+          <w:u w:val="none"/>
         </w:rPr>
         <w:t>“进财神”活动的准确日期、红包标准、参加范围和费用审批。</w:t>
       </w:r>
@@ -4837,6 +4539,7 @@
           <w:i w:val="0"/>
           <w:color w:val="000000"/>
           <w:sz w:val="21"/>
+          <w:u w:val="none"/>
         </w:rPr>
         <w:t>各车间主管、带教人、宿舍卫生负责人及仓库盘点执行人的正式名单。</w:t>
       </w:r>
@@ -4854,7 +4557,6 @@
           <w:i w:val="0"/>
           <w:color w:val="17365D"/>
           <w:sz w:val="28"/>
-          <w:shd w:fill="D9EAF7"/>
         </w:rPr>
         <w:t>七、来源与整理信息</w:t>
       </w:r>
@@ -4871,18 +4573,9 @@
           <w:i/>
           <w:color w:val="2F75B5"/>
           <w:sz w:val="19"/>
+          <w:u w:val="none"/>
         </w:rPr>
-        <w:t>原始文件：</w:t>
-      </w:r>
-      <w:r>
-        <w:rPr>
-          <w:rFonts w:ascii="微软雅黑" w:hAnsi="微软雅黑" w:eastAsia="微软雅黑"/>
-          <w:b w:val="0"/>
-          <w:i/>
-          <w:color w:val="2F75B5"/>
-          <w:sz w:val="19"/>
-        </w:rPr>
-        <w:t>新厂搬迁安全会议部署落实工作_AI 摘要.doc</w:t>
+        <w:t>原始文件：新厂搬迁安全会议部署落实工作_AI 摘要.doc</w:t>
       </w:r>
     </w:p>
     <w:p>
@@ -4897,18 +4590,9 @@
           <w:i/>
           <w:color w:val="2F75B5"/>
           <w:sz w:val="19"/>
+          <w:u w:val="none"/>
         </w:rPr>
-        <w:t>原始文件路径：</w:t>
-      </w:r>
-      <w:r>
-        <w:rPr>
-          <w:rFonts w:ascii="微软雅黑" w:hAnsi="微软雅黑" w:eastAsia="微软雅黑"/>
-          <w:b w:val="0"/>
-          <w:i/>
-          <w:color w:val="2F75B5"/>
-          <w:sz w:val="19"/>
-        </w:rPr>
-        <w:t>C:\Users\32027\.hermes\cache\documents\doc_17acb20ea91c_新厂搬迁安全会议部署落实工作_AI 摘要.doc</w:t>
+        <w:t>原始文件路径：C:\Users\32027\.hermes\cache\documents\doc_17acb20ea91c_新厂搬迁安全会议部署落实工作_AI 摘要.doc</w:t>
       </w:r>
     </w:p>
     <w:p>
@@ -4923,18 +4607,9 @@
           <w:i/>
           <w:color w:val="2F75B5"/>
           <w:sz w:val="19"/>
+          <w:u w:val="none"/>
         </w:rPr>
-        <w:t>整理依据：</w:t>
-      </w:r>
-      <w:r>
-        <w:rPr>
-          <w:rFonts w:ascii="微软雅黑" w:hAnsi="微软雅黑" w:eastAsia="微软雅黑"/>
-          <w:b w:val="0"/>
-          <w:i/>
-          <w:color w:val="2F75B5"/>
-          <w:sz w:val="19"/>
-        </w:rPr>
-        <w:t>会议摘要文本、鑫犇电子公司组织架构与职责矩阵模板、人员主数据（仅用于姓名/岗位核对）</w:t>
+        <w:t>整理依据：会议摘要文本、鑫犇电子公司组织架构与职责矩阵模板、人员主数据（仅用于姓名/岗位核对）</w:t>
       </w:r>
     </w:p>
     <w:p>
@@ -4949,18 +4624,9 @@
           <w:i/>
           <w:color w:val="2F75B5"/>
           <w:sz w:val="19"/>
+          <w:u w:val="none"/>
         </w:rPr>
-        <w:t>整理日期：</w:t>
-      </w:r>
-      <w:r>
-        <w:rPr>
-          <w:rFonts w:ascii="微软雅黑" w:hAnsi="微软雅黑" w:eastAsia="微软雅黑"/>
-          <w:b w:val="0"/>
-          <w:i/>
-          <w:color w:val="2F75B5"/>
-          <w:sz w:val="19"/>
-        </w:rPr>
-        <w:t>2026年10月27日</w:t>
+        <w:t>整理日期：2026年10月27日</w:t>
       </w:r>
     </w:p>
     <w:p>
@@ -4975,18 +4641,9 @@
           <w:i/>
           <w:color w:val="2F75B5"/>
           <w:sz w:val="19"/>
+          <w:u w:val="none"/>
         </w:rPr>
-        <w:t>版本：</w:t>
-      </w:r>
-      <w:r>
-        <w:rPr>
-          <w:rFonts w:ascii="微软雅黑" w:hAnsi="微软雅黑" w:eastAsia="微软雅黑"/>
-          <w:b w:val="0"/>
-          <w:i/>
-          <w:color w:val="2F75B5"/>
-          <w:sz w:val="19"/>
-        </w:rPr>
-        <w:t>v0.1 整理稿；待会议主持人/管理层核对</w:t>
+        <w:t>版本：v0.1 整理稿；待会议主持人/管理层核对</w:t>
       </w:r>
     </w:p>
     <w:sectPr>

</xml_diff>

<commit_message>
vault backup: 2026-10-28 12:38:23
</commit_message>
<xml_diff>
--- a/02_Areas/工作经历/鑫犇电子有限公司/06_公司公共/会议与记录/会议记录_新厂搬迁安全会议部署落实工作_2026-10-26.docx
+++ b/02_Areas/工作经历/鑫犇电子有限公司/06_公司公共/会议与记录/会议记录_新厂搬迁安全会议部署落实工作_2026-10-26.docx
@@ -5,6 +5,7 @@
     <w:p>
       <w:pPr>
         <w:pStyle w:val="会议标题"/>
+        <w:widowControl/>
         <w:jc w:val="center"/>
       </w:pPr>
       <w:r>
@@ -21,6 +22,7 @@
     <w:p>
       <w:pPr>
         <w:pStyle w:val="会议副标题"/>
+        <w:widowControl/>
         <w:jc w:val="center"/>
       </w:pPr>
       <w:r>
@@ -48,6 +50,9 @@
         <w:gridCol w:w="2466"/>
       </w:tblGrid>
       <w:tr>
+        <w:trPr>
+          <w:cantSplit/>
+        </w:trPr>
         <w:tc>
           <w:tcPr>
             <w:tcW w:type="dxa" w:w="1417"/>
@@ -166,6 +171,9 @@
         </w:tc>
       </w:tr>
       <w:tr>
+        <w:trPr>
+          <w:cantSplit/>
+        </w:trPr>
         <w:tc>
           <w:tcPr>
             <w:tcW w:type="dxa" w:w="1417"/>
@@ -284,6 +292,9 @@
         </w:tc>
       </w:tr>
       <w:tr>
+        <w:trPr>
+          <w:cantSplit/>
+        </w:trPr>
         <w:tc>
           <w:tcPr>
             <w:tcW w:type="dxa" w:w="1417"/>
@@ -412,6 +423,9 @@
         </w:tc>
       </w:tr>
       <w:tr>
+        <w:trPr>
+          <w:cantSplit/>
+        </w:trPr>
         <w:tc>
           <w:tcPr>
             <w:tcW w:type="dxa" w:w="1417"/>
@@ -533,6 +547,7 @@
     <w:p>
       <w:pPr>
         <w:pStyle w:val="会议说明"/>
+        <w:widowControl/>
       </w:pPr>
       <w:r>
         <w:rPr>
@@ -545,7 +560,9 @@
     </w:p>
     <w:p>
       <w:pPr>
-        <w:pStyle w:val="会议一级标题"/>
+        <w:pStyle w:val="Heading1"/>
+        <w:keepNext/>
+        <w:widowControl/>
       </w:pPr>
       <w:r>
         <w:t>一、会议结论摘要</w:t>
@@ -553,7 +570,8 @@
     </w:p>
     <w:p>
       <w:pPr>
-        <w:pStyle w:val="摘要文字"/>
+        <w:keepNext w:val="0"/>
+        <w:widowControl/>
       </w:pPr>
       <w:r>
         <w:rPr>
@@ -575,7 +593,8 @@
     </w:p>
     <w:p>
       <w:pPr>
-        <w:pStyle w:val="摘要文字"/>
+        <w:keepNext w:val="0"/>
+        <w:widowControl/>
       </w:pPr>
       <w:r>
         <w:rPr>
@@ -597,7 +616,8 @@
     </w:p>
     <w:p>
       <w:pPr>
-        <w:pStyle w:val="摘要文字"/>
+        <w:keepNext w:val="0"/>
+        <w:widowControl/>
       </w:pPr>
       <w:r>
         <w:rPr>
@@ -619,7 +639,8 @@
     </w:p>
     <w:p>
       <w:pPr>
-        <w:pStyle w:val="摘要文字"/>
+        <w:keepNext w:val="0"/>
+        <w:widowControl/>
       </w:pPr>
       <w:r>
         <w:rPr>
@@ -641,7 +662,8 @@
     </w:p>
     <w:p>
       <w:pPr>
-        <w:pStyle w:val="摘要文字"/>
+        <w:keepNext w:val="0"/>
+        <w:widowControl/>
       </w:pPr>
       <w:r>
         <w:rPr>
@@ -680,7 +702,8 @@
     </w:p>
     <w:p>
       <w:pPr>
-        <w:pStyle w:val="摘要文字"/>
+        <w:keepNext w:val="0"/>
+        <w:widowControl/>
       </w:pPr>
       <w:r>
         <w:rPr>
@@ -702,7 +725,9 @@
     </w:p>
     <w:p>
       <w:pPr>
-        <w:pStyle w:val="会议一级标题"/>
+        <w:pStyle w:val="Heading1"/>
+        <w:keepNext/>
+        <w:widowControl/>
       </w:pPr>
       <w:r>
         <w:t>二、讨论与事实</w:t>
@@ -710,15 +735,18 @@
     </w:p>
     <w:p>
       <w:pPr>
-        <w:pStyle w:val="会议二级标题"/>
+        <w:pStyle w:val="Heading2"/>
+        <w:keepNext/>
+        <w:widowControl/>
       </w:pPr>
       <w:r>
-        <w:t>1. 安全生产与隐患排查</w:t>
+        <w:t>1. （安全生产与隐患排查_生产部）</w:t>
       </w:r>
     </w:p>
     <w:p>
       <w:pPr>
         <w:pStyle w:val="会议正文"/>
+        <w:widowControl/>
       </w:pPr>
       <w:r>
         <w:rPr>
@@ -732,6 +760,7 @@
     <w:p>
       <w:pPr>
         <w:pStyle w:val="会议正文"/>
+        <w:widowControl/>
       </w:pPr>
       <w:r>
         <w:rPr>
@@ -762,6 +791,7 @@
     <w:p>
       <w:pPr>
         <w:pStyle w:val="会议正文"/>
+        <w:widowControl/>
       </w:pPr>
       <w:r>
         <w:rPr>
@@ -775,6 +805,7 @@
     <w:p>
       <w:pPr>
         <w:pStyle w:val="会议正文"/>
+        <w:widowControl/>
       </w:pPr>
       <w:r>
         <w:rPr>
@@ -787,15 +818,18 @@
     </w:p>
     <w:p>
       <w:pPr>
-        <w:pStyle w:val="会议二级标题"/>
+        <w:pStyle w:val="Heading2"/>
+        <w:keepNext/>
+        <w:widowControl/>
       </w:pPr>
       <w:r>
-        <w:t>2. 新员工培训与保险</w:t>
+        <w:t>2. （新员工培训与保险_行政部、生产部）</w:t>
       </w:r>
     </w:p>
     <w:p>
       <w:pPr>
         <w:pStyle w:val="会议正文"/>
+        <w:widowControl/>
       </w:pPr>
       <w:r>
         <w:rPr>
@@ -826,6 +860,7 @@
     <w:p>
       <w:pPr>
         <w:pStyle w:val="会议正文"/>
+        <w:widowControl/>
       </w:pPr>
       <w:r>
         <w:rPr>
@@ -839,6 +874,7 @@
     <w:p>
       <w:pPr>
         <w:pStyle w:val="会议正文"/>
+        <w:widowControl/>
       </w:pPr>
       <w:r>
         <w:rPr>
@@ -852,6 +888,7 @@
     <w:p>
       <w:pPr>
         <w:pStyle w:val="会议正文"/>
+        <w:widowControl/>
       </w:pPr>
       <w:r>
         <w:rPr>
@@ -864,15 +901,18 @@
     </w:p>
     <w:p>
       <w:pPr>
-        <w:pStyle w:val="会议二级标题"/>
+        <w:pStyle w:val="Heading2"/>
+        <w:keepNext/>
+        <w:widowControl/>
       </w:pPr>
       <w:r>
-        <w:t>3. 着装、后勤与现场秩序</w:t>
+        <w:t>3. （着装、后勤与现场秩序_行政部、生产部）</w:t>
       </w:r>
     </w:p>
     <w:p>
       <w:pPr>
         <w:pStyle w:val="会议正文"/>
+        <w:widowControl/>
       </w:pPr>
       <w:r>
         <w:rPr>
@@ -886,6 +926,7 @@
     <w:p>
       <w:pPr>
         <w:pStyle w:val="会议正文"/>
+        <w:widowControl/>
       </w:pPr>
       <w:r>
         <w:rPr>
@@ -899,6 +940,7 @@
     <w:p>
       <w:pPr>
         <w:pStyle w:val="会议正文"/>
+        <w:widowControl/>
       </w:pPr>
       <w:r>
         <w:rPr>
@@ -912,6 +954,7 @@
     <w:p>
       <w:pPr>
         <w:pStyle w:val="会议正文"/>
+        <w:widowControl/>
       </w:pPr>
       <w:r>
         <w:rPr>
@@ -924,15 +967,18 @@
     </w:p>
     <w:p>
       <w:pPr>
-        <w:pStyle w:val="会议二级标题"/>
+        <w:pStyle w:val="Heading2"/>
+        <w:keepNext/>
+        <w:widowControl/>
       </w:pPr>
       <w:r>
-        <w:t>4. 仓库、模具与成本改善</w:t>
+        <w:t>4. （仓库、模具与成本改善_营运部、生产部、工程技术组）</w:t>
       </w:r>
     </w:p>
     <w:p>
       <w:pPr>
         <w:pStyle w:val="会议正文"/>
+        <w:widowControl/>
       </w:pPr>
       <w:r>
         <w:rPr>
@@ -946,6 +992,7 @@
     <w:p>
       <w:pPr>
         <w:pStyle w:val="会议正文"/>
+        <w:widowControl/>
       </w:pPr>
       <w:r>
         <w:rPr>
@@ -959,6 +1006,7 @@
     <w:p>
       <w:pPr>
         <w:pStyle w:val="会议正文"/>
+        <w:widowControl/>
       </w:pPr>
       <w:r>
         <w:rPr>
@@ -972,6 +1020,7 @@
     <w:p>
       <w:pPr>
         <w:pStyle w:val="会议正文"/>
+        <w:widowControl/>
       </w:pPr>
       <w:r>
         <w:rPr>
@@ -984,15 +1033,18 @@
     </w:p>
     <w:p>
       <w:pPr>
-        <w:pStyle w:val="会议二级标题"/>
+        <w:pStyle w:val="Heading2"/>
+        <w:keepNext/>
+        <w:widowControl/>
       </w:pPr>
       <w:r>
-        <w:t>5. 会议记录与形象提升</w:t>
+        <w:t>5. （会议记录与形象提升_行政部）</w:t>
       </w:r>
     </w:p>
     <w:p>
       <w:pPr>
         <w:pStyle w:val="会议正文"/>
+        <w:widowControl/>
       </w:pPr>
       <w:r>
         <w:rPr>
@@ -1006,6 +1058,7 @@
     <w:p>
       <w:pPr>
         <w:pStyle w:val="会议正文"/>
+        <w:widowControl/>
       </w:pPr>
       <w:r>
         <w:rPr>
@@ -1019,6 +1072,7 @@
     <w:p>
       <w:pPr>
         <w:pStyle w:val="会议正文"/>
+        <w:widowControl/>
       </w:pPr>
       <w:r>
         <w:rPr>
@@ -1031,15 +1085,18 @@
     </w:p>
     <w:p>
       <w:pPr>
-        <w:pStyle w:val="会议二级标题"/>
+        <w:pStyle w:val="Heading2"/>
+        <w:keepNext/>
+        <w:widowControl/>
       </w:pPr>
       <w:r>
-        <w:t>6. 团建活动</w:t>
+        <w:t>6. （团建活动_行政部）</w:t>
       </w:r>
     </w:p>
     <w:p>
       <w:pPr>
         <w:pStyle w:val="会议正文"/>
+        <w:widowControl/>
       </w:pPr>
       <w:r>
         <w:rPr>
@@ -1052,7 +1109,10 @@
     </w:p>
     <w:p>
       <w:pPr>
-        <w:pStyle w:val="会议一级标题"/>
+        <w:pStyle w:val="Heading1"/>
+        <w:keepNext/>
+        <w:pageBreakBefore/>
+        <w:widowControl/>
       </w:pPr>
       <w:r>
         <w:t>三、行动事项</w:t>
@@ -1061,6 +1121,7 @@
     <w:p>
       <w:pPr>
         <w:pStyle w:val="会议说明"/>
+        <w:widowControl/>
       </w:pPr>
       <w:r>
         <w:rPr>
@@ -1105,6 +1166,10 @@
         <w:gridCol w:w="1644"/>
       </w:tblGrid>
       <w:tr>
+        <w:trPr>
+          <w:cantSplit/>
+          <w:tblHeader w:val="true"/>
+        </w:trPr>
         <w:tc>
           <w:tcPr>
             <w:tcW w:type="dxa" w:w="624"/>
@@ -1281,6 +1346,9 @@
         </w:tc>
       </w:tr>
       <w:tr>
+        <w:trPr>
+          <w:cantSplit/>
+        </w:trPr>
         <w:tc>
           <w:tcPr>
             <w:tcW w:type="dxa" w:w="624"/>
@@ -1355,26 +1423,21 @@
           <w:p>
             <w:pPr>
               <w:pStyle w:val="行动表格文字"/>
+              <w:keepLines/>
+              <w:spacing w:after="0"/>
             </w:pPr>
-            <w:r/>
             <w:r>
-              <w:rPr>
-                <w:rFonts w:ascii="微软雅黑" w:hAnsi="微软雅黑" w:eastAsia="微软雅黑"/>
-                <w:b w:val="0"/>
-                <w:color w:val="000000"/>
-                <w:sz w:val="16"/>
-              </w:rPr>
-              <w:t>各车间主管；结果责任：生产部负责人：李天友；具体主管</w:t>
+              <w:t>生产部:李天友（结果责任人）</w:t>
             </w:r>
+          </w:p>
+          <w:p>
+            <w:pPr>
+              <w:pStyle w:val="行动表格文字"/>
+              <w:keepLines/>
+              <w:spacing w:after="0"/>
+            </w:pPr>
             <w:r>
-              <w:rPr>
-                <w:rFonts w:ascii="微软雅黑" w:hAnsi="微软雅黑" w:eastAsia="微软雅黑"/>
-                <w:b/>
-                <w:color w:val="C00000"/>
-                <w:sz w:val="16"/>
-                <w:u w:val="single"/>
-              </w:rPr>
-              <w:t>待确认</w:t>
+              <w:t>生产部:车间主管待确认</w:t>
             </w:r>
           </w:p>
         </w:tc>
@@ -1467,6 +1530,9 @@
         </w:tc>
       </w:tr>
       <w:tr>
+        <w:trPr>
+          <w:cantSplit/>
+        </w:trPr>
         <w:tc>
           <w:tcPr>
             <w:tcW w:type="dxa" w:w="624"/>
@@ -1541,26 +1607,21 @@
           <w:p>
             <w:pPr>
               <w:pStyle w:val="行动表格文字"/>
+              <w:keepLines/>
+              <w:spacing w:after="0"/>
             </w:pPr>
-            <w:r/>
             <w:r>
-              <w:rPr>
-                <w:rFonts w:ascii="微软雅黑" w:hAnsi="微软雅黑" w:eastAsia="微软雅黑"/>
-                <w:b w:val="0"/>
-                <w:color w:val="000000"/>
-                <w:sz w:val="16"/>
-              </w:rPr>
-              <w:t>各班组组长；结果责任：行政部负责人/总经理：王晓华；权限边界</w:t>
+              <w:t>行政部:王晓华（结果责任人，权限边界待确认）</w:t>
             </w:r>
+          </w:p>
+          <w:p>
+            <w:pPr>
+              <w:pStyle w:val="行动表格文字"/>
+              <w:keepLines/>
+              <w:spacing w:after="0"/>
+            </w:pPr>
             <w:r>
-              <w:rPr>
-                <w:rFonts w:ascii="微软雅黑" w:hAnsi="微软雅黑" w:eastAsia="微软雅黑"/>
-                <w:b/>
-                <w:color w:val="C00000"/>
-                <w:sz w:val="16"/>
-                <w:u w:val="single"/>
-              </w:rPr>
-              <w:t>待确认</w:t>
+              <w:t>生产部:班组组长待确认</w:t>
             </w:r>
           </w:p>
         </w:tc>
@@ -1654,6 +1715,9 @@
         </w:tc>
       </w:tr>
       <w:tr>
+        <w:trPr>
+          <w:cantSplit/>
+        </w:trPr>
         <w:tc>
           <w:tcPr>
             <w:tcW w:type="dxa" w:w="624"/>
@@ -1728,26 +1792,21 @@
           <w:p>
             <w:pPr>
               <w:pStyle w:val="行动表格文字"/>
+              <w:keepLines/>
+              <w:spacing w:after="0"/>
             </w:pPr>
-            <w:r/>
             <w:r>
-              <w:rPr>
-                <w:rFonts w:ascii="微软雅黑" w:hAnsi="微软雅黑" w:eastAsia="微软雅黑"/>
-                <w:b w:val="0"/>
-                <w:color w:val="000000"/>
-                <w:sz w:val="16"/>
-              </w:rPr>
-              <w:t>各部门指定带教人；结果责任：行政部/人事与用人部门负责人；具体人员</w:t>
+              <w:t>行政部:人事负责人待确认</w:t>
             </w:r>
+          </w:p>
+          <w:p>
+            <w:pPr>
+              <w:pStyle w:val="行动表格文字"/>
+              <w:keepLines/>
+              <w:spacing w:after="0"/>
+            </w:pPr>
             <w:r>
-              <w:rPr>
-                <w:rFonts w:ascii="微软雅黑" w:hAnsi="微软雅黑" w:eastAsia="微软雅黑"/>
-                <w:b/>
-                <w:color w:val="C00000"/>
-                <w:sz w:val="16"/>
-                <w:u w:val="single"/>
-              </w:rPr>
-              <w:t>待确认</w:t>
+              <w:t>用人部门:带教人待确认</w:t>
             </w:r>
           </w:p>
         </w:tc>
@@ -1840,6 +1899,9 @@
         </w:tc>
       </w:tr>
       <w:tr>
+        <w:trPr>
+          <w:cantSplit/>
+        </w:trPr>
         <w:tc>
           <w:tcPr>
             <w:tcW w:type="dxa" w:w="624"/>
@@ -1914,64 +1976,31 @@
           <w:p>
             <w:pPr>
               <w:pStyle w:val="行动表格文字"/>
+              <w:keepLines/>
+              <w:spacing w:after="0"/>
             </w:pPr>
-            <w:r/>
             <w:r>
-              <w:rPr>
-                <w:rFonts w:ascii="微软雅黑" w:hAnsi="微软雅黑" w:eastAsia="微软雅黑"/>
-                <w:b w:val="0"/>
-                <w:color w:val="000000"/>
-                <w:sz w:val="16"/>
-              </w:rPr>
-              <w:t>经办人</w:t>
+              <w:t>行政部:经办人待确认</w:t>
             </w:r>
+          </w:p>
+          <w:p>
+            <w:pPr>
+              <w:pStyle w:val="行动表格文字"/>
+              <w:keepLines/>
+              <w:spacing w:after="0"/>
+            </w:pPr>
             <w:r>
-              <w:rPr>
-                <w:rFonts w:ascii="微软雅黑" w:hAnsi="微软雅黑" w:eastAsia="微软雅黑"/>
-                <w:b/>
-                <w:color w:val="C00000"/>
-                <w:sz w:val="16"/>
-                <w:u w:val="single"/>
-              </w:rPr>
-              <w:t>待确认</w:t>
+              <w:t>部门待确认:王秋红（候选姓名，待核实）</w:t>
             </w:r>
+          </w:p>
+          <w:p>
+            <w:pPr>
+              <w:pStyle w:val="行动表格文字"/>
+              <w:keepLines/>
+              <w:spacing w:after="0"/>
+            </w:pPr>
             <w:r>
-              <w:rPr>
-                <w:rFonts w:ascii="微软雅黑" w:hAnsi="微软雅黑" w:eastAsia="微软雅黑"/>
-                <w:b w:val="0"/>
-                <w:color w:val="000000"/>
-                <w:sz w:val="16"/>
-              </w:rPr>
-              <w:t>；原摘要中的“王秀红”暂校为王秋红，另列魏国</w:t>
-            </w:r>
-            <w:r>
-              <w:rPr>
-                <w:rFonts w:ascii="微软雅黑" w:hAnsi="微软雅黑" w:eastAsia="微软雅黑"/>
-                <w:b/>
-                <w:color w:val="C00000"/>
-                <w:sz w:val="16"/>
-                <w:u w:val="single"/>
-              </w:rPr>
-              <w:t>待核实</w:t>
-            </w:r>
-            <w:r>
-              <w:rPr>
-                <w:rFonts w:ascii="微软雅黑" w:hAnsi="微软雅黑" w:eastAsia="微软雅黑"/>
-                <w:b w:val="0"/>
-                <w:color w:val="000000"/>
-                <w:sz w:val="16"/>
-              </w:rPr>
-              <w:t>；结果责任：行政部/人事；具体经办人及鑫隆两家公司间的分工</w:t>
-            </w:r>
-            <w:r>
-              <w:rPr>
-                <w:rFonts w:ascii="微软雅黑" w:hAnsi="微软雅黑" w:eastAsia="微软雅黑"/>
-                <w:b/>
-                <w:color w:val="C00000"/>
-                <w:sz w:val="16"/>
-                <w:u w:val="single"/>
-              </w:rPr>
-              <w:t>待确认</w:t>
+              <w:t>部门待确认:魏国（身份及部门待核实）</w:t>
             </w:r>
           </w:p>
         </w:tc>
@@ -2065,6 +2094,9 @@
         </w:tc>
       </w:tr>
       <w:tr>
+        <w:trPr>
+          <w:cantSplit/>
+        </w:trPr>
         <w:tc>
           <w:tcPr>
             <w:tcW w:type="dxa" w:w="624"/>
@@ -2139,35 +2171,31 @@
           <w:p>
             <w:pPr>
               <w:pStyle w:val="行动表格文字"/>
+              <w:keepLines/>
+              <w:spacing w:after="0"/>
             </w:pPr>
-            <w:r/>
             <w:r>
-              <w:rPr>
-                <w:rFonts w:ascii="微软雅黑" w:hAnsi="微软雅黑" w:eastAsia="微软雅黑"/>
-                <w:b w:val="0"/>
-                <w:color w:val="000000"/>
-                <w:sz w:val="16"/>
-              </w:rPr>
-              <w:t>仓储组：王珊兰；具体执行人员</w:t>
+              <w:t>仓储组:王珊兰</w:t>
             </w:r>
+          </w:p>
+          <w:p>
+            <w:pPr>
+              <w:pStyle w:val="行动表格文字"/>
+              <w:keepLines/>
+              <w:spacing w:after="0"/>
+            </w:pPr>
             <w:r>
-              <w:rPr>
-                <w:rFonts w:ascii="微软雅黑" w:hAnsi="微软雅黑" w:eastAsia="微软雅黑"/>
-                <w:b/>
-                <w:color w:val="C00000"/>
-                <w:sz w:val="16"/>
-                <w:u w:val="single"/>
-              </w:rPr>
-              <w:t>待确认</w:t>
+              <w:t>仓储组:具体执行人待确认</w:t>
             </w:r>
+          </w:p>
+          <w:p>
+            <w:pPr>
+              <w:pStyle w:val="行动表格文字"/>
+              <w:keepLines/>
+              <w:spacing w:after="0"/>
+            </w:pPr>
             <w:r>
-              <w:rPr>
-                <w:rFonts w:ascii="微软雅黑" w:hAnsi="微软雅黑" w:eastAsia="微软雅黑"/>
-                <w:b w:val="0"/>
-                <w:color w:val="000000"/>
-                <w:sz w:val="16"/>
-              </w:rPr>
-              <w:t>；结果责任：营运部负责人：王晓华</w:t>
+              <w:t>营运部:王晓华（结果责任人）</w:t>
             </w:r>
           </w:p>
         </w:tc>
@@ -2261,6 +2289,9 @@
         </w:tc>
       </w:tr>
       <w:tr>
+        <w:trPr>
+          <w:cantSplit/>
+        </w:trPr>
         <w:tc>
           <w:tcPr>
             <w:tcW w:type="dxa" w:w="624"/>
@@ -2335,35 +2366,31 @@
           <w:p>
             <w:pPr>
               <w:pStyle w:val="行动表格文字"/>
+              <w:keepLines/>
+              <w:spacing w:after="0"/>
             </w:pPr>
-            <w:r/>
             <w:r>
-              <w:rPr>
-                <w:rFonts w:ascii="微软雅黑" w:hAnsi="微软雅黑" w:eastAsia="微软雅黑"/>
-                <w:b w:val="0"/>
-                <w:color w:val="000000"/>
-                <w:sz w:val="16"/>
-              </w:rPr>
-              <w:t>会议记录人</w:t>
+              <w:t>行政部:会议记录人待确认</w:t>
             </w:r>
+          </w:p>
+          <w:p>
+            <w:pPr>
+              <w:pStyle w:val="行动表格文字"/>
+              <w:keepLines/>
+              <w:spacing w:after="0"/>
+            </w:pPr>
             <w:r>
-              <w:rPr>
-                <w:rFonts w:ascii="微软雅黑" w:hAnsi="微软雅黑" w:eastAsia="微软雅黑"/>
-                <w:b/>
-                <w:color w:val="C00000"/>
-                <w:sz w:val="16"/>
-                <w:u w:val="single"/>
-              </w:rPr>
-              <w:t>待确认</w:t>
+              <w:t>模具学徒:王名涵（是否承担记录待确认）</w:t>
             </w:r>
+          </w:p>
+          <w:p>
+            <w:pPr>
+              <w:pStyle w:val="行动表格文字"/>
+              <w:keepLines/>
+              <w:spacing w:after="0"/>
+            </w:pPr>
             <w:r>
-              <w:rPr>
-                <w:rFonts w:ascii="微软雅黑" w:hAnsi="微软雅黑" w:eastAsia="微软雅黑"/>
-                <w:b w:val="0"/>
-                <w:color w:val="000000"/>
-                <w:sz w:val="16"/>
-              </w:rPr>
-              <w:t>；原摘要提到王名涵（职工名单：模具学徒），是否由其承担会议记录需确认；结果责任：总经理：王晓华</w:t>
+              <w:t>行政部:王晓华（结果责任人）</w:t>
             </w:r>
           </w:p>
         </w:tc>
@@ -2457,6 +2484,9 @@
         </w:tc>
       </w:tr>
       <w:tr>
+        <w:trPr>
+          <w:cantSplit/>
+        </w:trPr>
         <w:tc>
           <w:tcPr>
             <w:tcW w:type="dxa" w:w="624"/>
@@ -2531,54 +2561,41 @@
           <w:p>
             <w:pPr>
               <w:pStyle w:val="行动表格文字"/>
+              <w:keepLines/>
+              <w:spacing w:after="0"/>
             </w:pPr>
-            <w:r/>
             <w:r>
-              <w:rPr>
-                <w:rFonts w:ascii="微软雅黑" w:hAnsi="微软雅黑" w:eastAsia="微软雅黑"/>
-                <w:b w:val="0"/>
-                <w:color w:val="000000"/>
-                <w:sz w:val="16"/>
-              </w:rPr>
-              <w:t>采购协同人</w:t>
+              <w:t>部门待确认:采购协同人待确认</w:t>
             </w:r>
+          </w:p>
+          <w:p>
+            <w:pPr>
+              <w:pStyle w:val="行动表格文字"/>
+              <w:keepLines/>
+              <w:spacing w:after="0"/>
+            </w:pPr>
             <w:r>
-              <w:rPr>
-                <w:rFonts w:ascii="微软雅黑" w:hAnsi="微软雅黑" w:eastAsia="微软雅黑"/>
-                <w:b/>
-                <w:color w:val="C00000"/>
-                <w:sz w:val="16"/>
-                <w:u w:val="single"/>
-              </w:rPr>
-              <w:t>待确认</w:t>
+              <w:t>行政部:王晓华（结果责任人，审批关系待确认）</w:t>
             </w:r>
+          </w:p>
+          <w:p>
+            <w:pPr>
+              <w:pStyle w:val="行动表格文字"/>
+              <w:keepLines/>
+              <w:spacing w:after="0"/>
+            </w:pPr>
             <w:r>
-              <w:rPr>
-                <w:rFonts w:ascii="微软雅黑" w:hAnsi="微软雅黑" w:eastAsia="微软雅黑"/>
-                <w:b w:val="0"/>
-                <w:color w:val="000000"/>
-                <w:sz w:val="16"/>
-              </w:rPr>
-              <w:t>；原摘要相关姓名均未核实；结果责任：总经理/财务审批关系</w:t>
+              <w:t>财务部:审批人待确认</w:t>
             </w:r>
+          </w:p>
+          <w:p>
+            <w:pPr>
+              <w:pStyle w:val="行动表格文字"/>
+              <w:keepLines/>
+              <w:spacing w:after="0"/>
+            </w:pPr>
             <w:r>
-              <w:rPr>
-                <w:rFonts w:ascii="微软雅黑" w:hAnsi="微软雅黑" w:eastAsia="微软雅黑"/>
-                <w:b/>
-                <w:color w:val="C00000"/>
-                <w:sz w:val="16"/>
-                <w:u w:val="single"/>
-              </w:rPr>
-              <w:t>待确认</w:t>
-            </w:r>
-            <w:r>
-              <w:rPr>
-                <w:rFonts w:ascii="微软雅黑" w:hAnsi="微软雅黑" w:eastAsia="微软雅黑"/>
-                <w:b w:val="0"/>
-                <w:color w:val="000000"/>
-                <w:sz w:val="16"/>
-              </w:rPr>
-              <w:t>；董事长王勇涉及财务权限</w:t>
+              <w:t>财务相关:王勇（具体权限待确认）</w:t>
             </w:r>
           </w:p>
         </w:tc>
@@ -2673,6 +2690,9 @@
         </w:tc>
       </w:tr>
       <w:tr>
+        <w:trPr>
+          <w:cantSplit/>
+        </w:trPr>
         <w:tc>
           <w:tcPr>
             <w:tcW w:type="dxa" w:w="624"/>
@@ -2747,26 +2767,31 @@
           <w:p>
             <w:pPr>
               <w:pStyle w:val="行动表格文字"/>
+              <w:keepLines/>
+              <w:spacing w:after="0"/>
             </w:pPr>
-            <w:r/>
             <w:r>
-              <w:rPr>
-                <w:rFonts w:ascii="微软雅黑" w:hAnsi="微软雅黑" w:eastAsia="微软雅黑"/>
-                <w:b w:val="0"/>
-                <w:color w:val="000000"/>
-                <w:sz w:val="16"/>
-              </w:rPr>
-              <w:t>后勤组；原摘要提到“小勇”，按用户确认更正为王勇；结果责任：行政部/后勤负责人；授权关系</w:t>
+              <w:t>后勤组:执行人待确认</w:t>
             </w:r>
+          </w:p>
+          <w:p>
+            <w:pPr>
+              <w:pStyle w:val="行动表格文字"/>
+              <w:keepLines/>
+              <w:spacing w:after="0"/>
+            </w:pPr>
             <w:r>
-              <w:rPr>
-                <w:rFonts w:ascii="微软雅黑" w:hAnsi="微软雅黑" w:eastAsia="微软雅黑"/>
-                <w:b/>
-                <w:color w:val="C00000"/>
-                <w:sz w:val="16"/>
-                <w:u w:val="single"/>
-              </w:rPr>
-              <w:t>待确认</w:t>
+              <w:t>后勤相关:王勇（协同，授权关系待确认）</w:t>
+            </w:r>
+          </w:p>
+          <w:p>
+            <w:pPr>
+              <w:pStyle w:val="行动表格文字"/>
+              <w:keepLines/>
+              <w:spacing w:after="0"/>
+            </w:pPr>
+            <w:r>
+              <w:t>行政部:负责人待确认</w:t>
             </w:r>
           </w:p>
         </w:tc>
@@ -2861,6 +2886,9 @@
         </w:tc>
       </w:tr>
       <w:tr>
+        <w:trPr>
+          <w:cantSplit/>
+        </w:trPr>
         <w:tc>
           <w:tcPr>
             <w:tcW w:type="dxa" w:w="624"/>
@@ -2935,45 +2963,31 @@
           <w:p>
             <w:pPr>
               <w:pStyle w:val="行动表格文字"/>
+              <w:keepLines/>
+              <w:spacing w:after="0"/>
             </w:pPr>
-            <w:r/>
             <w:r>
-              <w:rPr>
-                <w:rFonts w:ascii="微软雅黑" w:hAnsi="微软雅黑" w:eastAsia="微软雅黑"/>
-                <w:b w:val="0"/>
-                <w:color w:val="000000"/>
-                <w:sz w:val="16"/>
-              </w:rPr>
-              <w:t>活动组织人</w:t>
+              <w:t>行政部:活动组织人待确认</w:t>
             </w:r>
+          </w:p>
+          <w:p>
+            <w:pPr>
+              <w:pStyle w:val="行动表格文字"/>
+              <w:keepLines/>
+              <w:spacing w:after="0"/>
+            </w:pPr>
             <w:r>
-              <w:rPr>
-                <w:rFonts w:ascii="微软雅黑" w:hAnsi="微软雅黑" w:eastAsia="微软雅黑"/>
-                <w:b/>
-                <w:color w:val="C00000"/>
-                <w:sz w:val="16"/>
-                <w:u w:val="single"/>
-              </w:rPr>
-              <w:t>待确认</w:t>
+              <w:t>行政部:王晓华（结果责任人）</w:t>
             </w:r>
+          </w:p>
+          <w:p>
+            <w:pPr>
+              <w:pStyle w:val="行动表格文字"/>
+              <w:keepLines/>
+              <w:spacing w:after="0"/>
+            </w:pPr>
             <w:r>
-              <w:rPr>
-                <w:rFonts w:ascii="微软雅黑" w:hAnsi="微软雅黑" w:eastAsia="微软雅黑"/>
-                <w:b w:val="0"/>
-                <w:color w:val="000000"/>
-                <w:sz w:val="16"/>
-              </w:rPr>
-              <w:t>；结果责任：总经理：王晓华；费用审批关系</w:t>
-            </w:r>
-            <w:r>
-              <w:rPr>
-                <w:rFonts w:ascii="微软雅黑" w:hAnsi="微软雅黑" w:eastAsia="微软雅黑"/>
-                <w:b/>
-                <w:color w:val="C00000"/>
-                <w:sz w:val="16"/>
-                <w:u w:val="single"/>
-              </w:rPr>
-              <w:t>待确认</w:t>
+              <w:t>财务部:费用审批人待确认</w:t>
             </w:r>
           </w:p>
         </w:tc>
@@ -3079,7 +3093,9 @@
     </w:tbl>
     <w:p>
       <w:pPr>
-        <w:pStyle w:val="会议一级标题"/>
+        <w:pStyle w:val="Heading1"/>
+        <w:keepNext/>
+        <w:widowControl/>
       </w:pPr>
       <w:r>
         <w:t>四、待确认事项</w:t>
@@ -3088,6 +3104,7 @@
     <w:p>
       <w:pPr>
         <w:pStyle w:val="会议正文"/>
+        <w:widowControl/>
       </w:pPr>
       <w:r>
         <w:rPr>
@@ -3101,6 +3118,7 @@
     <w:p>
       <w:pPr>
         <w:pStyle w:val="会议正文"/>
+        <w:widowControl/>
       </w:pPr>
       <w:r>
         <w:rPr>
@@ -3114,6 +3132,7 @@
     <w:p>
       <w:pPr>
         <w:pStyle w:val="会议正文"/>
+        <w:widowControl/>
       </w:pPr>
       <w:r>
         <w:rPr>
@@ -3127,6 +3146,7 @@
     <w:p>
       <w:pPr>
         <w:pStyle w:val="会议正文"/>
+        <w:widowControl/>
       </w:pPr>
       <w:r>
         <w:rPr>
@@ -3140,6 +3160,7 @@
     <w:p>
       <w:pPr>
         <w:pStyle w:val="会议正文"/>
+        <w:widowControl/>
       </w:pPr>
       <w:r>
         <w:rPr>
@@ -3153,6 +3174,7 @@
     <w:p>
       <w:pPr>
         <w:pStyle w:val="会议正文"/>
+        <w:widowControl/>
       </w:pPr>
       <w:r>
         <w:rPr>
@@ -3165,7 +3187,9 @@
     </w:p>
     <w:p>
       <w:pPr>
-        <w:pStyle w:val="会议一级标题"/>
+        <w:pStyle w:val="Heading1"/>
+        <w:keepNext/>
+        <w:widowControl/>
       </w:pPr>
       <w:r>
         <w:t>五、人员与组织名称核对</w:t>
@@ -3174,6 +3198,7 @@
     <w:p>
       <w:pPr>
         <w:pStyle w:val="会议正文"/>
+        <w:widowControl/>
       </w:pPr>
       <w:r>
         <w:rPr>
@@ -3187,6 +3212,7 @@
     <w:p>
       <w:pPr>
         <w:pStyle w:val="会议正文"/>
+        <w:widowControl/>
       </w:pPr>
       <w:r>
         <w:rPr>
@@ -3236,6 +3262,7 @@
     <w:p>
       <w:pPr>
         <w:pStyle w:val="会议正文"/>
+        <w:widowControl/>
       </w:pPr>
       <w:r>
         <w:rPr>
@@ -3248,7 +3275,9 @@
     </w:p>
     <w:p>
       <w:pPr>
-        <w:pStyle w:val="会议一级标题"/>
+        <w:pStyle w:val="Heading1"/>
+        <w:keepNext/>
+        <w:widowControl/>
       </w:pPr>
       <w:r>
         <w:t>六、来源与整理信息</w:t>
@@ -3257,6 +3286,7 @@
     <w:p>
       <w:pPr>
         <w:pStyle w:val="会议说明"/>
+        <w:widowControl/>
       </w:pPr>
       <w:r>
         <w:rPr>
@@ -3271,6 +3301,7 @@
     <w:p>
       <w:pPr>
         <w:pStyle w:val="会议说明"/>
+        <w:widowControl/>
       </w:pPr>
       <w:r>
         <w:rPr>
@@ -3285,6 +3316,7 @@
     <w:p>
       <w:pPr>
         <w:pStyle w:val="会议说明"/>
+        <w:widowControl/>
       </w:pPr>
       <w:r>
         <w:rPr>
@@ -3299,29 +3331,10 @@
     <w:p>
       <w:pPr>
         <w:pStyle w:val="会议说明"/>
+        <w:widowControl/>
       </w:pPr>
       <w:r>
-        <w:rPr>
-          <w:rFonts w:ascii="微软雅黑" w:hAnsi="微软雅黑" w:eastAsia="微软雅黑"/>
-          <w:i/>
-          <w:color w:val="2F75B5"/>
-          <w:sz w:val="19"/>
-        </w:rPr>
-        <w:t>整理日期：2026年10月27日</w:t>
-      </w:r>
-    </w:p>
-    <w:p>
-      <w:pPr>
-        <w:pStyle w:val="会议说明"/>
-      </w:pPr>
-      <w:r>
-        <w:rPr>
-          <w:rFonts w:ascii="微软雅黑" w:hAnsi="微软雅黑" w:eastAsia="微软雅黑"/>
-          <w:i/>
-          <w:color w:val="2F75B5"/>
-          <w:sz w:val="19"/>
-        </w:rPr>
-        <w:t>版本：v0.1 整理稿；待会议主持人/管理层核对</w:t>
+        <w:t>整理日期：2026年10月27日｜版本：v0.2 整理稿；待会议主持人/管理层核对</w:t>
       </w:r>
     </w:p>
     <w:sectPr>

</xml_diff>

<commit_message>
vault backup: 2026-10-28 12:46:34
</commit_message>
<xml_diff>
--- a/02_Areas/工作经历/鑫犇电子有限公司/06_公司公共/会议与记录/会议记录_新厂搬迁安全会议部署落实工作_2026-10-26.docx
+++ b/02_Areas/工作经历/鑫犇电子有限公司/06_公司公共/会议与记录/会议记录_新厂搬迁安全会议部署落实工作_2026-10-26.docx
@@ -740,7 +740,7 @@
         <w:widowControl/>
       </w:pPr>
       <w:r>
-        <w:t>1. （安全生产与隐患排查_生产部）</w:t>
+        <w:t>1. 安全生产与隐患排查_生产部</w:t>
       </w:r>
     </w:p>
     <w:p>
@@ -823,7 +823,7 @@
         <w:widowControl/>
       </w:pPr>
       <w:r>
-        <w:t>2. （新员工培训与保险_行政部、生产部）</w:t>
+        <w:t>2. 新员工培训与保险_行政部、生产部</w:t>
       </w:r>
     </w:p>
     <w:p>
@@ -906,7 +906,7 @@
         <w:widowControl/>
       </w:pPr>
       <w:r>
-        <w:t>3. （着装、后勤与现场秩序_行政部、生产部）</w:t>
+        <w:t>3. 着装、后勤与现场秩序_行政部、生产部</w:t>
       </w:r>
     </w:p>
     <w:p>
@@ -972,7 +972,7 @@
         <w:widowControl/>
       </w:pPr>
       <w:r>
-        <w:t>4. （仓库、模具与成本改善_营运部、生产部、工程技术组）</w:t>
+        <w:t>4. 仓库、模具与成本改善_营运部、生产部、工程技术组</w:t>
       </w:r>
     </w:p>
     <w:p>
@@ -1038,7 +1038,7 @@
         <w:widowControl/>
       </w:pPr>
       <w:r>
-        <w:t>5. （会议记录与形象提升_行政部）</w:t>
+        <w:t>5. 会议记录与形象提升_行政部</w:t>
       </w:r>
     </w:p>
     <w:p>
@@ -1090,7 +1090,7 @@
         <w:widowControl/>
       </w:pPr>
       <w:r>
-        <w:t>6. （团建活动_行政部）</w:t>
+        <w:t>6. 团建活动_行政部</w:t>
       </w:r>
     </w:p>
     <w:p>
@@ -1427,7 +1427,7 @@
               <w:spacing w:after="0"/>
             </w:pPr>
             <w:r>
-              <w:t>生产部:李天友（结果责任人）</w:t>
+              <w:t>生产部:李天友</w:t>
             </w:r>
           </w:p>
           <w:p>
@@ -1611,7 +1611,7 @@
               <w:spacing w:after="0"/>
             </w:pPr>
             <w:r>
-              <w:t>行政部:王晓华（结果责任人，权限边界待确认）</w:t>
+              <w:t>行政部:王晓华待确认</w:t>
             </w:r>
           </w:p>
           <w:p>
@@ -1990,7 +1990,7 @@
               <w:spacing w:after="0"/>
             </w:pPr>
             <w:r>
-              <w:t>部门待确认:王秋红（候选姓名，待核实）</w:t>
+              <w:t>部门待确认:王秋红待核实</w:t>
             </w:r>
           </w:p>
           <w:p>
@@ -2000,7 +2000,7 @@
               <w:spacing w:after="0"/>
             </w:pPr>
             <w:r>
-              <w:t>部门待确认:魏国（身份及部门待核实）</w:t>
+              <w:t>部门待确认:魏国待核实</w:t>
             </w:r>
           </w:p>
         </w:tc>
@@ -2195,7 +2195,7 @@
               <w:spacing w:after="0"/>
             </w:pPr>
             <w:r>
-              <w:t>营运部:王晓华（结果责任人）</w:t>
+              <w:t>营运部:王晓华</w:t>
             </w:r>
           </w:p>
         </w:tc>
@@ -2380,7 +2380,7 @@
               <w:spacing w:after="0"/>
             </w:pPr>
             <w:r>
-              <w:t>模具学徒:王名涵（是否承担记录待确认）</w:t>
+              <w:t>模具学徒:王名涵待确认</w:t>
             </w:r>
           </w:p>
           <w:p>
@@ -2390,7 +2390,7 @@
               <w:spacing w:after="0"/>
             </w:pPr>
             <w:r>
-              <w:t>行政部:王晓华（结果责任人）</w:t>
+              <w:t>行政部:王晓华</w:t>
             </w:r>
           </w:p>
         </w:tc>
@@ -2575,7 +2575,7 @@
               <w:spacing w:after="0"/>
             </w:pPr>
             <w:r>
-              <w:t>行政部:王晓华（结果责任人，审批关系待确认）</w:t>
+              <w:t>行政部:王晓华待确认</w:t>
             </w:r>
           </w:p>
           <w:p>
@@ -2595,7 +2595,7 @@
               <w:spacing w:after="0"/>
             </w:pPr>
             <w:r>
-              <w:t>财务相关:王勇（具体权限待确认）</w:t>
+              <w:t>财务相关:王勇待确认</w:t>
             </w:r>
           </w:p>
         </w:tc>
@@ -2781,7 +2781,7 @@
               <w:spacing w:after="0"/>
             </w:pPr>
             <w:r>
-              <w:t>后勤相关:王勇（协同，授权关系待确认）</w:t>
+              <w:t>后勤相关:王勇待确认</w:t>
             </w:r>
           </w:p>
           <w:p>
@@ -2977,7 +2977,7 @@
               <w:spacing w:after="0"/>
             </w:pPr>
             <w:r>
-              <w:t>行政部:王晓华（结果责任人）</w:t>
+              <w:t>行政部:王晓华</w:t>
             </w:r>
           </w:p>
           <w:p>

</xml_diff>